<commit_message>
feat: cap nhat luong PTM 5 buoc, xuat hop dong docx tu template va toi uu Vercel deployment
</commit_message>
<xml_diff>
--- a/tvt3_v2/public/templates/HOP_DONG_MOI_CSHT.docx
+++ b/tvt3_v2/public/templates/HOP_DONG_MOI_CSHT.docx
@@ -1,6 +1,6 @@
 
 <file path=word/document.xml><?xml version="1.0" encoding="utf-8"?>
-<w:document xmlns:a="http://schemas.openxmlformats.org/drawingml/2006/main" xmlns:a14="http://schemas.microsoft.com/office/drawing/2010/main" xmlns:wpc="http://schemas.microsoft.com/office/word/2010/wordprocessingCanvas" xmlns:cx="http://schemas.microsoft.com/office/drawing/2014/chartex" xmlns:cx1="http://schemas.microsoft.com/office/drawing/2015/9/8/chartex" xmlns:cx2="http://schemas.microsoft.com/office/drawing/2015/10/21/chartex" xmlns:cx3="http://schemas.microsoft.com/office/drawing/2016/5/9/chartex" xmlns:cx4="http://schemas.microsoft.com/office/drawing/2016/5/10/chartex" xmlns:cx5="http://schemas.microsoft.com/office/drawing/2016/5/11/chartex" xmlns:cx6="http://schemas.microsoft.com/office/drawing/2016/5/12/chartex" xmlns:cx7="http://schemas.microsoft.com/office/drawing/2016/5/13/chartex" xmlns:cx8="http://schemas.microsoft.com/office/drawing/2016/5/14/chartex" xmlns:mc="http://schemas.openxmlformats.org/markup-compatibility/2006" xmlns:aink="http://schemas.microsoft.com/office/drawing/2016/ink" xmlns:am3d="http://schemas.microsoft.com/office/drawing/2017/model3d" xmlns:o="urn:schemas-microsoft-com:office:office" xmlns:oel="http://schemas.microsoft.com/office/2019/extlst" xmlns:r="http://schemas.openxmlformats.org/officeDocument/2006/relationships" xmlns:m="http://schemas.openxmlformats.org/officeDocument/2006/math" xmlns:v="urn:schemas-microsoft-com:vml" xmlns:wp14="http://schemas.microsoft.com/office/word/2010/wordprocessingDrawing" xmlns:wp="http://schemas.openxmlformats.org/drawingml/2006/wordprocessingDrawing" xmlns:w10="urn:schemas-microsoft-com:office:word" xmlns:w="http://schemas.openxmlformats.org/wordprocessingml/2006/main" xmlns:w14="http://schemas.microsoft.com/office/word/2010/wordml" xmlns:w15="http://schemas.microsoft.com/office/word/2012/wordml" xmlns:w16cex="http://schemas.microsoft.com/office/word/2018/wordml/cex" xmlns:w16cid="http://schemas.microsoft.com/office/word/2016/wordml/cid" xmlns:w16="http://schemas.microsoft.com/office/word/2018/wordml" xmlns:w16du="http://schemas.microsoft.com/office/word/2023/wordml/word16du" xmlns:w16sdtdh="http://schemas.microsoft.com/office/word/2020/wordml/sdtdatahash" xmlns:w16sdtfl="http://schemas.microsoft.com/office/word/2024/wordml/sdtformatlock" xmlns:w16se="http://schemas.microsoft.com/office/word/2015/wordml/symex" xmlns:wpg="http://schemas.microsoft.com/office/word/2010/wordprocessingGroup" xmlns:wpi="http://schemas.microsoft.com/office/word/2010/wordprocessingInk" xmlns:wne="http://schemas.microsoft.com/office/word/2006/wordml" xmlns:wps="http://schemas.microsoft.com/office/word/2010/wordprocessingShape" mc:Ignorable="w14 w15 w16se w16cid w16 w16cex w16sdtdh w16sdtfl w16du wp14">
+<w:document xmlns:a="http://schemas.openxmlformats.org/drawingml/2006/main" xmlns:pic="http://schemas.openxmlformats.org/drawingml/2006/picture" xmlns:a14="http://schemas.microsoft.com/office/drawing/2010/main" xmlns:wpc="http://schemas.microsoft.com/office/word/2010/wordprocessingCanvas" xmlns:cx="http://schemas.microsoft.com/office/drawing/2014/chartex" xmlns:cx1="http://schemas.microsoft.com/office/drawing/2015/9/8/chartex" xmlns:cx2="http://schemas.microsoft.com/office/drawing/2015/10/21/chartex" xmlns:cx3="http://schemas.microsoft.com/office/drawing/2016/5/9/chartex" xmlns:cx4="http://schemas.microsoft.com/office/drawing/2016/5/10/chartex" xmlns:cx5="http://schemas.microsoft.com/office/drawing/2016/5/11/chartex" xmlns:cx6="http://schemas.microsoft.com/office/drawing/2016/5/12/chartex" xmlns:cx7="http://schemas.microsoft.com/office/drawing/2016/5/13/chartex" xmlns:cx8="http://schemas.microsoft.com/office/drawing/2016/5/14/chartex" xmlns:mc="http://schemas.openxmlformats.org/markup-compatibility/2006" xmlns:aink="http://schemas.microsoft.com/office/drawing/2016/ink" xmlns:am3d="http://schemas.microsoft.com/office/drawing/2017/model3d" xmlns:o="urn:schemas-microsoft-com:office:office" xmlns:oel="http://schemas.microsoft.com/office/2019/extlst" xmlns:r="http://schemas.openxmlformats.org/officeDocument/2006/relationships" xmlns:m="http://schemas.openxmlformats.org/officeDocument/2006/math" xmlns:v="urn:schemas-microsoft-com:vml" xmlns:wp14="http://schemas.microsoft.com/office/word/2010/wordprocessingDrawing" xmlns:wp="http://schemas.openxmlformats.org/drawingml/2006/wordprocessingDrawing" xmlns:w10="urn:schemas-microsoft-com:office:word" xmlns:w="http://schemas.openxmlformats.org/wordprocessingml/2006/main" xmlns:w14="http://schemas.microsoft.com/office/word/2010/wordml" xmlns:w15="http://schemas.microsoft.com/office/word/2012/wordml" xmlns:w16cex="http://schemas.microsoft.com/office/word/2018/wordml/cex" xmlns:w16cid="http://schemas.microsoft.com/office/word/2016/wordml/cid" xmlns:w16="http://schemas.microsoft.com/office/word/2018/wordml" xmlns:w16du="http://schemas.microsoft.com/office/word/2023/wordml/word16du" xmlns:w16sdtdh="http://schemas.microsoft.com/office/word/2020/wordml/sdtdatahash" xmlns:w16sdtfl="http://schemas.microsoft.com/office/word/2024/wordml/sdtformatlock" xmlns:w16se="http://schemas.microsoft.com/office/word/2015/wordml/symex" xmlns:wpg="http://schemas.microsoft.com/office/word/2010/wordprocessingGroup" xmlns:wpi="http://schemas.microsoft.com/office/word/2010/wordprocessingInk" xmlns:wne="http://schemas.microsoft.com/office/word/2006/wordml" xmlns:wps="http://schemas.microsoft.com/office/word/2010/wordprocessingShape" mc:Ignorable="w14 w15 w16se w16cid w16 w16cex w16sdtdh w16sdtfl w16du wp14">
   <w:body>
     <w:tbl>
       <w:tblPr>
@@ -305,7 +305,7 @@
                 <w:rFonts w:ascii="Times New Roman" w:hAnsi="Times New Roman"/>
                 <w:szCs w:val="26"/>
               </w:rPr>
-              <w:t>Số:       /TTr-VT</w:t>
+              <w:t xml:space="preserve">Số: /TTr-VT</w:t>
             </w:r>
           </w:p>
         </w:tc>
@@ -329,41 +329,15 @@
                 <w:i/>
                 <w:szCs w:val="28"/>
               </w:rPr>
-              <w:t xml:space="preserve">Đồng Nai, ngày </w:t>
+              <w:t xml:space="preserve">Đồng Nai, ngày      tháng      năm </w:t>
             </w:r>
             <w:r>
               <w:rPr>
                 <w:rFonts w:ascii="Times New Roman" w:hAnsi="Times New Roman"/>
                 <w:i/>
                 <w:szCs w:val="28"/>
-                <w:lang w:val="vi-VN"/>
-              </w:rPr>
-              <w:t xml:space="preserve"> </w:t>
-            </w:r>
-            <w:r>
-              <w:rPr>
-                <w:rFonts w:ascii="Times New Roman" w:hAnsi="Times New Roman"/>
-                <w:i/>
-                <w:szCs w:val="28"/>
-              </w:rPr>
-              <w:t xml:space="preserve"> tháng</w:t>
-            </w:r>
-            <w:r>
-              <w:rPr>
-                <w:rFonts w:ascii="Times New Roman" w:hAnsi="Times New Roman"/>
-                <w:i/>
-                <w:szCs w:val="28"/>
-                <w:lang w:val="vi-VN"/>
-              </w:rPr>
-              <w:t xml:space="preserve"> </w:t>
-            </w:r>
-            <w:r>
-              <w:rPr>
-                <w:rFonts w:ascii="Times New Roman" w:hAnsi="Times New Roman"/>
-                <w:i/>
-                <w:szCs w:val="28"/>
-              </w:rPr>
-              <w:t xml:space="preserve">  năm 2026</w:t>
+              </w:rPr>
+              <w:t xml:space="preserve"> 2026</w:t>
             </w:r>
           </w:p>
         </w:tc>
@@ -473,6 +447,88 @@
       </w:pPr>
       <w:r>
         <w:rPr>
+          <w:rFonts w:ascii="Times New Roman" w:hAnsi="Times New Roman"/>
+          <w:b/>
+          <w:bCs/>
+          <w:noProof/>
+          <w:szCs w:val="25"/>
+        </w:rPr>
+        <w:drawing>
+          <wp:anchor distT="0" distB="0" distL="114300" distR="114300" simplePos="0" relativeHeight="251659264" behindDoc="1" locked="0" layoutInCell="1" allowOverlap="1" wp14:editId="75DE6EE0" wp14:anchorId="0A443629">
+            <wp:simplePos x="0" y="0"/>
+            <wp:positionH relativeFrom="margin">
+              <wp:align>center</wp:align>
+            </wp:positionH>
+            <wp:positionV relativeFrom="paragraph">
+              <wp:posOffset>97790</wp:posOffset>
+            </wp:positionV>
+            <wp:extent cx="2108200" cy="19050"/>
+            <wp:effectExtent l="0" t="0" r="6350" b="0"/>
+            <wp:wrapTight wrapText="bothSides">
+              <wp:wrapPolygon edited="0">
+                <wp:start x="0" y="0"/>
+                <wp:lineTo x="0" y="0"/>
+                <wp:lineTo x="21470" y="0"/>
+                <wp:lineTo x="21470" y="0"/>
+                <wp:lineTo x="0" y="0"/>
+              </wp:wrapPolygon>
+            </wp:wrapTight>
+            <wp:docPr id="384057371" name="Picture 1"/>
+            <wp:cNvGraphicFramePr>
+              <a:graphicFrameLocks xmlns:a="http://schemas.openxmlformats.org/drawingml/2006/main" noChangeAspect="1"/>
+            </wp:cNvGraphicFramePr>
+            <a:graphic xmlns:a="http://schemas.openxmlformats.org/drawingml/2006/main">
+              <a:graphicData uri="http://schemas.openxmlformats.org/drawingml/2006/picture">
+                <pic:pic xmlns:pic="http://schemas.openxmlformats.org/drawingml/2006/picture">
+                  <pic:nvPicPr>
+                    <pic:cNvPr id="0" name="Picture 2"/>
+                    <pic:cNvPicPr>
+                      <a:picLocks noChangeAspect="1" noChangeArrowheads="1"/>
+                    </pic:cNvPicPr>
+                  </pic:nvPicPr>
+                  <pic:blipFill>
+                    <a:blip r:embed="rId5">
+                      <a:extLst>
+                        <a:ext uri="{28A0092B-C50C-407E-A947-70E740481C1C}">
+                          <a14:useLocalDpi xmlns:a14="http://schemas.microsoft.com/office/drawing/2010/main" val="0"/>
+                        </a:ext>
+                      </a:extLst>
+                    </a:blip>
+                    <a:srcRect/>
+                    <a:stretch>
+                      <a:fillRect/>
+                    </a:stretch>
+                  </pic:blipFill>
+                  <pic:spPr bwMode="auto">
+                    <a:xfrm>
+                      <a:off x="0" y="0"/>
+                      <a:ext cx="2108200" cy="19050"/>
+                    </a:xfrm>
+                    <a:prstGeom prst="rect">
+                      <a:avLst/>
+                    </a:prstGeom>
+                    <a:noFill/>
+                    <a:ln>
+                      <a:noFill/>
+                    </a:ln>
+                  </pic:spPr>
+                </pic:pic>
+              </a:graphicData>
+            </a:graphic>
+          </wp:anchor>
+        </w:drawing>
+      </w:r>
+    </w:p>
+    <w:p>
+      <w:pPr>
+        <w:spacing w:before="120" w:line="360" w:lineRule="exact"/>
+        <w:jc w:val="center"/>
+        <w:rPr>
+          <w:rFonts w:ascii="Times New Roman" w:hAnsi="Times New Roman"/>
+        </w:rPr>
+      </w:pPr>
+      <w:r>
+        <w:rPr>
           <w:rStyle w:val="Emphasis"/>
           <w:rFonts w:ascii="Times New Roman" w:hAnsi="Times New Roman"/>
           <w:i w:val="0"/>
@@ -520,6 +576,71 @@
           <w:szCs w:val="26"/>
         </w:rPr>
         <w:t>Ý kiến chỉ đạo của Lãnh đạo MobiFone Đồng Nai</w:t>
+      </w:r>
+    </w:p>
+    <w:p>
+      <w:pPr>
+        <w:pBdr>
+          <w:top w:val="single" w:color="auto" w:sz="4" w:space="1"/>
+          <w:left w:val="single" w:color="auto" w:sz="4" w:space="4"/>
+          <w:bottom w:val="single" w:color="auto" w:sz="4" w:space="0"/>
+          <w:right w:val="single" w:color="auto" w:sz="4" w:space="0"/>
+        </w:pBdr>
+        <w:spacing w:before="120" w:line="360" w:lineRule="exact"/>
+        <w:jc w:val="center"/>
+        <w:rPr>
+          <w:rFonts w:ascii="Times New Roman" w:hAnsi="Times New Roman"/>
+        </w:rPr>
+      </w:pPr>
+      <w:r>
+        <w:rPr>
+          <w:rFonts w:ascii="Times New Roman" w:hAnsi="Times New Roman"/>
+        </w:rPr>
+        <w:t> </w:t>
+      </w:r>
+    </w:p>
+    <w:p>
+      <w:pPr>
+        <w:pBdr>
+          <w:top w:val="single" w:color="auto" w:sz="4" w:space="1"/>
+          <w:left w:val="single" w:color="auto" w:sz="4" w:space="4"/>
+          <w:bottom w:val="single" w:color="auto" w:sz="4" w:space="0"/>
+          <w:right w:val="single" w:color="auto" w:sz="4" w:space="0"/>
+        </w:pBdr>
+        <w:spacing w:before="120" w:line="360" w:lineRule="exact"/>
+        <w:jc w:val="center"/>
+        <w:rPr>
+          <w:rFonts w:ascii="Times New Roman" w:hAnsi="Times New Roman"/>
+        </w:rPr>
+      </w:pPr>
+      <w:r>
+        <w:rPr>
+          <w:rFonts w:ascii="Times New Roman" w:hAnsi="Times New Roman"/>
+          <w:szCs w:val="28"/>
+          <w:lang w:val="sv-SE"/>
+        </w:rPr>
+        <w:t> </w:t>
+      </w:r>
+    </w:p>
+    <w:p>
+      <w:pPr>
+        <w:pBdr>
+          <w:top w:val="single" w:color="auto" w:sz="4" w:space="1"/>
+          <w:left w:val="single" w:color="auto" w:sz="4" w:space="4"/>
+          <w:bottom w:val="single" w:color="auto" w:sz="4" w:space="0"/>
+          <w:right w:val="single" w:color="auto" w:sz="4" w:space="0"/>
+        </w:pBdr>
+        <w:spacing w:before="120" w:line="360" w:lineRule="exact"/>
+        <w:jc w:val="center"/>
+        <w:rPr>
+          <w:rFonts w:ascii="Times New Roman" w:hAnsi="Times New Roman"/>
+        </w:rPr>
+      </w:pPr>
+      <w:r>
+        <w:rPr>
+          <w:rFonts w:ascii="Times New Roman" w:hAnsi="Times New Roman"/>
+        </w:rPr>
+        <w:t> </w:t>
       </w:r>
     </w:p>
     <w:p>
@@ -864,14 +985,14 @@
           <w:szCs w:val="26"/>
           <w:lang w:val="vi-VN"/>
         </w:rPr>
-        <w:t xml:space="preserve"> {{NEW_PRICE}} đồng/tháng (bằng chữ: {{NEW_PRICE_TEXT}}) với</w:t>
-      </w:r>
-      <w:r>
-        <w:rPr>
-          <w:rFonts w:ascii="Times New Roman" w:hAnsi="Times New Roman"/>
-          <w:szCs w:val="26"/>
-        </w:rPr>
-        <w:t xml:space="preserve"> đơn giá chi tiết theo các hạng mục như sau: </w:t>
+        <w:t xml:space="preserve"> {{NEW_PRICE}} đồng/tháng (bằng chữ: {{NEW_PRICE_TEXT}})</w:t>
+      </w:r>
+      <w:r>
+        <w:rPr>
+          <w:rFonts w:ascii="Times New Roman" w:hAnsi="Times New Roman"/>
+          <w:szCs w:val="26"/>
+        </w:rPr>
+        <w:t xml:space="preserve">với đơn giá chi tiết theo các hạng mục như sau: </w:t>
       </w:r>
     </w:p>
     <w:tbl>
@@ -1003,7 +1124,7 @@
                 <w:bCs/>
                 <w:szCs w:val="26"/>
               </w:rPr>
-              <w:t>Giảm trừ dùng chung</w:t>
+              <w:t xml:space="preserve">Giảm trừ dùng chung</w:t>
             </w:r>
           </w:p>
         </w:tc>
@@ -1751,6 +1872,29 @@
           <w:lang w:val="vi-VN"/>
         </w:rPr>
         <w:t>Viễn thông có cơ sở thực hiện./.</w:t>
+      </w:r>
+    </w:p>
+    <w:p>
+      <w:pPr>
+        <w:tabs>
+          <w:tab w:val="left" w:pos="426"/>
+          <w:tab w:val="left" w:pos="810"/>
+          <w:tab w:val="left" w:pos="3240"/>
+        </w:tabs>
+        <w:spacing w:before="120" w:line="360" w:lineRule="exact"/>
+        <w:ind w:left="540" w:firstLine="720"/>
+        <w:jc w:val="both"/>
+        <w:rPr>
+          <w:rFonts w:ascii="Times New Roman" w:hAnsi="Times New Roman"/>
+          <w:szCs w:val="26"/>
+        </w:rPr>
+      </w:pPr>
+      <w:r>
+        <w:rPr>
+          <w:rFonts w:ascii="Times New Roman" w:hAnsi="Times New Roman"/>
+          <w:szCs w:val="26"/>
+        </w:rPr>
+        <w:t> </w:t>
       </w:r>
     </w:p>
     <w:tbl>
@@ -2467,7 +2611,7 @@
           <w:sz w:val="26"/>
           <w:szCs w:val="26"/>
         </w:rPr>
-        <w:t xml:space="preserve"> Hôm nay, ngày        tháng          năm 202</w:t>
+        <w:t xml:space="preserve"> Hôm nay, ngày      tháng      năm  202</w:t>
       </w:r>
       <w:r>
         <w:rPr>
@@ -2482,14 +2626,14 @@
           <w:sz w:val="26"/>
           <w:szCs w:val="26"/>
         </w:rPr>
-        <w:t xml:space="preserve"> tại</w:t>
+        <w:t xml:space="preserve"> tại </w:t>
       </w:r>
       <w:r>
         <w:rPr>
           <w:sz w:val="26"/>
           <w:szCs w:val="26"/>
         </w:rPr>
-        <w:t xml:space="preserve"> </w:t>
+        <w:t xml:space="preserve">tại </w:t>
       </w:r>
       <w:r>
         <w:rPr>
@@ -2552,6 +2696,7 @@
           <w:tab w:val="left" w:pos="2880"/>
         </w:tabs>
         <w:spacing w:before="120" w:line="320" w:lineRule="exact"/>
+        <w:ind w:firstLine="709"/>
         <w:jc w:val="both"/>
         <w:rPr>
           <w:rFonts w:ascii="Times New Roman" w:hAnsi="Times New Roman"/>
@@ -2716,6 +2861,7 @@
       <w:pPr>
         <w:pStyle w:val="NormalWeb"/>
         <w:spacing w:before="0" w:beforeAutospacing="0" w:after="0" w:afterAutospacing="0"/>
+        <w:ind w:firstLine="709"/>
         <w:jc w:val="both"/>
         <w:rPr>
           <w:sz w:val="26"/>
@@ -3111,6 +3257,7 @@
       <w:pPr>
         <w:widowControl w:val="0"/>
         <w:spacing w:before="80" w:after="80" w:line="360" w:lineRule="atLeast"/>
+        <w:ind w:firstLine="709"/>
         <w:jc w:val="both"/>
         <w:rPr>
           <w:rFonts w:ascii="Times New Roman" w:hAnsi="Times New Roman"/>
@@ -3126,7 +3273,7 @@
           <w:szCs w:val="26"/>
           <w:lang w:val="fr-FR"/>
         </w:rPr>
-        <w:t>(Giấy UQ số 08/UQ-MBF.ĐNa ngày 22/01/2026 do Giám đốc MobiFone Đồng Nai – Chi nhánh Tổng Công ty Viễn Thông MobiFone, Ông Bùi Chí Tuệ ký)</w:t>
+        <w:t>(Giấy UQ số 21/UQ-MBF.ĐNa ngày 19/06/2026 do Giám đốc MobiFone Đồng Nai – Chi nhánh Tổng Công ty Viễn Thông MobiFone, Ông Bùi Chí Tuệ ký)</w:t>
       </w:r>
     </w:p>
     <w:p>
@@ -3260,7 +3407,7 @@
                 <w:rFonts w:ascii="Times New Roman" w:hAnsi="Times New Roman"/>
                 <w:szCs w:val="28"/>
               </w:rPr>
-              <w:t xml:space="preserve">             </w:t>
+              <w:t xml:space="preserve"> </w:t>
             </w:r>
           </w:p>
           <w:p>
@@ -3444,6 +3591,11 @@
         </w:tc>
       </w:tr>
     </w:tbl>
+    <w:p>
+      <w:r>
+        <w:br w:type="page"/>
+      </w:r>
+    </w:p>
     <w:tbl>
       <w:tblPr>
         <w:tblpPr w:leftFromText="180" w:rightFromText="180" w:vertAnchor="text" w:horzAnchor="margin" w:tblpXSpec="center" w:tblpY="-832"/>
@@ -3905,7 +4057,7 @@
           <w:szCs w:val="26"/>
           <w:lang w:val="vi-VN"/>
         </w:rPr>
-        <w:t>Số:       -26/</w:t>
+        <w:t xml:space="preserve">Số: -26/</w:t>
       </w:r>
       <w:bookmarkEnd w:id="2"/>
       <w:r>
@@ -4052,7 +4204,7 @@
           <w:szCs w:val="26"/>
           <w:lang w:val="vi-VN"/>
         </w:rPr>
-        <w:t>Hôm nay, ngày        tháng         năm</w:t>
+        <w:t xml:space="preserve">Hôm nay, ngày      tháng      năm </w:t>
       </w:r>
       <w:r>
         <w:rPr>
@@ -4109,7 +4261,7 @@
       <w:pPr>
         <w:widowControl w:val="0"/>
         <w:spacing w:before="60" w:after="60"/>
-        <w:ind w:left="-18"/>
+        <w:ind w:left="-18" w:firstLine="709"/>
         <w:jc w:val="both"/>
         <w:rPr>
           <w:rFonts w:ascii="Times New Roman" w:hAnsi="Times New Roman"/>
@@ -4136,6 +4288,7 @@
       <w:pPr>
         <w:widowControl w:val="0"/>
         <w:shd w:val="clear" w:color="auto" w:fill="FFFFFF"/>
+        <w:ind w:firstLine="709"/>
         <w:rPr>
           <w:rFonts w:ascii="Times New Roman" w:hAnsi="Times New Roman"/>
           <w:szCs w:val="26"/>
@@ -4324,7 +4477,7 @@
           <w:rFonts w:ascii="Times New Roman" w:hAnsi="Times New Roman"/>
           <w:szCs w:val="26"/>
         </w:rPr>
-        <w:t xml:space="preserve">Điện thoại </w:t>
+        <w:t xml:space="preserve">Điện thọai </w:t>
       </w:r>
       <w:r>
         <w:rPr>
@@ -4806,6 +4959,7 @@
       <w:pPr>
         <w:widowControl w:val="0"/>
         <w:spacing w:before="80" w:after="80" w:line="360" w:lineRule="atLeast"/>
+        <w:ind w:firstLine="709"/>
         <w:jc w:val="both"/>
         <w:rPr>
           <w:rFonts w:ascii="Times New Roman" w:hAnsi="Times New Roman"/>
@@ -4821,7 +4975,7 @@
           <w:szCs w:val="26"/>
           <w:lang w:val="fr-FR"/>
         </w:rPr>
-        <w:t>(Giấy UQ số 08/UQ-MBF.ĐNa ngày 22/01/2026 do Giám đốc MobiFone Đồng Nai – Chi nhánh Tổng Công ty Viễn Thông MobiFone, Ông Bùi Chí Tuệ ký)</w:t>
+        <w:t>(Giấy UQ số 21/UQ-MBF.ĐNa ngày 19/06/2026 do Giám đốc MobiFone Đồng Nai – Chi nhánh Tổng Công ty Viễn Thông MobiFone, Ông Bùi Chí Tuệ ký)</w:t>
       </w:r>
     </w:p>
     <w:p>
@@ -4988,6 +5142,7 @@
       <w:pPr>
         <w:widowControl w:val="0"/>
         <w:spacing w:before="120" w:after="120"/>
+        <w:ind w:firstLine="709"/>
         <w:jc w:val="both"/>
         <w:rPr>
           <w:rFonts w:ascii="Times New Roman" w:hAnsi="Times New Roman"/>
@@ -5099,6 +5254,7 @@
       <w:pPr>
         <w:widowControl w:val="0"/>
         <w:spacing w:before="120" w:line="360" w:lineRule="atLeast"/>
+        <w:ind w:firstLine="709"/>
         <w:jc w:val="both"/>
         <w:rPr>
           <w:rFonts w:ascii="Times New Roman" w:hAnsi="Times New Roman"/>
@@ -5178,7 +5334,7 @@
         <w:autoSpaceDE w:val="0"/>
         <w:autoSpaceDN w:val="0"/>
         <w:spacing w:before="60" w:after="60"/>
-        <w:ind w:left="720"/>
+        <w:ind w:left="720" w:firstLine="709"/>
         <w:jc w:val="both"/>
         <w:rPr>
           <w:rFonts w:ascii="Times New Roman" w:hAnsi="Times New Roman"/>
@@ -5285,7 +5441,7 @@
           <w:szCs w:val="26"/>
           <w:lang w:val="da-DK"/>
         </w:rPr>
-        <w:t xml:space="preserve">Bên A đồng ý cho Bên B sử dụng mặt bằng, cơ sở hạ tầng trạm BTS như trên để triển khai lắp đặt các thiết bị trạm thông tin di động và khai thác hạ tầng các mạng thông tin, truyền thông theo đúng quy định của pháp luật. </w:t>
+        <w:t xml:space="preserve">Bên A đồng ý cho Bên B sử dụng mặt bằng, cở sở hạ tầng trạm BTS như trên để triển khai lắp đặt các thiết bị trạm thông tin di động và khai thác hạ tầng các mạng thông tin, truyền thông theo đúng quy định của pháp luật. </w:t>
       </w:r>
     </w:p>
     <w:p>
@@ -5610,7 +5766,7 @@
       <w:pPr>
         <w:pStyle w:val="NormalWeb"/>
         <w:spacing w:before="60" w:beforeAutospacing="0" w:after="60" w:afterAutospacing="0"/>
-        <w:ind w:left="567"/>
+        <w:ind w:left="567" w:firstLine="709"/>
         <w:jc w:val="both"/>
         <w:rPr>
           <w:b/>
@@ -5828,6 +5984,7 @@
     </w:p>
     <w:p>
       <w:pPr>
+        <w:ind w:firstLine="709"/>
         <w:rPr>
           <w:rFonts w:ascii="Times New Roman" w:hAnsi="Times New Roman"/>
           <w:szCs w:val="26"/>
@@ -5981,10 +6138,9 @@
       <w:r>
         <w:rPr>
           <w:rFonts w:ascii="Times New Roman" w:hAnsi="Times New Roman"/>
-          <w:szCs w:val="26"/>
-          <w:lang w:val="vi-VN"/>
-        </w:rPr>
-        <w:t>Bên B cam kết tài khoản nhận thanh toán là ổn định và không thay đổi trong suốt thời gian thuê, đồng thời chịu trách nhiệm nếu có bất kỳ khiếu nại nào liên quan đến việc nhận tiền thanh toán của hợp đồng này vào tài khoản nêu trên</w:t>
+          <w:sz w:val="26"/>
+        </w:rPr>
+        <w:t>Bên A cam kết tài khoản nhận thanh toán là ổn định và không thay đổi trong suốt thời gian thuê, đồng thời chịu trách nhiệm nếu có bất kỳ khiếu nại nào liên quan đến việc nhận tiền thanh toán của hợp đồng này vào tài khoản nêu trên</w:t>
       </w:r>
     </w:p>
     <w:p>
@@ -6005,10 +6161,9 @@
       <w:r>
         <w:rPr>
           <w:rFonts w:ascii="Times New Roman" w:hAnsi="Times New Roman"/>
-          <w:szCs w:val="26"/>
-          <w:lang w:val="vi-VN"/>
-        </w:rPr>
-        <w:t>Trường hợp thay đổi thông tin tài khoản nhận thanh toán, Bên B phải báo trước bằng văn bản cho bên A chậm nhất là 30 ngày trước khi đến hạn của chu kỳ thanh toán kế tiếp và hai bên sẽ tiến hành ký phụ lục điều chỉnh thông tin tài khoản nhận tiền thanh toán.</w:t>
+          <w:sz w:val="26"/>
+        </w:rPr>
+        <w:t>Trường hợp thay đổi thông tin tài khoản nhận thanh toán, Bên A phải báo trước bằng văn bản cho bên B chậm nhất là 30 ngày trước khi đến hạn của chu kỳ thanh toán kế tiếp và hai bên sẽ tiến hành ký phụ lục điều chỉnh thông tin tài khoản nhận tiền thanh toán.</w:t>
       </w:r>
     </w:p>
     <w:p>
@@ -6375,7 +6530,7 @@
           <w:tab w:val="left" w:pos="709"/>
         </w:tabs>
         <w:spacing w:before="60" w:after="60" w:line="276" w:lineRule="auto"/>
-        <w:ind w:left="284"/>
+        <w:ind w:left="284" w:firstLine="709"/>
         <w:jc w:val="both"/>
         <w:rPr>
           <w:rFonts w:ascii="Times New Roman" w:hAnsi="Times New Roman"/>
@@ -7005,7 +7160,7 @@
           <w:szCs w:val="26"/>
           <w:lang w:val="da-DK"/>
         </w:rPr>
-        <w:t xml:space="preserve"> -    Cho bên B đặt đồng hồ điện kế trong nhà và có trách nhiệm trông coi điện kế, hỗ trợ điện lực ghi chỉ số điện hàng tháng. Bên A không được sử dụng nguồn điện cấp cho trạm BTS cho mục đích sử dụng riêng. Tuyệt đối không được phép tự ý ngắt, cúp cầu dao, CB… làm mất điện lưới của trạm. Nếu vi phạm sẽ bị xử phạt theo quy định về đảm bảo an toàn thông tin liên lạc và tần số vô tuyến điện, </w:t>
+        <w:t xml:space="preserve"> - Cho bên B đặt đồng hồ điện kế trong nhà và có trách nhiệm trông coi điện kế, hỗ trợ điện lực ghi chỉ số điện hàng tháng. Bên A không được sử dụng nguồn điện cấp cho trạm BTS cho mục đích sử dụng riêng. Tuyệt đối không được phép tự ý ngắt, cúp cầu dao, CB… làm mất điện lưới của trạm. Nếu vi phạm sẽ bị xử phạt theo quy định về đảm bảo an toàn thông tin liên lac và tần số vô tuyến điện, </w:t>
       </w:r>
       <w:r>
         <w:rPr>
@@ -7132,7 +7287,7 @@
           <w:szCs w:val="26"/>
           <w:lang w:val="vi-VN"/>
         </w:rPr>
-        <w:t xml:space="preserve"> quản lý, sửa chữa, bảo dưỡng định kỳ các hạng mục cơ sở hạ tầng cho thuê </w:t>
+        <w:t xml:space="preserve"> quản lý, sữa chữa, bảo dưỡng định kỳ các hạng mục cơ sở hạ tầng cho thuê </w:t>
       </w:r>
       <w:r>
         <w:rPr>
@@ -8164,7 +8319,7 @@
           <w:szCs w:val="26"/>
           <w:lang w:val="da-DK"/>
         </w:rPr>
-        <w:t xml:space="preserve">Bên B không chịu bất cứ trách nhiệm gì về những phát sinh ngoài hợp đồng đã ký với Bên A. Điều 5</w:t>
+        <w:t>Bên B không chịu bất cứ trách nhiệm gì về những phát sinh ngoài hợp đồng đã ký với bên A.</w:t>
       </w:r>
       <w:r>
         <w:rPr>
@@ -8176,7 +8331,7 @@
           <w:szCs w:val="26"/>
           <w:lang w:val="vi-VN"/>
         </w:rPr>
-        <w:t xml:space="preserve">. Giải quyết các sự kiện bất khả kháng và các sự kiện khách quan khác;</w:t>
+        <w:t xml:space="preserve">Điều 5. Giải quyết các sự kiện bất khả kháng và các sự kiện khách quan khác;</w:t>
       </w:r>
       <w:r>
         <w:rPr>
@@ -8209,6 +8364,7 @@
           <w:tab w:val="left" w:pos="851"/>
         </w:tabs>
         <w:spacing w:before="60" w:after="60" w:line="276" w:lineRule="auto"/>
+        <w:ind w:firstLine="709"/>
         <w:jc w:val="both"/>
         <w:rPr>
           <w:rFonts w:ascii="Times New Roman" w:hAnsi="Times New Roman"/>
@@ -8226,7 +8382,7 @@
           <w:szCs w:val="26"/>
           <w:lang w:val="da-DK"/>
         </w:rPr>
-        <w:t>5.1.     Bất khả kháng:</w:t>
+        <w:t xml:space="preserve">5.1. Bất khả kháng:</w:t>
       </w:r>
     </w:p>
     <w:p>
@@ -8915,6 +9071,7 @@
       <w:pPr>
         <w:keepNext/>
         <w:spacing w:before="60" w:after="60" w:line="276" w:lineRule="auto"/>
+        <w:ind w:firstLine="709"/>
         <w:jc w:val="both"/>
         <w:rPr>
           <w:rFonts w:ascii="Times New Roman" w:hAnsi="Times New Roman"/>
@@ -8942,7 +9099,7 @@
           <w:szCs w:val="26"/>
           <w:lang w:val="vi-VN"/>
         </w:rPr>
-        <w:t xml:space="preserve"> Các trường hợp chấm dứt và hủy bỏ hợp đồng</w:t>
+        <w:t xml:space="preserve">Các trường hợp chấm dứt và hủy bỏ hợp đồng</w:t>
       </w:r>
     </w:p>
     <w:p>
@@ -9177,6 +9334,7 @@
           <w:tab w:val="left" w:pos="360"/>
         </w:tabs>
         <w:spacing w:before="60" w:after="60" w:line="276" w:lineRule="auto"/>
+        <w:ind w:firstLine="709"/>
         <w:jc w:val="both"/>
         <w:rPr>
           <w:rFonts w:ascii="Times New Roman" w:hAnsi="Times New Roman"/>
@@ -9213,7 +9371,7 @@
           <w:szCs w:val="26"/>
           <w:lang w:val="vi-VN"/>
         </w:rPr>
-        <w:t>. Điều khoản chung</w:t>
+        <w:t xml:space="preserve">. Điều khoản chung</w:t>
       </w:r>
     </w:p>
     <w:p>

</xml_diff>

<commit_message>
fix(templates): standardize font Times New Roman and Decree 30 MobiFone Dong Nai layout
</commit_message>
<xml_diff>
--- a/tvt3_v2/public/templates/HOP_DONG_MOI_CSHT.docx
+++ b/tvt3_v2/public/templates/HOP_DONG_MOI_CSHT.docx
@@ -83,7 +83,7 @@
                 <w:sz w:val="24"/>
                 <w:szCs w:val="28"/>
               </w:rPr>
-              <w:t>CỘNG HOÀ XÃ HỘI CHỦ NGHĨA VIỆT NAM</w:t>
+              <w:t>CỘNG HÒA XÃ HỘI CHỦ NGHĨA VIỆT NAM</w:t>
             </w:r>
           </w:p>
           <w:p ns2:paraId="5DC5BB82" ns2:textId="77777777">
@@ -2038,84 +2038,65 @@
           <w:tcPr>
             <w:tcW w:w="3544" w:type="dxa"/>
           </w:tcPr>
-          <w:p ns2:paraId="4E11D93C" ns2:textId="77777777">
+          <w:p>
             <w:pPr>
               <w:spacing w:before="0" w:after="40" w:line="276" w:lineRule="auto"/>
               <w:jc w:val="left"/>
+            </w:pPr>
+            <w:r/>
+            <w:r>
               <w:rPr>
                 <w:rFonts w:ascii="Times New Roman" w:hAnsi="Times New Roman"/>
                 <w:b/>
                 <w:i/>
-                <w:szCs w:val="26"/>
-              </w:rPr>
-            </w:pPr>
-            <w:r>
-              <w:rPr>
-                <w:rFonts w:ascii="Times New Roman" w:hAnsi="Times New Roman" w:cs="Times New Roman" w:eastAsia="Times New Roman"/>
-                <w:b/>
-                <w:i/>
                 <w:sz w:val="24"/>
-                <w:szCs w:val="26"/>
               </w:rPr>
               <w:t>Nơi nhận:</w:t>
             </w:r>
           </w:p>
-          <w:p ns2:paraId="1DC7B5EE" ns2:textId="77777777">
+          <w:p>
             <w:pPr>
-              <w:tabs>
-                <w:tab w:val="left" w:pos="318"/>
-                <w:tab w:val="left" w:pos="1440"/>
-                <w:tab w:val="left" w:pos="2160"/>
-                <w:tab w:val="left" w:pos="3923"/>
-                <w:tab w:val="left" w:pos="7288"/>
-              </w:tabs>
               <w:spacing w:before="0" w:after="40" w:line="276" w:lineRule="auto"/>
               <w:jc w:val="left"/>
-              <w:rPr>
-                <w:rFonts w:ascii="Times New Roman" w:hAnsi="Times New Roman"/>
-                <w:szCs w:val="26"/>
-              </w:rPr>
             </w:pPr>
             <w:r>
               <w:rPr>
-                <w:rFonts w:ascii="Times New Roman" w:hAnsi="Times New Roman" w:cs="Times New Roman" w:eastAsia="Times New Roman"/>
+                <w:rFonts w:ascii="Times New Roman" w:hAnsi="Times New Roman"/>
                 <w:b w:val="0"/>
                 <w:i w:val="0"/>
                 <w:sz w:val="22"/>
-                <w:szCs w:val="26"/>
               </w:rPr>
               <w:t>- Như trên;</w:t>
             </w:r>
           </w:p>
-          <w:p ns2:paraId="119B2ADA" ns2:textId="77777777">
+          <w:p>
             <w:pPr>
               <w:spacing w:before="0" w:after="40" w:line="276" w:lineRule="auto"/>
               <w:jc w:val="left"/>
-              <w:rPr>
-                <w:rFonts w:ascii="Times New Roman" w:hAnsi="Times New Roman"/>
-                <w:szCs w:val="26"/>
-              </w:rPr>
             </w:pPr>
             <w:r>
               <w:rPr>
-                <w:rFonts w:ascii="Times New Roman" w:hAnsi="Times New Roman" w:cs="Times New Roman" w:eastAsia="Times New Roman"/>
+                <w:rFonts w:ascii="Times New Roman" w:hAnsi="Times New Roman"/>
                 <w:b w:val="0"/>
                 <w:i w:val="0"/>
                 <w:sz w:val="22"/>
-                <w:szCs w:val="26"/>
-              </w:rPr>
-              <w:t>- Lưu: VT; P.VT</w:t>
+              </w:rPr>
+              <w:t>- BGĐ (để b/c);</w:t>
             </w:r>
+          </w:p>
+          <w:p>
+            <w:pPr>
+              <w:spacing w:before="0" w:after="40" w:line="276" w:lineRule="auto"/>
+              <w:jc w:val="left"/>
+            </w:pPr>
             <w:r>
               <w:rPr>
-                <w:rFonts w:ascii="Times New Roman" w:hAnsi="Times New Roman" w:cs="Times New Roman" w:eastAsia="Times New Roman"/>
+                <w:rFonts w:ascii="Times New Roman" w:hAnsi="Times New Roman"/>
                 <w:b w:val="0"/>
                 <w:i w:val="0"/>
                 <w:sz w:val="22"/>
-                <w:szCs w:val="26"/>
-                <w:lang w:val="vi-VN"/>
-              </w:rPr>
-              <w:t>.</w:t>
+              </w:rPr>
+              <w:t>- Lưu VT, P.VT.</w:t>
             </w:r>
           </w:p>
         </w:tc>

</xml_diff>

<commit_message>
feat(infra): them quan ly ho so anh theo ma TSCD/CCDC, them tai san moi cho tram va bao mat bot vault
- AddEquipmentModal: bo sung may lanh (CCDC), MPD (TSCD), tu nguon DC, to accu
- AssetPhotoModal: ho tro gan anh truc tiep (nen Canvas WebP) va gap tu kho tram (AI goi y)
- Telegram Bot Vault: tu dong gan anh theo cu phap ngan (ml1, ml2, mpd, accu) vao ma TSCD/CCDC
- Datasites: bo dem SWR 0ms instant load, chong tran quota LocalStorage
- Security: loai bo token hardcode, bao ve qua .env va gitignore
</commit_message>
<xml_diff>
--- a/tvt3_v2/public/templates/HOP_DONG_MOI_CSHT.docx
+++ b/tvt3_v2/public/templates/HOP_DONG_MOI_CSHT.docx
@@ -32,7 +32,7 @@
             </w:pPr>
             <w:r>
               <w:rPr>
-                <w:rFonts w:ascii="Times New Roman" w:eastAsia="Times New Roman" w:hAnsi="Times New Roman" w:cs="Times New Roman"/>
+                <w:rFonts w:ascii="Times New Roman" w:hAnsi="Times New Roman"/>
                 <w:szCs w:val="26"/>
               </w:rPr>
               <w:t>MOBIFONE ĐỒNG NAI</w:t>
@@ -48,7 +48,7 @@
             </w:pPr>
             <w:r>
               <w:rPr>
-                <w:rFonts w:ascii="Times New Roman" w:eastAsia="Times New Roman" w:hAnsi="Times New Roman" w:cs="Times New Roman"/>
+                <w:rFonts w:ascii="Times New Roman" w:hAnsi="Times New Roman"/>
                 <w:b/>
                 <w:szCs w:val="26"/>
               </w:rPr>
@@ -72,11 +72,11 @@
             </w:pPr>
             <w:r>
               <w:rPr>
-                <w:rFonts w:ascii="Times New Roman" w:eastAsia="Times New Roman" w:hAnsi="Times New Roman" w:cs="Times New Roman"/>
+                <w:rFonts w:ascii="Times New Roman" w:hAnsi="Times New Roman"/>
                 <w:b/>
                 <w:szCs w:val="28"/>
               </w:rPr>
-              <w:t>CỘNG HÒA XÃ HỘI CHỦ NGHĨA VIỆT NAM</w:t>
+              <w:t>CỘNG HOÀ XÃ HỘI CHỦ NGHĨA VIỆT NAM</w:t>
             </w:r>
           </w:p>
           <w:p>
@@ -90,7 +90,7 @@
             </w:pPr>
             <w:r>
               <w:rPr>
-                <w:rFonts w:ascii="Times New Roman" w:eastAsia="Times New Roman" w:hAnsi="Times New Roman" w:cs="Times New Roman"/>
+                <w:rFonts w:ascii="Times New Roman" w:hAnsi="Times New Roman"/>
                 <w:b/>
                 <w:szCs w:val="28"/>
               </w:rPr>
@@ -302,7 +302,7 @@
             </w:pPr>
             <w:r>
               <w:rPr>
-                <w:rFonts w:ascii="Times New Roman" w:eastAsia="Times New Roman" w:hAnsi="Times New Roman" w:cs="Times New Roman"/>
+                <w:rFonts w:ascii="Times New Roman" w:hAnsi="Times New Roman"/>
                 <w:szCs w:val="26"/>
               </w:rPr>
               <w:t xml:space="preserve">Số: /TTr-VT</w:t>
@@ -325,7 +325,7 @@
             </w:pPr>
             <w:r>
               <w:rPr>
-                <w:rFonts w:ascii="Times New Roman" w:eastAsia="Times New Roman" w:hAnsi="Times New Roman" w:cs="Times New Roman"/>
+                <w:rFonts w:ascii="Times New Roman" w:hAnsi="Times New Roman"/>
                 <w:i/>
                 <w:szCs w:val="28"/>
               </w:rPr>
@@ -333,7 +333,7 @@
             </w:r>
             <w:r>
               <w:rPr>
-                <w:rFonts w:ascii="Times New Roman" w:eastAsia="Times New Roman" w:hAnsi="Times New Roman" w:cs="Times New Roman"/>
+                <w:rFonts w:ascii="Times New Roman" w:hAnsi="Times New Roman"/>
                 <w:i/>
                 <w:szCs w:val="28"/>
               </w:rPr>
@@ -393,7 +393,7 @@
       </w:pPr>
       <w:r>
         <w:rPr>
-          <w:rFonts w:ascii="Times New Roman" w:eastAsia="Times New Roman" w:hAnsi="Times New Roman" w:cs="Times New Roman"/>
+          <w:rFonts w:ascii="Times New Roman" w:hAnsi="Times New Roman"/>
           <w:b/>
           <w:szCs w:val="28"/>
           <w:lang w:val="sv-SE"/>
@@ -414,25 +414,25 @@
       </w:pPr>
       <w:r>
         <w:rPr>
-          <w:rFonts w:ascii="Times New Roman" w:eastAsia="Times New Roman" w:hAnsi="Times New Roman" w:cs="Times New Roman"/>
+          <w:rFonts w:ascii="Times New Roman" w:hAnsi="Times New Roman"/>
         </w:rPr>
         <w:t>Về việc</w:t>
       </w:r>
       <w:r>
         <w:rPr>
-          <w:rFonts w:ascii="Times New Roman" w:eastAsia="Times New Roman" w:hAnsi="Times New Roman" w:cs="Times New Roman"/>
+          <w:rFonts w:ascii="Times New Roman" w:hAnsi="Times New Roman"/>
         </w:rPr>
         <w:t xml:space="preserve"> thanh lý và ký lại hợp đồng</w:t>
       </w:r>
       <w:r>
         <w:rPr>
-          <w:rFonts w:ascii="Times New Roman" w:eastAsia="Times New Roman" w:hAnsi="Times New Roman" w:cs="Times New Roman"/>
+          <w:rFonts w:ascii="Times New Roman" w:hAnsi="Times New Roman"/>
         </w:rPr>
         <w:t xml:space="preserve"> trạm</w:t>
       </w:r>
       <w:r>
         <w:rPr>
-          <w:rFonts w:ascii="Times New Roman" w:eastAsia="Times New Roman" w:hAnsi="Times New Roman" w:cs="Times New Roman"/>
+          <w:rFonts w:ascii="Times New Roman" w:hAnsi="Times New Roman"/>
         </w:rPr>
         <w:t xml:space="preserve"> {{SITE_ID}}</w:t>
       </w:r>
@@ -530,7 +530,7 @@
       <w:r>
         <w:rPr>
           <w:rStyle w:val="Emphasis"/>
-          <w:rFonts w:ascii="Times New Roman" w:eastAsia="Times New Roman" w:hAnsi="Times New Roman" w:cs="Times New Roman"/>
+          <w:rFonts w:ascii="Times New Roman" w:hAnsi="Times New Roman"/>
           <w:i w:val="0"/>
           <w:iCs w:val="0"/>
           <w:szCs w:val="28"/>
@@ -540,7 +540,7 @@
       <w:r>
         <w:rPr>
           <w:rStyle w:val="Emphasis"/>
-          <w:rFonts w:ascii="Times New Roman" w:eastAsia="Times New Roman" w:hAnsi="Times New Roman" w:cs="Times New Roman"/>
+          <w:rFonts w:ascii="Times New Roman" w:hAnsi="Times New Roman"/>
           <w:i w:val="0"/>
           <w:iCs w:val="0"/>
           <w:szCs w:val="26"/>
@@ -549,7 +549,7 @@
       </w:r>
       <w:r>
         <w:rPr>
-          <w:rFonts w:ascii="Times New Roman" w:eastAsia="Times New Roman" w:hAnsi="Times New Roman" w:cs="Times New Roman"/>
+          <w:rFonts w:ascii="Times New Roman" w:hAnsi="Times New Roman"/>
           <w:szCs w:val="28"/>
         </w:rPr>
         <w:t>Ông Nguyễn Thanh Lâm – Phó Giám đốc MobiFone Đồng Nai</w:t>
@@ -571,7 +571,7 @@
       </w:pPr>
       <w:r>
         <w:rPr>
-          <w:rFonts w:ascii="Times New Roman" w:eastAsia="Times New Roman" w:hAnsi="Times New Roman" w:cs="Times New Roman"/>
+          <w:rFonts w:ascii="Times New Roman" w:hAnsi="Times New Roman"/>
           <w:b/>
           <w:szCs w:val="26"/>
         </w:rPr>
@@ -594,7 +594,7 @@
       </w:pPr>
       <w:r>
         <w:rPr>
-          <w:rFonts w:ascii="Times New Roman" w:eastAsia="Times New Roman" w:hAnsi="Times New Roman" w:cs="Times New Roman"/>
+          <w:rFonts w:ascii="Times New Roman" w:hAnsi="Times New Roman"/>
         </w:rPr>
         <w:t> </w:t>
       </w:r>
@@ -615,7 +615,7 @@
       </w:pPr>
       <w:r>
         <w:rPr>
-          <w:rFonts w:ascii="Times New Roman" w:eastAsia="Times New Roman" w:hAnsi="Times New Roman" w:cs="Times New Roman"/>
+          <w:rFonts w:ascii="Times New Roman" w:hAnsi="Times New Roman"/>
           <w:szCs w:val="28"/>
           <w:lang w:val="sv-SE"/>
         </w:rPr>
@@ -638,7 +638,7 @@
       </w:pPr>
       <w:r>
         <w:rPr>
-          <w:rFonts w:ascii="Times New Roman" w:eastAsia="Times New Roman" w:hAnsi="Times New Roman" w:cs="Times New Roman"/>
+          <w:rFonts w:ascii="Times New Roman" w:hAnsi="Times New Roman"/>
         </w:rPr>
         <w:t> </w:t>
       </w:r>
@@ -659,11 +659,11 @@
       </w:pPr>
       <w:r>
         <w:rPr>
-          <w:rFonts w:ascii="Times New Roman" w:eastAsia="Times New Roman" w:hAnsi="Times New Roman" w:cs="Times New Roman"/>
+          <w:rFonts w:ascii="Times New Roman" w:hAnsi="Times New Roman"/>
           <w:bCs/>
           <w:szCs w:val="26"/>
         </w:rPr>
-        <w:t>Căn cứ hợp đồng số {{CONTRACT_NO}} ký ngày {{CONTRACT_DATE}} giữa Trung tâm Mạng lưới MobiFone miền Nam và Ông/Bà {{OWNER_NAME}} về việc thuê đặt trạm BTS địa chỉ: {{ADDRESS}}.</w:t>
+        <w:t>Căn cứ hợp đồng số {{CONTRACT_NO}} ký ngày {{CONTRACT_DATE}} giữa Trung tâm Mạng lưới MobiFone miền Nam và Ông/Bà {{OWNER_NAME}} về việc thuê đặt trạm BTS địa chỉ: {{ADDRESS_OLD}} ({{ADDRESS_NEW}}).</w:t>
       </w:r>
     </w:p>
     <w:p>
@@ -679,7 +679,7 @@
       </w:pPr>
       <w:r>
         <w:rPr>
-          <w:rFonts w:ascii="Times New Roman" w:eastAsia="Times New Roman" w:hAnsi="Times New Roman" w:cs="Times New Roman"/>
+          <w:rFonts w:ascii="Times New Roman" w:hAnsi="Times New Roman"/>
           <w:szCs w:val="26"/>
         </w:rPr>
         <w:t>Căn cứ phụ lục hợp đồng kí ngày 01/12/2025 về việc chuyển chủ thể kí hợp đồng từ Trung tâm Mạng lưới MobiFone miền Nam qua MobiFone Đồng Nai của hợp đồng số {{CONTRACT_NO}};</w:t>
@@ -700,7 +700,7 @@
       <w:r>
         <w:rPr>
           <w:rStyle w:val="Emphasis"/>
-          <w:rFonts w:ascii="Times New Roman" w:eastAsia="Times New Roman" w:hAnsi="Times New Roman" w:cs="Times New Roman"/>
+          <w:rFonts w:ascii="Times New Roman" w:hAnsi="Times New Roman"/>
           <w:i w:val="0"/>
           <w:szCs w:val="26"/>
         </w:rPr>
@@ -723,7 +723,7 @@
       <w:r>
         <w:rPr>
           <w:rStyle w:val="Emphasis"/>
-          <w:rFonts w:ascii="Times New Roman" w:eastAsia="Times New Roman" w:hAnsi="Times New Roman" w:cs="Times New Roman"/>
+          <w:rFonts w:ascii="Times New Roman" w:hAnsi="Times New Roman"/>
           <w:i w:val="0"/>
           <w:szCs w:val="28"/>
         </w:rPr>
@@ -731,7 +731,7 @@
       </w:r>
       <w:r>
         <w:rPr>
-          <w:rFonts w:ascii="Times New Roman" w:eastAsia="Times New Roman" w:hAnsi="Times New Roman" w:cs="Times New Roman"/>
+          <w:rFonts w:ascii="Times New Roman" w:hAnsi="Times New Roman"/>
           <w:iCs/>
           <w:szCs w:val="28"/>
         </w:rPr>
@@ -750,7 +750,7 @@
       </w:pPr>
       <w:r>
         <w:rPr>
-          <w:rFonts w:ascii="Times New Roman" w:eastAsia="Times New Roman" w:hAnsi="Times New Roman" w:cs="Times New Roman"/>
+          <w:rFonts w:ascii="Times New Roman" w:hAnsi="Times New Roman"/>
           <w:szCs w:val="26"/>
         </w:rPr>
         <w:t>Căn cứ biên bản làm việc về việc thanh lý ký lại hợp đồng thuê trạm {{SITE_ID}}</w:t>
@@ -769,7 +769,7 @@
       </w:pPr>
       <w:r>
         <w:rPr>
-          <w:rFonts w:ascii="Times New Roman" w:eastAsia="Times New Roman" w:hAnsi="Times New Roman" w:cs="Times New Roman"/>
+          <w:rFonts w:ascii="Times New Roman" w:hAnsi="Times New Roman"/>
           <w:szCs w:val="26"/>
           <w:lang w:val="vi-VN"/>
         </w:rPr>
@@ -777,14 +777,14 @@
       </w:r>
       <w:r>
         <w:rPr>
-          <w:rFonts w:ascii="Times New Roman" w:eastAsia="Times New Roman" w:hAnsi="Times New Roman" w:cs="Times New Roman"/>
+          <w:rFonts w:ascii="Times New Roman" w:hAnsi="Times New Roman"/>
           <w:szCs w:val="26"/>
         </w:rPr>
         <w:t>t</w:t>
       </w:r>
       <w:r>
         <w:rPr>
-          <w:rFonts w:ascii="Times New Roman" w:eastAsia="Times New Roman" w:hAnsi="Times New Roman" w:cs="Times New Roman"/>
+          <w:rFonts w:ascii="Times New Roman" w:hAnsi="Times New Roman"/>
           <w:szCs w:val="26"/>
           <w:lang w:val="vi-VN"/>
         </w:rPr>
@@ -792,14 +792,14 @@
       </w:r>
       <w:r>
         <w:rPr>
-          <w:rFonts w:ascii="Times New Roman" w:eastAsia="Times New Roman" w:hAnsi="Times New Roman" w:cs="Times New Roman"/>
+          <w:rFonts w:ascii="Times New Roman" w:hAnsi="Times New Roman"/>
           <w:szCs w:val="26"/>
         </w:rPr>
         <w:t xml:space="preserve"> </w:t>
       </w:r>
       <w:r>
         <w:rPr>
-          <w:rFonts w:ascii="Times New Roman" w:eastAsia="Times New Roman" w:hAnsi="Times New Roman" w:cs="Times New Roman"/>
+          <w:rFonts w:ascii="Times New Roman" w:hAnsi="Times New Roman"/>
           <w:szCs w:val="26"/>
           <w:lang w:val="vi-VN"/>
         </w:rPr>
@@ -807,14 +807,14 @@
       </w:r>
       <w:r>
         <w:rPr>
-          <w:rFonts w:ascii="Times New Roman" w:eastAsia="Times New Roman" w:hAnsi="Times New Roman" w:cs="Times New Roman"/>
+          <w:rFonts w:ascii="Times New Roman" w:hAnsi="Times New Roman"/>
           <w:szCs w:val="26"/>
         </w:rPr>
         <w:t>xem</w:t>
       </w:r>
       <w:r>
         <w:rPr>
-          <w:rFonts w:ascii="Times New Roman" w:eastAsia="Times New Roman" w:hAnsi="Times New Roman" w:cs="Times New Roman"/>
+          <w:rFonts w:ascii="Times New Roman" w:hAnsi="Times New Roman"/>
           <w:szCs w:val="26"/>
           <w:lang w:val="vi-VN"/>
         </w:rPr>
@@ -823,7 +823,7 @@
       <w:r>
         <w:rPr>
           <w:rStyle w:val="Emphasis"/>
-          <w:rFonts w:ascii="Times New Roman" w:eastAsia="Times New Roman" w:hAnsi="Times New Roman" w:cs="Times New Roman"/>
+          <w:rFonts w:ascii="Times New Roman" w:hAnsi="Times New Roman"/>
           <w:i w:val="0"/>
           <w:szCs w:val="26"/>
         </w:rPr>
@@ -832,7 +832,7 @@
       <w:r>
         <w:rPr>
           <w:rStyle w:val="Emphasis"/>
-          <w:rFonts w:ascii="Times New Roman" w:eastAsia="Times New Roman" w:hAnsi="Times New Roman" w:cs="Times New Roman"/>
+          <w:rFonts w:ascii="Times New Roman" w:hAnsi="Times New Roman"/>
           <w:i w:val="0"/>
           <w:szCs w:val="26"/>
           <w:lang w:val="vi-VN"/>
@@ -841,7 +841,7 @@
       </w:r>
       <w:r>
         <w:rPr>
-          <w:rFonts w:ascii="Times New Roman" w:eastAsia="Times New Roman" w:hAnsi="Times New Roman" w:cs="Times New Roman"/>
+          <w:rFonts w:ascii="Times New Roman" w:hAnsi="Times New Roman"/>
           <w:szCs w:val="26"/>
           <w:lang w:val="vi-VN"/>
         </w:rPr>
@@ -864,7 +864,7 @@
       </w:pPr>
       <w:r>
         <w:rPr>
-          <w:rFonts w:ascii="Times New Roman" w:eastAsia="Times New Roman" w:hAnsi="Times New Roman" w:cs="Times New Roman"/>
+          <w:rFonts w:ascii="Times New Roman" w:hAnsi="Times New Roman"/>
           <w:szCs w:val="26"/>
         </w:rPr>
         <w:t>Các khoản mục CSHT:</w:t>
@@ -889,7 +889,7 @@
       </w:pPr>
       <w:r>
         <w:rPr>
-          <w:rFonts w:ascii="Times New Roman" w:eastAsia="Times New Roman" w:hAnsi="Times New Roman" w:cs="Times New Roman"/>
+          <w:rFonts w:ascii="Times New Roman" w:hAnsi="Times New Roman"/>
           <w:szCs w:val="26"/>
         </w:rPr>
         <w:t>{{CSHT_LIST1}}</w:t>
@@ -914,7 +914,7 @@
       </w:pPr>
       <w:r>
         <w:rPr>
-          <w:rFonts w:ascii="Times New Roman" w:eastAsia="Times New Roman" w:hAnsi="Times New Roman" w:cs="Times New Roman"/>
+          <w:rFonts w:ascii="Times New Roman" w:hAnsi="Times New Roman"/>
           <w:szCs w:val="26"/>
           <w:lang w:val="vi-VN"/>
         </w:rPr>
@@ -922,7 +922,7 @@
       </w:r>
       <w:r>
         <w:rPr>
-          <w:rFonts w:ascii="Times New Roman" w:eastAsia="Times New Roman" w:hAnsi="Times New Roman" w:cs="Times New Roman"/>
+          <w:rFonts w:ascii="Times New Roman" w:hAnsi="Times New Roman"/>
           <w:szCs w:val="26"/>
         </w:rPr>
         <w:t>Điều khoản hợp đồng:</w:t>
@@ -944,14 +944,14 @@
       </w:pPr>
       <w:r>
         <w:rPr>
-          <w:rFonts w:ascii="Times New Roman" w:eastAsia="Times New Roman" w:hAnsi="Times New Roman" w:cs="Times New Roman"/>
+          <w:rFonts w:ascii="Times New Roman" w:hAnsi="Times New Roman"/>
           <w:szCs w:val="26"/>
         </w:rPr>
         <w:t xml:space="preserve">Thời hạn hợp đồng: Từ ngày {{START_DATE}} đến ngày </w:t>
       </w:r>
       <w:r>
         <w:rPr>
-          <w:rFonts w:ascii="Times New Roman" w:eastAsia="Times New Roman" w:hAnsi="Times New Roman" w:cs="Times New Roman"/>
+          <w:rFonts w:ascii="Times New Roman" w:hAnsi="Times New Roman"/>
           <w:szCs w:val="26"/>
         </w:rPr>
         <w:t>{{END_DATE}}</w:t>
@@ -973,7 +973,7 @@
       </w:pPr>
       <w:r>
         <w:rPr>
-          <w:rFonts w:ascii="Times New Roman" w:eastAsia="Times New Roman" w:hAnsi="Times New Roman" w:cs="Times New Roman"/>
+          <w:rFonts w:ascii="Times New Roman" w:hAnsi="Times New Roman"/>
           <w:szCs w:val="26"/>
         </w:rPr>
         <w:lastRenderedPageBreak/>
@@ -981,7 +981,7 @@
       </w:r>
       <w:r>
         <w:rPr>
-          <w:rFonts w:ascii="Times New Roman" w:eastAsia="Times New Roman" w:hAnsi="Times New Roman" w:cs="Times New Roman"/>
+          <w:rFonts w:ascii="Times New Roman" w:hAnsi="Times New Roman"/>
           <w:szCs w:val="26"/>
           <w:lang w:val="vi-VN"/>
         </w:rPr>
@@ -989,7 +989,7 @@
       </w:r>
       <w:r>
         <w:rPr>
-          <w:rFonts w:ascii="Times New Roman" w:eastAsia="Times New Roman" w:hAnsi="Times New Roman" w:cs="Times New Roman"/>
+          <w:rFonts w:ascii="Times New Roman" w:hAnsi="Times New Roman"/>
           <w:szCs w:val="26"/>
         </w:rPr>
         <w:t xml:space="preserve">với đơn giá chi tiết theo các hạng mục như sau: </w:t>
@@ -1039,7 +1039,7 @@
             </w:pPr>
             <w:r>
               <w:rPr>
-                <w:rFonts w:ascii="Times New Roman" w:eastAsia="Times New Roman" w:hAnsi="Times New Roman" w:cs="Times New Roman"/>
+                <w:rFonts w:ascii="Times New Roman" w:hAnsi="Times New Roman"/>
                 <w:b/>
                 <w:bCs/>
                 <w:szCs w:val="26"/>
@@ -1066,7 +1066,7 @@
             </w:pPr>
             <w:r>
               <w:rPr>
-                <w:rFonts w:ascii="Times New Roman" w:eastAsia="Times New Roman" w:hAnsi="Times New Roman" w:cs="Times New Roman"/>
+                <w:rFonts w:ascii="Times New Roman" w:hAnsi="Times New Roman"/>
                 <w:b/>
                 <w:bCs/>
                 <w:szCs w:val="26"/>
@@ -1093,7 +1093,7 @@
             </w:pPr>
             <w:r>
               <w:rPr>
-                <w:rFonts w:ascii="Times New Roman" w:eastAsia="Times New Roman" w:hAnsi="Times New Roman" w:cs="Times New Roman"/>
+                <w:rFonts w:ascii="Times New Roman" w:hAnsi="Times New Roman"/>
                 <w:b/>
                 <w:bCs/>
                 <w:szCs w:val="26"/>
@@ -1119,7 +1119,7 @@
             </w:pPr>
             <w:r>
               <w:rPr>
-                <w:rFonts w:ascii="Times New Roman" w:eastAsia="Times New Roman" w:hAnsi="Times New Roman" w:cs="Times New Roman"/>
+                <w:rFonts w:ascii="Times New Roman" w:hAnsi="Times New Roman"/>
                 <w:b/>
                 <w:bCs/>
                 <w:szCs w:val="26"/>
@@ -1145,7 +1145,7 @@
             </w:pPr>
             <w:r>
               <w:rPr>
-                <w:rFonts w:ascii="Times New Roman" w:eastAsia="Times New Roman" w:hAnsi="Times New Roman" w:cs="Times New Roman"/>
+                <w:rFonts w:ascii="Times New Roman" w:hAnsi="Times New Roman"/>
                 <w:b/>
                 <w:bCs/>
                 <w:szCs w:val="26"/>
@@ -1165,7 +1165,7 @@
             </w:pPr>
             <w:r>
               <w:rPr>
-                <w:rFonts w:ascii="Times New Roman" w:eastAsia="Times New Roman" w:hAnsi="Times New Roman" w:cs="Times New Roman"/>
+                <w:rFonts w:ascii="Times New Roman" w:hAnsi="Times New Roman"/>
                 <w:b/>
                 <w:bCs/>
                 <w:szCs w:val="26"/>
@@ -1192,7 +1192,7 @@
             </w:pPr>
             <w:r>
               <w:rPr>
-                <w:rFonts w:ascii="Times New Roman" w:eastAsia="Times New Roman" w:hAnsi="Times New Roman" w:cs="Times New Roman"/>
+                <w:rFonts w:ascii="Times New Roman" w:hAnsi="Times New Roman"/>
                 <w:b/>
                 <w:bCs/>
                 <w:szCs w:val="26"/>
@@ -1222,7 +1222,7 @@
             </w:pPr>
             <w:r>
               <w:rPr>
-                <w:rFonts w:ascii="Times New Roman" w:eastAsia="Times New Roman" w:hAnsi="Times New Roman" w:cs="Times New Roman"/>
+                <w:rFonts w:ascii="Times New Roman" w:hAnsi="Times New Roman"/>
                 <w:szCs w:val="26"/>
               </w:rPr>
               <w:t>Mặt bằng</w:t>
@@ -1243,7 +1243,7 @@
             </w:pPr>
             <w:r>
               <w:rPr>
-                <w:rFonts w:ascii="Times New Roman" w:eastAsia="Times New Roman" w:hAnsi="Times New Roman" w:cs="Times New Roman"/>
+                <w:rFonts w:ascii="Times New Roman" w:hAnsi="Times New Roman"/>
                 <w:szCs w:val="26"/>
               </w:rPr>
               <w:t>{{MB_QĐ02}}</w:t>
@@ -1295,7 +1295,7 @@
             </w:pPr>
             <w:r>
               <w:rPr>
-                <w:rFonts w:ascii="Times New Roman" w:eastAsia="Times New Roman" w:hAnsi="Times New Roman" w:cs="Times New Roman"/>
+                <w:rFonts w:ascii="Times New Roman" w:hAnsi="Times New Roman"/>
                 <w:szCs w:val="26"/>
               </w:rPr>
               <w:t>{{P_MB}}</w:t>
@@ -1317,7 +1317,7 @@
             </w:pPr>
             <w:r>
               <w:rPr>
-                <w:rFonts w:ascii="Times New Roman" w:eastAsia="Times New Roman" w:hAnsi="Times New Roman" w:cs="Times New Roman"/>
+                <w:rFonts w:ascii="Times New Roman" w:hAnsi="Times New Roman"/>
                 <w:szCs w:val="26"/>
               </w:rPr>
               <w:t>{{TL_MB}}</w:t>
@@ -1345,7 +1345,7 @@
             </w:pPr>
             <w:r>
               <w:rPr>
-                <w:rFonts w:ascii="Times New Roman" w:eastAsia="Times New Roman" w:hAnsi="Times New Roman" w:cs="Times New Roman"/>
+                <w:rFonts w:ascii="Times New Roman" w:hAnsi="Times New Roman"/>
                 <w:szCs w:val="26"/>
               </w:rPr>
               <w:t>Phòng MFĐ</w:t>
@@ -1382,7 +1382,7 @@
             </w:pPr>
             <w:r>
               <w:rPr>
-                <w:rFonts w:ascii="Times New Roman" w:eastAsia="Times New Roman" w:hAnsi="Times New Roman" w:cs="Times New Roman"/>
+                <w:rFonts w:ascii="Times New Roman" w:hAnsi="Times New Roman"/>
                 <w:szCs w:val="26"/>
               </w:rPr>
               <w:t>{{MFĐ_1245}}</w:t>
@@ -1418,7 +1418,7 @@
             </w:pPr>
             <w:r>
               <w:rPr>
-                <w:rFonts w:ascii="Times New Roman" w:eastAsia="Times New Roman" w:hAnsi="Times New Roman" w:cs="Times New Roman"/>
+                <w:rFonts w:ascii="Times New Roman" w:hAnsi="Times New Roman"/>
                 <w:szCs w:val="26"/>
               </w:rPr>
               <w:t>{{P_MFD}}</w:t>
@@ -1440,7 +1440,7 @@
             </w:pPr>
             <w:r>
               <w:rPr>
-                <w:rFonts w:ascii="Times New Roman" w:eastAsia="Times New Roman" w:hAnsi="Times New Roman" w:cs="Times New Roman"/>
+                <w:rFonts w:ascii="Times New Roman" w:hAnsi="Times New Roman"/>
                 <w:szCs w:val="26"/>
               </w:rPr>
               <w:t>{{TL_MFD}}</w:t>
@@ -1467,7 +1467,7 @@
             </w:pPr>
             <w:r>
               <w:rPr>
-                <w:rFonts w:ascii="Times New Roman" w:eastAsia="Times New Roman" w:hAnsi="Times New Roman" w:cs="Times New Roman"/>
+                <w:rFonts w:ascii="Times New Roman" w:hAnsi="Times New Roman"/>
                 <w:szCs w:val="26"/>
               </w:rPr>
               <w:t>Phòng máy mặt đất</w:t>
@@ -1503,7 +1503,7 @@
             </w:pPr>
             <w:r>
               <w:rPr>
-                <w:rFonts w:ascii="Times New Roman" w:eastAsia="Times New Roman" w:hAnsi="Times New Roman" w:cs="Times New Roman"/>
+                <w:rFonts w:ascii="Times New Roman" w:hAnsi="Times New Roman"/>
                 <w:szCs w:val="26"/>
               </w:rPr>
               <w:t>{{PM_1245}}</w:t>
@@ -1539,7 +1539,7 @@
             </w:pPr>
             <w:r>
               <w:rPr>
-                <w:rFonts w:ascii="Times New Roman" w:eastAsia="Times New Roman" w:hAnsi="Times New Roman" w:cs="Times New Roman"/>
+                <w:rFonts w:ascii="Times New Roman" w:hAnsi="Times New Roman"/>
                 <w:szCs w:val="26"/>
               </w:rPr>
               <w:t>{{P_PM}}</w:t>
@@ -1560,7 +1560,7 @@
             </w:pPr>
             <w:r>
               <w:rPr>
-                <w:rFonts w:ascii="Times New Roman" w:eastAsia="Times New Roman" w:hAnsi="Times New Roman" w:cs="Times New Roman"/>
+                <w:rFonts w:ascii="Times New Roman" w:hAnsi="Times New Roman"/>
                 <w:szCs w:val="26"/>
               </w:rPr>
               <w:t>{{TL_PM}}</w:t>
@@ -1588,14 +1588,14 @@
             </w:pPr>
             <w:r>
               <w:rPr>
-                <w:rFonts w:ascii="Times New Roman" w:eastAsia="Times New Roman" w:hAnsi="Times New Roman" w:cs="Times New Roman"/>
+                <w:rFonts w:ascii="Times New Roman" w:hAnsi="Times New Roman"/>
                 <w:szCs w:val="26"/>
               </w:rPr>
               <w:t xml:space="preserve">Cột </w:t>
             </w:r>
             <w:r>
               <w:rPr>
-                <w:rFonts w:ascii="Times New Roman" w:eastAsia="Times New Roman" w:hAnsi="Times New Roman" w:cs="Times New Roman"/>
+                <w:rFonts w:ascii="Times New Roman" w:hAnsi="Times New Roman"/>
                 <w:szCs w:val="26"/>
               </w:rPr>
               <w:br/>
@@ -1633,7 +1633,7 @@
             </w:pPr>
             <w:r>
               <w:rPr>
-                <w:rFonts w:ascii="Times New Roman" w:eastAsia="Times New Roman" w:hAnsi="Times New Roman" w:cs="Times New Roman"/>
+                <w:rFonts w:ascii="Times New Roman" w:hAnsi="Times New Roman"/>
                 <w:sz w:val="28"/>
                 <w:szCs w:val="28"/>
               </w:rPr>
@@ -1656,7 +1656,7 @@
             </w:pPr>
             <w:r>
               <w:rPr>
-                <w:rFonts w:ascii="Times New Roman" w:eastAsia="Times New Roman" w:hAnsi="Times New Roman" w:cs="Times New Roman"/>
+                <w:rFonts w:ascii="Times New Roman" w:hAnsi="Times New Roman"/>
                 <w:sz w:val="28"/>
                 <w:szCs w:val="28"/>
               </w:rPr>
@@ -1678,7 +1678,7 @@
             </w:pPr>
             <w:r>
               <w:rPr>
-                <w:rFonts w:ascii="Times New Roman" w:eastAsia="Times New Roman" w:hAnsi="Times New Roman" w:cs="Times New Roman"/>
+                <w:rFonts w:ascii="Times New Roman" w:hAnsi="Times New Roman"/>
               </w:rPr>
               <w:t>{{COT_CHOT}}</w:t>
             </w:r>
@@ -1699,7 +1699,7 @@
             </w:pPr>
             <w:r>
               <w:rPr>
-                <w:rFonts w:ascii="Times New Roman" w:eastAsia="Times New Roman" w:hAnsi="Times New Roman" w:cs="Times New Roman"/>
+                <w:rFonts w:ascii="Times New Roman" w:hAnsi="Times New Roman"/>
               </w:rPr>
               <w:t>{{TL_COT}}</w:t>
             </w:r>
@@ -1727,7 +1727,7 @@
             </w:pPr>
             <w:r>
               <w:rPr>
-                <w:rFonts w:ascii="Times New Roman" w:eastAsia="Times New Roman" w:hAnsi="Times New Roman" w:cs="Times New Roman"/>
+                <w:rFonts w:ascii="Times New Roman" w:hAnsi="Times New Roman"/>
                 <w:b/>
                 <w:bCs/>
                 <w:szCs w:val="26"/>
@@ -1751,7 +1751,7 @@
             </w:pPr>
             <w:r>
               <w:rPr>
-                <w:rFonts w:ascii="Times New Roman" w:eastAsia="Times New Roman" w:hAnsi="Times New Roman" w:cs="Times New Roman"/>
+                <w:rFonts w:ascii="Times New Roman" w:hAnsi="Times New Roman"/>
                 <w:szCs w:val="26"/>
               </w:rPr>
               <w:t>{{TONG_QD}}</w:t>
@@ -1772,7 +1772,7 @@
             </w:pPr>
             <w:r>
               <w:rPr>
-                <w:rFonts w:ascii="Times New Roman" w:eastAsia="Times New Roman" w:hAnsi="Times New Roman" w:cs="Times New Roman"/>
+                <w:rFonts w:ascii="Times New Roman" w:hAnsi="Times New Roman"/>
                 <w:szCs w:val="26"/>
               </w:rPr>
               <w:t>{{TONG_CHOT}}</w:t>
@@ -1793,7 +1793,7 @@
             </w:pPr>
             <w:r>
               <w:rPr>
-                <w:rFonts w:ascii="Times New Roman" w:eastAsia="Times New Roman" w:hAnsi="Times New Roman" w:cs="Times New Roman"/>
+                <w:rFonts w:ascii="Times New Roman" w:hAnsi="Times New Roman"/>
                 <w:szCs w:val="26"/>
               </w:rPr>
               <w:t>{{TL_TONG}}</w:t>
@@ -1819,7 +1819,7 @@
       </w:pPr>
       <w:r>
         <w:rPr>
-          <w:rFonts w:ascii="Times New Roman" w:eastAsia="Times New Roman" w:hAnsi="Times New Roman" w:cs="Times New Roman"/>
+          <w:rFonts w:ascii="Times New Roman" w:hAnsi="Times New Roman"/>
           <w:szCs w:val="26"/>
         </w:rPr>
         <w:t>Thời gian áp dụng giá thuê mới: Từ ngày {{START_DATE}}</w:t>
@@ -1838,7 +1838,7 @@
       </w:pPr>
       <w:r>
         <w:rPr>
-          <w:rFonts w:ascii="Times New Roman" w:eastAsia="Times New Roman" w:hAnsi="Times New Roman" w:cs="Times New Roman"/>
+          <w:rFonts w:ascii="Times New Roman" w:hAnsi="Times New Roman"/>
           <w:szCs w:val="26"/>
           <w:lang w:val="vi-VN"/>
         </w:rPr>
@@ -1846,13 +1846,13 @@
       </w:r>
       <w:r>
         <w:rPr>
-          <w:rFonts w:ascii="Times New Roman" w:eastAsia="Times New Roman" w:hAnsi="Times New Roman" w:cs="Times New Roman"/>
+          <w:rFonts w:ascii="Times New Roman" w:hAnsi="Times New Roman"/>
         </w:rPr>
         <w:t xml:space="preserve">thanh lý và ký lại hợp đồng </w:t>
       </w:r>
       <w:r>
         <w:rPr>
-          <w:rFonts w:ascii="Times New Roman" w:eastAsia="Times New Roman" w:hAnsi="Times New Roman" w:cs="Times New Roman"/>
+          <w:rFonts w:ascii="Times New Roman" w:hAnsi="Times New Roman"/>
           <w:szCs w:val="26"/>
           <w:lang w:val="vi-VN"/>
         </w:rPr>
@@ -1860,14 +1860,14 @@
       </w:r>
       <w:r>
         <w:rPr>
-          <w:rFonts w:ascii="Times New Roman" w:eastAsia="Times New Roman" w:hAnsi="Times New Roman" w:cs="Times New Roman"/>
+          <w:rFonts w:ascii="Times New Roman" w:hAnsi="Times New Roman"/>
           <w:szCs w:val="26"/>
         </w:rPr>
         <w:t xml:space="preserve"> </w:t>
       </w:r>
       <w:r>
         <w:rPr>
-          <w:rFonts w:ascii="Times New Roman" w:eastAsia="Times New Roman" w:hAnsi="Times New Roman" w:cs="Times New Roman"/>
+          <w:rFonts w:ascii="Times New Roman" w:hAnsi="Times New Roman"/>
           <w:szCs w:val="26"/>
           <w:lang w:val="vi-VN"/>
         </w:rPr>
@@ -1891,7 +1891,7 @@
       </w:pPr>
       <w:r>
         <w:rPr>
-          <w:rFonts w:ascii="Times New Roman" w:eastAsia="Times New Roman" w:hAnsi="Times New Roman" w:cs="Times New Roman"/>
+          <w:rFonts w:ascii="Times New Roman" w:hAnsi="Times New Roman"/>
           <w:szCs w:val="26"/>
         </w:rPr>
         <w:t> </w:t>
@@ -1925,7 +1925,7 @@
             </w:pPr>
             <w:r>
               <w:rPr>
-                <w:rFonts w:ascii="Times New Roman" w:eastAsia="Times New Roman" w:hAnsi="Times New Roman" w:cs="Times New Roman"/>
+                <w:rFonts w:ascii="Times New Roman" w:hAnsi="Times New Roman"/>
                 <w:b/>
                 <w:i/>
                 <w:szCs w:val="26"/>
@@ -1951,7 +1951,7 @@
             </w:pPr>
             <w:r>
               <w:rPr>
-                <w:rFonts w:ascii="Times New Roman" w:eastAsia="Times New Roman" w:hAnsi="Times New Roman" w:cs="Times New Roman"/>
+                <w:rFonts w:ascii="Times New Roman" w:hAnsi="Times New Roman"/>
                 <w:szCs w:val="26"/>
               </w:rPr>
               <w:t>- Như trên;</w:t>
@@ -1967,14 +1967,14 @@
             </w:pPr>
             <w:r>
               <w:rPr>
-                <w:rFonts w:ascii="Times New Roman" w:eastAsia="Times New Roman" w:hAnsi="Times New Roman" w:cs="Times New Roman"/>
+                <w:rFonts w:ascii="Times New Roman" w:hAnsi="Times New Roman"/>
                 <w:szCs w:val="26"/>
               </w:rPr>
               <w:t>- Lưu: VT; P.VT</w:t>
             </w:r>
             <w:r>
               <w:rPr>
-                <w:rFonts w:ascii="Times New Roman" w:eastAsia="Times New Roman" w:hAnsi="Times New Roman" w:cs="Times New Roman"/>
+                <w:rFonts w:ascii="Times New Roman" w:hAnsi="Times New Roman"/>
                 <w:szCs w:val="26"/>
                 <w:lang w:val="vi-VN"/>
               </w:rPr>
@@ -2018,7 +2018,7 @@
             </w:pPr>
             <w:r>
               <w:rPr>
-                <w:rFonts w:ascii="Times New Roman" w:eastAsia="Times New Roman" w:hAnsi="Times New Roman" w:cs="Times New Roman"/>
+                <w:rFonts w:ascii="Times New Roman" w:hAnsi="Times New Roman"/>
                 <w:b/>
                 <w:szCs w:val="26"/>
                 <w:lang w:eastAsia="vi-VN"/>
@@ -2040,7 +2040,7 @@
             </w:pPr>
             <w:r>
               <w:rPr>
-                <w:rFonts w:ascii="Times New Roman" w:eastAsia="Times New Roman" w:hAnsi="Times New Roman" w:cs="Times New Roman"/>
+                <w:rFonts w:ascii="Times New Roman" w:hAnsi="Times New Roman"/>
                 <w:b/>
                 <w:bCs/>
                 <w:szCs w:val="26"/>
@@ -2151,7 +2151,7 @@
             </w:pPr>
             <w:r>
               <w:rPr>
-                <w:rFonts w:ascii="Times New Roman" w:eastAsia="Times New Roman" w:hAnsi="Times New Roman" w:cs="Times New Roman"/>
+                <w:rFonts w:ascii="Times New Roman" w:hAnsi="Times New Roman"/>
                 <w:szCs w:val="26"/>
               </w:rPr>
               <w:t xml:space="preserve"> </w:t>
@@ -2198,7 +2198,7 @@
             </w:pPr>
             <w:r>
               <w:rPr>
-                <w:rFonts w:ascii="Times New Roman" w:eastAsia="Times New Roman" w:hAnsi="Times New Roman" w:cs="Times New Roman"/>
+                <w:rFonts w:ascii="Times New Roman" w:hAnsi="Times New Roman"/>
                 <w:b/>
                 <w:szCs w:val="26"/>
               </w:rPr>
@@ -2236,7 +2236,7 @@
             </w:pPr>
             <w:r>
               <w:rPr>
-                <w:rFonts w:ascii="Times New Roman" w:eastAsia="Times New Roman" w:hAnsi="Times New Roman" w:cs="Times New Roman"/>
+                <w:rFonts w:ascii="Times New Roman" w:hAnsi="Times New Roman"/>
                 <w:szCs w:val="28"/>
                 <w:lang w:val="vi-VN"/>
               </w:rPr>
@@ -2258,7 +2258,7 @@
             </w:pPr>
             <w:r>
               <w:rPr>
-                <w:rFonts w:ascii="Times New Roman" w:eastAsia="Times New Roman" w:hAnsi="Times New Roman" w:cs="Times New Roman"/>
+                <w:rFonts w:ascii="Times New Roman" w:hAnsi="Times New Roman"/>
                 <w:b/>
                 <w:szCs w:val="28"/>
               </w:rPr>
@@ -2289,7 +2289,7 @@
             </w:pPr>
             <w:r>
               <w:rPr>
-                <w:rFonts w:ascii="Times New Roman" w:eastAsia="Times New Roman" w:hAnsi="Times New Roman" w:cs="Times New Roman"/>
+                <w:rFonts w:ascii="Times New Roman" w:hAnsi="Times New Roman"/>
                 <w:b/>
                 <w:bCs/>
                 <w:szCs w:val="28"/>
@@ -2393,7 +2393,7 @@
             </w:r>
             <w:r>
               <w:rPr>
-                <w:rFonts w:ascii="Times New Roman" w:eastAsia="Times New Roman" w:hAnsi="Times New Roman" w:cs="Times New Roman"/>
+                <w:rFonts w:ascii="Times New Roman" w:hAnsi="Times New Roman"/>
                 <w:b/>
                 <w:bCs/>
                 <w:szCs w:val="28"/>
@@ -2530,7 +2530,6 @@
       </w:pPr>
       <w:r>
         <w:rPr>
-          <w:rFonts w:ascii="Times New Roman" w:eastAsia="Times New Roman" w:hAnsi="Times New Roman" w:cs="Times New Roman"/>
           <w:rStyle w:val="Strong"/>
           <w:sz w:val="26"/>
           <w:szCs w:val="26"/>
@@ -2539,7 +2538,6 @@
       </w:r>
       <w:r>
         <w:rPr>
-          <w:rFonts w:ascii="Times New Roman" w:eastAsia="Times New Roman" w:hAnsi="Times New Roman" w:cs="Times New Roman"/>
           <w:sz w:val="26"/>
           <w:szCs w:val="26"/>
         </w:rPr>
@@ -2561,7 +2559,7 @@
       </w:pPr>
       <w:r>
         <w:rPr>
-          <w:rFonts w:ascii="Times New Roman" w:eastAsia="Times New Roman" w:hAnsi="Times New Roman" w:cs="Times New Roman"/>
+          <w:rFonts w:eastAsia="Times New Roman"/>
           <w:sz w:val="26"/>
         </w:rPr>
         <w:t xml:space="preserve">Về việc thanh lý hợp đồng trạm {{SITE_ID}} </w:t>
@@ -2581,12 +2579,12 @@
       </w:pPr>
       <w:r>
         <w:rPr>
-          <w:rFonts w:ascii="Times New Roman" w:eastAsia="Times New Roman" w:hAnsi="Times New Roman" w:cs="Times New Roman"/>
+          <w:rFonts w:eastAsia="Times New Roman"/>
           <w:bCs/>
           <w:sz w:val="26"/>
           <w:szCs w:val="26"/>
         </w:rPr>
-        <w:t>Căn cứ vào hợp đồng số {{CONTRACT_NO}} ký ngày {{CONTRACT_DATE}} giữa Trung tâm mạng lưới MobiFone miền Nam và Ông/Bà {{OWNER_NAME}} về việc thuê vị trí đặt trạm điện thoại di động tại: {{ADDRESS}} (ID trạm: {{SITE_ID}}).</w:t>
+        <w:t>Căn cứ vào hợp đồng số {{CONTRACT_NO}} ký ngày {{CONTRACT_DATE}} giữa Trung tâm mạng lưới MobiFone miền Nam và Ông/Bà {{OWNER_NAME}} về việc thuê vị trí đặt trạm điện thoại di động tại: {{ADDRESS_OLD}} (ID trạm: {{SITE_ID}}).</w:t>
       </w:r>
     </w:p>
     <w:p>
@@ -2602,7 +2600,6 @@
       </w:pPr>
       <w:r>
         <w:rPr>
-          <w:rFonts w:ascii="Times New Roman" w:eastAsia="Times New Roman" w:hAnsi="Times New Roman" w:cs="Times New Roman"/>
           <w:rStyle w:val="Strong"/>
           <w:sz w:val="26"/>
           <w:szCs w:val="26"/>
@@ -2611,7 +2608,6 @@
       </w:r>
       <w:r>
         <w:rPr>
-          <w:rFonts w:ascii="Times New Roman" w:eastAsia="Times New Roman" w:hAnsi="Times New Roman" w:cs="Times New Roman"/>
           <w:sz w:val="26"/>
           <w:szCs w:val="26"/>
         </w:rPr>
@@ -2619,7 +2615,6 @@
       </w:r>
       <w:r>
         <w:rPr>
-          <w:rFonts w:ascii="Times New Roman" w:eastAsia="Times New Roman" w:hAnsi="Times New Roman" w:cs="Times New Roman"/>
           <w:sz w:val="26"/>
           <w:szCs w:val="26"/>
           <w:lang w:val="en-US"/>
@@ -2628,7 +2623,6 @@
       </w:r>
       <w:r>
         <w:rPr>
-          <w:rFonts w:ascii="Times New Roman" w:eastAsia="Times New Roman" w:hAnsi="Times New Roman" w:cs="Times New Roman"/>
           <w:sz w:val="26"/>
           <w:szCs w:val="26"/>
         </w:rPr>
@@ -2636,7 +2630,6 @@
       </w:r>
       <w:r>
         <w:rPr>
-          <w:rFonts w:ascii="Times New Roman" w:eastAsia="Times New Roman" w:hAnsi="Times New Roman" w:cs="Times New Roman"/>
           <w:sz w:val="26"/>
           <w:szCs w:val="26"/>
         </w:rPr>
@@ -2644,7 +2637,6 @@
       </w:r>
       <w:r>
         <w:rPr>
-          <w:rFonts w:ascii="Times New Roman" w:eastAsia="Times New Roman" w:hAnsi="Times New Roman" w:cs="Times New Roman"/>
           <w:rStyle w:val="Strong"/>
           <w:b w:val="0"/>
           <w:bCs w:val="0"/>
@@ -2655,15 +2647,13 @@
       </w:r>
       <w:r>
         <w:rPr>
-          <w:rFonts w:ascii="Times New Roman" w:eastAsia="Times New Roman" w:hAnsi="Times New Roman" w:cs="Times New Roman"/>
           <w:sz w:val="26"/>
           <w:szCs w:val="26"/>
         </w:rPr>
-        <w:t xml:space="preserve"> số 236A Phan Trung, phường Tam Hiệp, Đồng Nai.</w:t>
-      </w:r>
-      <w:r>
-        <w:rPr>
-          <w:rFonts w:ascii="Times New Roman" w:eastAsia="Times New Roman" w:hAnsi="Times New Roman" w:cs="Times New Roman"/>
+        <w:t xml:space="preserve"> số 236A Phan Trung, phường Tam Hiệp, Tp Đồng Nai.</w:t>
+      </w:r>
+      <w:r>
+        <w:rPr>
           <w:sz w:val="26"/>
           <w:szCs w:val="26"/>
         </w:rPr>
@@ -2683,7 +2673,6 @@
       </w:pPr>
       <w:r>
         <w:rPr>
-          <w:rFonts w:ascii="Times New Roman" w:eastAsia="Times New Roman" w:hAnsi="Times New Roman" w:cs="Times New Roman"/>
           <w:rStyle w:val="Emphasis"/>
           <w:b/>
           <w:bCs/>
@@ -2694,7 +2683,6 @@
       </w:r>
       <w:r>
         <w:rPr>
-          <w:rFonts w:ascii="Times New Roman" w:eastAsia="Times New Roman" w:hAnsi="Times New Roman" w:cs="Times New Roman"/>
           <w:sz w:val="26"/>
           <w:szCs w:val="26"/>
         </w:rPr>
@@ -2720,7 +2708,7 @@
       </w:pPr>
       <w:r>
         <w:rPr>
-          <w:rFonts w:ascii="Times New Roman" w:eastAsia="Times New Roman" w:hAnsi="Times New Roman" w:cs="Times New Roman"/>
+          <w:rFonts w:ascii="Times New Roman" w:hAnsi="Times New Roman"/>
           <w:b/>
           <w:bCs/>
           <w:szCs w:val="26"/>
@@ -2766,7 +2754,7 @@
             </w:pPr>
             <w:r>
               <w:rPr>
-                <w:rFonts w:ascii="Times New Roman" w:eastAsia="Times New Roman" w:hAnsi="Times New Roman" w:cs="Times New Roman"/>
+                <w:rFonts w:ascii="Times New Roman" w:hAnsi="Times New Roman"/>
                 <w:noProof/>
                 <w:szCs w:val="26"/>
               </w:rPr>
@@ -2794,7 +2782,7 @@
             </w:pPr>
             <w:r>
               <w:rPr>
-                <w:rFonts w:ascii="Times New Roman" w:eastAsia="Times New Roman" w:hAnsi="Times New Roman" w:cs="Times New Roman"/>
+                <w:rFonts w:ascii="Times New Roman" w:hAnsi="Times New Roman"/>
                 <w:noProof/>
                 <w:szCs w:val="26"/>
               </w:rPr>
@@ -2831,7 +2819,7 @@
             <w:bookmarkStart w:name="_Hlk76457538" w:id="1"/>
             <w:r>
               <w:rPr>
-                <w:rFonts w:ascii="Times New Roman" w:eastAsia="Times New Roman" w:hAnsi="Times New Roman" w:cs="Times New Roman"/>
+                <w:rFonts w:ascii="Times New Roman" w:hAnsi="Times New Roman"/>
                 <w:szCs w:val="26"/>
               </w:rPr>
               <w:t xml:space="preserve">Địa chỉ trạm </w:t>
@@ -2858,10 +2846,10 @@
             </w:pPr>
             <w:r>
               <w:rPr>
-                <w:rFonts w:ascii="Times New Roman" w:eastAsia="Times New Roman" w:hAnsi="Times New Roman" w:cs="Times New Roman"/>
-                <w:szCs w:val="26"/>
-              </w:rPr>
-              <w:t>:{{ADDRESS}}</w:t>
+                <w:rFonts w:ascii="Times New Roman" w:hAnsi="Times New Roman"/>
+                <w:szCs w:val="26"/>
+              </w:rPr>
+              <w:t>:{{ADDRESS_OLD}} ({{ADDRESS_NEW}})</w:t>
             </w:r>
           </w:p>
         </w:tc>
@@ -2882,7 +2870,6 @@
       </w:pPr>
       <w:r>
         <w:rPr>
-          <w:rFonts w:ascii="Times New Roman" w:eastAsia="Times New Roman" w:hAnsi="Times New Roman" w:cs="Times New Roman"/>
           <w:rStyle w:val="Strong"/>
           <w:sz w:val="26"/>
           <w:szCs w:val="26"/>
@@ -2891,7 +2878,6 @@
       </w:r>
       <w:r>
         <w:rPr>
-          <w:rFonts w:ascii="Times New Roman" w:eastAsia="Times New Roman" w:hAnsi="Times New Roman" w:cs="Times New Roman"/>
           <w:sz w:val="26"/>
           <w:szCs w:val="26"/>
         </w:rPr>
@@ -2936,7 +2922,7 @@
             </w:pPr>
             <w:r>
               <w:rPr>
-                <w:rFonts w:ascii="Times New Roman" w:eastAsia="Times New Roman" w:hAnsi="Times New Roman" w:cs="Times New Roman"/>
+                <w:rFonts w:ascii="Times New Roman" w:hAnsi="Times New Roman"/>
                 <w:noProof/>
                 <w:szCs w:val="26"/>
               </w:rPr>
@@ -2964,7 +2950,7 @@
             </w:pPr>
             <w:r>
               <w:rPr>
-                <w:rFonts w:ascii="Times New Roman" w:eastAsia="Times New Roman" w:hAnsi="Times New Roman" w:cs="Times New Roman"/>
+                <w:rFonts w:ascii="Times New Roman" w:hAnsi="Times New Roman"/>
                 <w:noProof/>
                 <w:szCs w:val="26"/>
               </w:rPr>
@@ -2972,7 +2958,7 @@
             </w:r>
             <w:r>
               <w:rPr>
-                <w:rFonts w:ascii="Times New Roman" w:eastAsia="Times New Roman" w:hAnsi="Times New Roman" w:cs="Times New Roman"/>
+                <w:rFonts w:ascii="Times New Roman" w:hAnsi="Times New Roman"/>
                 <w:b/>
                 <w:bCs/>
                 <w:szCs w:val="26"/>
@@ -2982,7 +2968,7 @@
             <w:r>
               <w:rPr>
                 <w:rStyle w:val="Emphasis"/>
-                <w:rFonts w:ascii="Times New Roman" w:eastAsia="Times New Roman" w:hAnsi="Times New Roman" w:cs="Times New Roman"/>
+                <w:rFonts w:ascii="Times New Roman" w:hAnsi="Times New Roman" w:eastAsiaTheme="majorEastAsia"/>
                 <w:b/>
                 <w:bCs/>
                 <w:i w:val="0"/>
@@ -3025,7 +3011,7 @@
             </w:pPr>
             <w:r>
               <w:rPr>
-                <w:rFonts w:ascii="Times New Roman" w:eastAsia="Times New Roman" w:hAnsi="Times New Roman" w:cs="Times New Roman"/>
+                <w:rFonts w:ascii="Times New Roman" w:hAnsi="Times New Roman"/>
                 <w:noProof/>
                 <w:szCs w:val="26"/>
               </w:rPr>
@@ -3053,7 +3039,7 @@
             </w:pPr>
             <w:r>
               <w:rPr>
-                <w:rFonts w:ascii="Times New Roman" w:eastAsia="Times New Roman" w:hAnsi="Times New Roman" w:cs="Times New Roman"/>
+                <w:rFonts w:ascii="Times New Roman" w:hAnsi="Times New Roman"/>
                 <w:noProof/>
                 <w:szCs w:val="26"/>
               </w:rPr>
@@ -3093,7 +3079,7 @@
             </w:pPr>
             <w:r>
               <w:rPr>
-                <w:rFonts w:ascii="Times New Roman" w:eastAsia="Times New Roman" w:hAnsi="Times New Roman" w:cs="Times New Roman"/>
+                <w:rFonts w:ascii="Times New Roman" w:hAnsi="Times New Roman"/>
                 <w:noProof/>
                 <w:szCs w:val="26"/>
                 <w:lang w:val="fr-FR"/>
@@ -3122,7 +3108,7 @@
             </w:pPr>
             <w:r>
               <w:rPr>
-                <w:rFonts w:ascii="Times New Roman" w:eastAsia="Times New Roman" w:hAnsi="Times New Roman" w:cs="Times New Roman"/>
+                <w:rFonts w:ascii="Times New Roman" w:hAnsi="Times New Roman"/>
                 <w:noProof/>
                 <w:szCs w:val="26"/>
                 <w:lang w:val="fr-FR"/>
@@ -3131,7 +3117,7 @@
             </w:r>
             <w:r>
               <w:rPr>
-                <w:rFonts w:ascii="Times New Roman" w:eastAsia="Times New Roman" w:hAnsi="Times New Roman" w:cs="Times New Roman"/>
+                <w:rFonts w:ascii="Times New Roman" w:hAnsi="Times New Roman"/>
                 <w:noProof/>
                 <w:szCs w:val="26"/>
                 <w:lang w:val="vi-VN"/>
@@ -3140,7 +3126,7 @@
             </w:r>
             <w:r>
               <w:rPr>
-                <w:rFonts w:ascii="Times New Roman" w:eastAsia="Times New Roman" w:hAnsi="Times New Roman" w:cs="Times New Roman"/>
+                <w:rFonts w:ascii="Times New Roman" w:hAnsi="Times New Roman"/>
                 <w:szCs w:val="26"/>
                 <w:lang w:val="vi-VN"/>
               </w:rPr>
@@ -3180,7 +3166,7 @@
             </w:pPr>
             <w:r>
               <w:rPr>
-                <w:rFonts w:ascii="Times New Roman" w:eastAsia="Times New Roman" w:hAnsi="Times New Roman" w:cs="Times New Roman"/>
+                <w:rFonts w:ascii="Times New Roman" w:hAnsi="Times New Roman" w:cs="Cambria"/>
                 <w:noProof/>
                 <w:szCs w:val="26"/>
               </w:rPr>
@@ -3188,7 +3174,7 @@
             </w:r>
             <w:r>
               <w:rPr>
-                <w:rFonts w:ascii="Times New Roman" w:eastAsia="Times New Roman" w:hAnsi="Times New Roman" w:cs="Times New Roman"/>
+                <w:rFonts w:ascii="Times New Roman" w:hAnsi="Times New Roman"/>
                 <w:noProof/>
                 <w:szCs w:val="26"/>
               </w:rPr>
@@ -3196,7 +3182,7 @@
             </w:r>
             <w:r>
               <w:rPr>
-                <w:rFonts w:ascii="Times New Roman" w:eastAsia="Times New Roman" w:hAnsi="Times New Roman" w:cs="Times New Roman"/>
+                <w:rFonts w:ascii="Times New Roman" w:hAnsi="Times New Roman" w:cs="Cambria"/>
                 <w:noProof/>
                 <w:szCs w:val="26"/>
               </w:rPr>
@@ -3204,7 +3190,7 @@
             </w:r>
             <w:r>
               <w:rPr>
-                <w:rFonts w:ascii="Times New Roman" w:eastAsia="Times New Roman" w:hAnsi="Times New Roman" w:cs="Times New Roman"/>
+                <w:rFonts w:ascii="Times New Roman" w:hAnsi="Times New Roman"/>
                 <w:noProof/>
                 <w:szCs w:val="26"/>
               </w:rPr>
@@ -3212,7 +3198,7 @@
             </w:r>
             <w:r>
               <w:rPr>
-                <w:rFonts w:ascii="Times New Roman" w:eastAsia="Times New Roman" w:hAnsi="Times New Roman" w:cs="Times New Roman"/>
+                <w:rFonts w:ascii="Times New Roman" w:hAnsi="Times New Roman" w:cs="Cambria"/>
                 <w:noProof/>
                 <w:szCs w:val="26"/>
               </w:rPr>
@@ -3220,7 +3206,7 @@
             </w:r>
             <w:r>
               <w:rPr>
-                <w:rFonts w:ascii="Times New Roman" w:eastAsia="Times New Roman" w:hAnsi="Times New Roman" w:cs="Times New Roman"/>
+                <w:rFonts w:ascii="Times New Roman" w:hAnsi="Times New Roman"/>
                 <w:noProof/>
                 <w:szCs w:val="26"/>
               </w:rPr>
@@ -3248,7 +3234,7 @@
             </w:pPr>
             <w:r>
               <w:rPr>
-                <w:rFonts w:ascii="Times New Roman" w:eastAsia="Times New Roman" w:hAnsi="Times New Roman" w:cs="Times New Roman"/>
+                <w:rFonts w:ascii="Times New Roman" w:hAnsi="Times New Roman"/>
                 <w:noProof/>
                 <w:szCs w:val="26"/>
               </w:rPr>
@@ -3256,7 +3242,7 @@
             </w:r>
             <w:r>
               <w:rPr>
-                <w:rFonts w:ascii="Times New Roman" w:eastAsia="Times New Roman" w:hAnsi="Times New Roman" w:cs="Times New Roman"/>
+                <w:rFonts w:ascii="Times New Roman" w:hAnsi="Times New Roman"/>
                 <w:noProof/>
                 <w:szCs w:val="26"/>
                 <w:lang w:val="vi-VN"/>
@@ -3282,7 +3268,7 @@
       </w:pPr>
       <w:r>
         <w:rPr>
-          <w:rFonts w:ascii="Times New Roman" w:eastAsia="Times New Roman" w:hAnsi="Times New Roman" w:cs="Times New Roman"/>
+          <w:rFonts w:ascii="Times New Roman" w:hAnsi="Times New Roman"/>
           <w:i/>
           <w:szCs w:val="26"/>
           <w:lang w:val="fr-FR"/>
@@ -3303,7 +3289,6 @@
       </w:pPr>
       <w:r>
         <w:rPr>
-          <w:rFonts w:ascii="Times New Roman" w:eastAsia="Times New Roman" w:hAnsi="Times New Roman" w:cs="Times New Roman"/>
           <w:sz w:val="26"/>
           <w:szCs w:val="26"/>
         </w:rPr>
@@ -3323,7 +3308,6 @@
       </w:pPr>
       <w:r>
         <w:rPr>
-          <w:rFonts w:ascii="Times New Roman" w:eastAsia="Times New Roman" w:hAnsi="Times New Roman" w:cs="Times New Roman"/>
           <w:sz w:val="26"/>
           <w:szCs w:val="26"/>
         </w:rPr>
@@ -3343,7 +3327,6 @@
       </w:pPr>
       <w:r>
         <w:rPr>
-          <w:rFonts w:ascii="Times New Roman" w:eastAsia="Times New Roman" w:hAnsi="Times New Roman" w:cs="Times New Roman"/>
           <w:sz w:val="26"/>
           <w:szCs w:val="26"/>
         </w:rPr>
@@ -3363,7 +3346,6 @@
       </w:pPr>
       <w:r>
         <w:rPr>
-          <w:rFonts w:ascii="Times New Roman" w:eastAsia="Times New Roman" w:hAnsi="Times New Roman" w:cs="Times New Roman"/>
           <w:sz w:val="26"/>
           <w:szCs w:val="26"/>
         </w:rPr>
@@ -3403,7 +3385,7 @@
             </w:pPr>
             <w:r>
               <w:rPr>
-                <w:rFonts w:ascii="Times New Roman" w:eastAsia="Times New Roman" w:hAnsi="Times New Roman" w:cs="Times New Roman"/>
+                <w:rFonts w:ascii="Times New Roman" w:hAnsi="Times New Roman"/>
                 <w:b/>
                 <w:szCs w:val="28"/>
               </w:rPr>
@@ -3422,7 +3404,7 @@
             </w:pPr>
             <w:r>
               <w:rPr>
-                <w:rFonts w:ascii="Times New Roman" w:eastAsia="Times New Roman" w:hAnsi="Times New Roman" w:cs="Times New Roman"/>
+                <w:rFonts w:ascii="Times New Roman" w:hAnsi="Times New Roman"/>
                 <w:szCs w:val="28"/>
               </w:rPr>
               <w:t xml:space="preserve"> </w:t>
@@ -3456,7 +3438,7 @@
             </w:pPr>
             <w:r>
               <w:rPr>
-                <w:rFonts w:ascii="Times New Roman" w:eastAsia="Times New Roman" w:hAnsi="Times New Roman" w:cs="Times New Roman"/>
+                <w:rFonts w:ascii="Times New Roman" w:hAnsi="Times New Roman"/>
                 <w:b/>
                 <w:szCs w:val="28"/>
               </w:rPr>
@@ -3475,7 +3457,7 @@
             </w:pPr>
             <w:r>
               <w:rPr>
-                <w:rFonts w:ascii="Times New Roman" w:eastAsia="Times New Roman" w:hAnsi="Times New Roman" w:cs="Times New Roman"/>
+                <w:rFonts w:ascii="Times New Roman" w:hAnsi="Times New Roman"/>
                 <w:b/>
                 <w:szCs w:val="28"/>
               </w:rPr>
@@ -3572,7 +3554,7 @@
             </w:pPr>
             <w:r>
               <w:rPr>
-                <w:rFonts w:ascii="Times New Roman" w:eastAsia="Times New Roman" w:hAnsi="Times New Roman" w:cs="Times New Roman"/>
+                <w:rFonts w:ascii="Times New Roman" w:hAnsi="Times New Roman"/>
                 <w:b/>
               </w:rPr>
               <w:t>{{OWNER_NAME}}</w:t>
@@ -3597,7 +3579,7 @@
             </w:pPr>
             <w:r>
               <w:rPr>
-                <w:rFonts w:ascii="Times New Roman" w:eastAsia="Times New Roman" w:hAnsi="Times New Roman" w:cs="Times New Roman"/>
+                <w:rFonts w:ascii="Times New Roman" w:hAnsi="Times New Roman"/>
                 <w:b/>
                 <w:bCs/>
                 <w:iCs/>
@@ -3642,7 +3624,7 @@
             </w:pPr>
             <w:r>
               <w:rPr>
-                <w:rFonts w:ascii="Times New Roman" w:eastAsia="Times New Roman" w:hAnsi="Times New Roman" w:cs="Times New Roman"/>
+                <w:rFonts w:ascii="Times New Roman" w:hAnsi="Times New Roman"/>
                 <w:szCs w:val="28"/>
                 <w:lang w:val="vi-VN"/>
               </w:rPr>
@@ -3664,7 +3646,7 @@
             </w:pPr>
             <w:r>
               <w:rPr>
-                <w:rFonts w:ascii="Times New Roman" w:eastAsia="Times New Roman" w:hAnsi="Times New Roman" w:cs="Times New Roman"/>
+                <w:rFonts w:ascii="Times New Roman" w:hAnsi="Times New Roman"/>
                 <w:b/>
                 <w:szCs w:val="28"/>
               </w:rPr>
@@ -3695,7 +3677,7 @@
             </w:pPr>
             <w:r>
               <w:rPr>
-                <w:rFonts w:ascii="Times New Roman" w:eastAsia="Times New Roman" w:hAnsi="Times New Roman" w:cs="Times New Roman"/>
+                <w:rFonts w:ascii="Times New Roman" w:hAnsi="Times New Roman"/>
                 <w:b/>
                 <w:bCs/>
                 <w:szCs w:val="28"/>
@@ -3795,7 +3777,7 @@
             </w:r>
             <w:r>
               <w:rPr>
-                <w:rFonts w:ascii="Times New Roman" w:eastAsia="Times New Roman" w:hAnsi="Times New Roman" w:cs="Times New Roman"/>
+                <w:rFonts w:ascii="Times New Roman" w:hAnsi="Times New Roman"/>
                 <w:b/>
                 <w:bCs/>
                 <w:szCs w:val="28"/>
@@ -3937,7 +3919,7 @@
       </w:pPr>
       <w:r>
         <w:rPr>
-          <w:rFonts w:ascii="Times New Roman" w:eastAsia="Times New Roman" w:hAnsi="Times New Roman" w:cs="Times New Roman"/>
+          <w:rFonts w:ascii="Times New Roman" w:hAnsi="Times New Roman" w:cs="Times New Roman"/>
           <w:b/>
           <w:bCs/>
           <w:color w:val="auto"/>
@@ -3968,7 +3950,7 @@
       </w:pPr>
       <w:r>
         <w:rPr>
-          <w:rFonts w:ascii="Times New Roman" w:eastAsia="Times New Roman" w:hAnsi="Times New Roman" w:cs="Times New Roman"/>
+          <w:rFonts w:ascii="Times New Roman" w:hAnsi="Times New Roman"/>
           <w:b/>
           <w:bCs/>
           <w:szCs w:val="26"/>
@@ -3977,7 +3959,7 @@
       </w:r>
       <w:r>
         <w:rPr>
-          <w:rFonts w:ascii="Times New Roman" w:eastAsia="Times New Roman" w:hAnsi="Times New Roman" w:cs="Times New Roman"/>
+          <w:rFonts w:ascii="Times New Roman" w:hAnsi="Times New Roman" w:eastAsiaTheme="majorEastAsia"/>
           <w:szCs w:val="26"/>
         </w:rPr>
         <w:t xml:space="preserve"> </w:t>
@@ -3985,7 +3967,7 @@
       <w:r>
         <w:rPr>
           <w:rStyle w:val="Strong"/>
-          <w:rFonts w:ascii="Times New Roman" w:eastAsia="Times New Roman" w:hAnsi="Times New Roman" w:cs="Times New Roman"/>
+          <w:rFonts w:ascii="Times New Roman" w:hAnsi="Times New Roman"/>
           <w:szCs w:val="26"/>
         </w:rPr>
         <w:t>{{SITE_ID}}</w:t>
@@ -4009,16 +3991,16 @@
       </w:pPr>
       <w:r>
         <w:rPr>
-          <w:rFonts w:ascii="Times New Roman" w:eastAsia="Times New Roman" w:hAnsi="Times New Roman" w:cs="Times New Roman"/>
+          <w:rFonts w:ascii="Times New Roman" w:hAnsi="Times New Roman"/>
           <w:b/>
           <w:bCs/>
           <w:szCs w:val="26"/>
         </w:rPr>
-        <w:t xml:space="preserve">Địa chỉ trạm: {{ADDRESS}} </w:t>
-      </w:r>
-      <w:r>
-        <w:rPr>
-          <w:rFonts w:ascii="Times New Roman" w:eastAsia="Times New Roman" w:hAnsi="Times New Roman" w:cs="Times New Roman"/>
+        <w:t xml:space="preserve">Địa chỉ trạm: {{ADDRESS_OLD}} </w:t>
+      </w:r>
+      <w:r>
+        <w:rPr>
+          <w:rFonts w:ascii="Times New Roman" w:hAnsi="Times New Roman"/>
           <w:b/>
           <w:bCs/>
           <w:szCs w:val="26"/>
@@ -4045,7 +4027,7 @@
       </w:pPr>
       <w:r>
         <w:rPr>
-          <w:rFonts w:ascii="Times New Roman" w:eastAsia="Times New Roman" w:hAnsi="Times New Roman" w:cs="Times New Roman"/>
+          <w:rFonts w:ascii="Times New Roman" w:hAnsi="Times New Roman"/>
           <w:b/>
           <w:bCs/>
           <w:szCs w:val="26"/>
@@ -4069,7 +4051,7 @@
       <w:bookmarkStart w:name="_Hlk76390970" w:id="2"/>
       <w:r>
         <w:rPr>
-          <w:rFonts w:ascii="Times New Roman" w:eastAsia="Times New Roman" w:hAnsi="Times New Roman" w:cs="Times New Roman"/>
+          <w:rFonts w:ascii="Times New Roman" w:hAnsi="Times New Roman"/>
           <w:b/>
           <w:bCs/>
           <w:szCs w:val="26"/>
@@ -4080,7 +4062,7 @@
       <w:bookmarkEnd w:id="2"/>
       <w:r>
         <w:rPr>
-          <w:rFonts w:ascii="Times New Roman" w:eastAsia="Times New Roman" w:hAnsi="Times New Roman" w:cs="Times New Roman"/>
+          <w:rFonts w:ascii="Times New Roman" w:hAnsi="Times New Roman" w:eastAsiaTheme="minorEastAsia"/>
           <w:bCs/>
           <w:i/>
           <w:szCs w:val="26"/>
@@ -4090,7 +4072,7 @@
       </w:r>
       <w:r>
         <w:rPr>
-          <w:rFonts w:ascii="Times New Roman" w:eastAsia="Times New Roman" w:hAnsi="Times New Roman" w:cs="Times New Roman"/>
+          <w:rFonts w:ascii="Times New Roman" w:hAnsi="Times New Roman" w:eastAsiaTheme="minorEastAsia"/>
           <w:b/>
           <w:i/>
           <w:szCs w:val="26"/>
@@ -4113,7 +4095,7 @@
       </w:pPr>
       <w:r>
         <w:rPr>
-          <w:rFonts w:ascii="Times New Roman" w:eastAsia="Times New Roman" w:hAnsi="Times New Roman" w:cs="Times New Roman"/>
+          <w:rFonts w:ascii="Times New Roman" w:hAnsi="Times New Roman"/>
           <w:szCs w:val="26"/>
           <w:lang w:val="vi-VN"/>
         </w:rPr>
@@ -4134,7 +4116,7 @@
       </w:pPr>
       <w:r>
         <w:rPr>
-          <w:rFonts w:ascii="Times New Roman" w:eastAsia="Times New Roman" w:hAnsi="Times New Roman" w:cs="Times New Roman"/>
+          <w:rFonts w:ascii="Times New Roman" w:hAnsi="Times New Roman"/>
           <w:szCs w:val="26"/>
           <w:lang w:val="vi-VN"/>
         </w:rPr>
@@ -4156,7 +4138,7 @@
       </w:pPr>
       <w:r>
         <w:rPr>
-          <w:rFonts w:ascii="Times New Roman" w:eastAsia="Times New Roman" w:hAnsi="Times New Roman" w:cs="Times New Roman"/>
+          <w:rFonts w:ascii="Times New Roman" w:hAnsi="Times New Roman"/>
           <w:b/>
           <w:szCs w:val="26"/>
           <w:lang w:val="vi-VN"/>
@@ -4166,7 +4148,7 @@
       <w:r>
         <w:rPr>
           <w:rStyle w:val="Strong"/>
-          <w:rFonts w:ascii="Times New Roman" w:eastAsia="Times New Roman" w:hAnsi="Times New Roman" w:cs="Times New Roman"/>
+          <w:rFonts w:ascii="Times New Roman" w:hAnsi="Times New Roman"/>
           <w:bCs w:val="0"/>
           <w:szCs w:val="26"/>
           <w:lang w:val="vi-VN"/>
@@ -4175,7 +4157,7 @@
       </w:r>
       <w:r>
         <w:rPr>
-          <w:rFonts w:ascii="Times New Roman" w:eastAsia="Times New Roman" w:hAnsi="Times New Roman" w:cs="Times New Roman"/>
+          <w:rFonts w:ascii="Times New Roman" w:hAnsi="Times New Roman"/>
           <w:b/>
           <w:szCs w:val="26"/>
           <w:lang w:val="vi-VN"/>
@@ -4185,7 +4167,7 @@
       <w:r>
         <w:rPr>
           <w:rStyle w:val="Emphasis"/>
-          <w:rFonts w:ascii="Times New Roman" w:eastAsia="Times New Roman" w:hAnsi="Times New Roman" w:cs="Times New Roman"/>
+          <w:rFonts w:ascii="Times New Roman" w:hAnsi="Times New Roman"/>
           <w:b/>
           <w:i w:val="0"/>
           <w:iCs w:val="0"/>
@@ -4195,7 +4177,7 @@
       </w:r>
       <w:r>
         <w:rPr>
-          <w:rFonts w:ascii="Times New Roman" w:eastAsia="Times New Roman" w:hAnsi="Times New Roman" w:cs="Times New Roman"/>
+          <w:rFonts w:ascii="Times New Roman" w:hAnsi="Times New Roman"/>
           <w:b/>
           <w:szCs w:val="26"/>
           <w:lang w:val="vi-VN"/>
@@ -4218,7 +4200,7 @@
       </w:pPr>
       <w:r>
         <w:rPr>
-          <w:rFonts w:ascii="Times New Roman" w:eastAsia="Times New Roman" w:hAnsi="Times New Roman" w:cs="Times New Roman"/>
+          <w:rFonts w:ascii="Times New Roman" w:hAnsi="Times New Roman"/>
           <w:szCs w:val="26"/>
           <w:lang w:val="vi-VN"/>
         </w:rPr>
@@ -4226,14 +4208,14 @@
       </w:r>
       <w:r>
         <w:rPr>
-          <w:rFonts w:ascii="Times New Roman" w:eastAsia="Times New Roman" w:hAnsi="Times New Roman" w:cs="Times New Roman"/>
+          <w:rFonts w:ascii="Times New Roman" w:hAnsi="Times New Roman"/>
           <w:szCs w:val="26"/>
         </w:rPr>
         <w:t xml:space="preserve"> 2026</w:t>
       </w:r>
       <w:r>
         <w:rPr>
-          <w:rFonts w:ascii="Times New Roman" w:eastAsia="Times New Roman" w:hAnsi="Times New Roman" w:cs="Times New Roman"/>
+          <w:rFonts w:ascii="Times New Roman" w:hAnsi="Times New Roman"/>
           <w:szCs w:val="26"/>
           <w:lang w:val="vi-VN"/>
         </w:rPr>
@@ -4242,7 +4224,7 @@
       <w:r>
         <w:rPr>
           <w:rStyle w:val="Strong"/>
-          <w:rFonts w:ascii="Times New Roman" w:eastAsia="Times New Roman" w:hAnsi="Times New Roman" w:cs="Times New Roman"/>
+          <w:rFonts w:ascii="Times New Roman" w:hAnsi="Times New Roman"/>
           <w:b w:val="0"/>
           <w:bCs w:val="0"/>
           <w:szCs w:val="26"/>
@@ -4252,7 +4234,7 @@
       </w:r>
       <w:r>
         <w:rPr>
-          <w:rFonts w:ascii="Times New Roman" w:eastAsia="Times New Roman" w:hAnsi="Times New Roman" w:cs="Times New Roman"/>
+          <w:rFonts w:ascii="Times New Roman" w:hAnsi="Times New Roman"/>
           <w:szCs w:val="26"/>
           <w:lang w:val="vi-VN"/>
         </w:rPr>
@@ -4260,15 +4242,15 @@
       </w:r>
       <w:r>
         <w:rPr>
-          <w:rFonts w:ascii="Times New Roman" w:eastAsia="Times New Roman" w:hAnsi="Times New Roman" w:cs="Times New Roman"/>
-          <w:szCs w:val="26"/>
-          <w:lang w:val="vi-VN"/>
-        </w:rPr>
-        <w:t>Đồng Nai</w:t>
-      </w:r>
-      <w:r>
-        <w:rPr>
-          <w:rFonts w:ascii="Times New Roman" w:eastAsia="Times New Roman" w:hAnsi="Times New Roman" w:cs="Times New Roman"/>
+          <w:rFonts w:ascii="Times New Roman" w:hAnsi="Times New Roman"/>
+          <w:szCs w:val="26"/>
+          <w:lang w:val="vi-VN"/>
+        </w:rPr>
+        <w:t>Tp Đồng Nai</w:t>
+      </w:r>
+      <w:r>
+        <w:rPr>
+          <w:rFonts w:ascii="Times New Roman" w:hAnsi="Times New Roman"/>
           <w:szCs w:val="26"/>
           <w:lang w:val="vi-VN"/>
         </w:rPr>
@@ -4292,7 +4274,7 @@
       </w:pPr>
       <w:r>
         <w:rPr>
-          <w:rFonts w:ascii="Times New Roman" w:eastAsia="Times New Roman" w:hAnsi="Times New Roman" w:cs="Times New Roman"/>
+          <w:rFonts w:ascii="Times New Roman" w:hAnsi="Times New Roman"/>
           <w:b/>
           <w:bCs/>
           <w:iCs/>
@@ -4315,7 +4297,7 @@
       </w:pPr>
       <w:r>
         <w:rPr>
-          <w:rFonts w:ascii="Times New Roman" w:eastAsia="Times New Roman" w:hAnsi="Times New Roman" w:cs="Times New Roman"/>
+          <w:rFonts w:ascii="Times New Roman" w:hAnsi="Times New Roman"/>
           <w:b/>
           <w:szCs w:val="26"/>
           <w:lang w:val="vi-VN"/>
@@ -4324,7 +4306,7 @@
       </w:r>
       <w:r>
         <w:rPr>
-          <w:rFonts w:ascii="Times New Roman" w:eastAsia="Times New Roman" w:hAnsi="Times New Roman" w:cs="Times New Roman"/>
+          <w:rFonts w:ascii="Times New Roman" w:hAnsi="Times New Roman"/>
           <w:b/>
           <w:bCs/>
           <w:szCs w:val="26"/>
@@ -4334,7 +4316,7 @@
       </w:r>
       <w:r>
         <w:rPr>
-          <w:rFonts w:ascii="Times New Roman" w:eastAsia="Times New Roman" w:hAnsi="Times New Roman" w:cs="Times New Roman"/>
+          <w:rFonts w:ascii="Times New Roman" w:hAnsi="Times New Roman"/>
           <w:b/>
           <w:szCs w:val="26"/>
         </w:rPr>
@@ -4342,7 +4324,7 @@
       </w:r>
       <w:r>
         <w:rPr>
-          <w:rFonts w:ascii="Times New Roman" w:eastAsia="Times New Roman" w:hAnsi="Times New Roman" w:cs="Times New Roman"/>
+          <w:rFonts w:ascii="Times New Roman" w:hAnsi="Times New Roman"/>
           <w:b/>
           <w:i/>
           <w:szCs w:val="26"/>
@@ -4352,7 +4334,7 @@
       </w:r>
       <w:r>
         <w:rPr>
-          <w:rFonts w:ascii="Times New Roman" w:eastAsia="Times New Roman" w:hAnsi="Times New Roman" w:cs="Times New Roman"/>
+          <w:rFonts w:ascii="Times New Roman" w:hAnsi="Times New Roman"/>
           <w:b/>
           <w:i/>
           <w:szCs w:val="26"/>
@@ -4362,7 +4344,7 @@
       </w:r>
       <w:r>
         <w:rPr>
-          <w:rFonts w:ascii="Times New Roman" w:eastAsia="Times New Roman" w:hAnsi="Times New Roman" w:cs="Times New Roman"/>
+          <w:rFonts w:ascii="Times New Roman" w:hAnsi="Times New Roman"/>
           <w:b/>
           <w:szCs w:val="26"/>
           <w:lang w:val="vi-VN"/>
@@ -4390,7 +4372,7 @@
       </w:pPr>
       <w:r>
         <w:rPr>
-          <w:rFonts w:ascii="Times New Roman" w:eastAsia="Times New Roman" w:hAnsi="Times New Roman" w:cs="Times New Roman"/>
+          <w:rFonts w:ascii="Times New Roman" w:hAnsi="Times New Roman"/>
           <w:noProof/>
           <w:szCs w:val="26"/>
         </w:rPr>
@@ -4398,7 +4380,7 @@
       </w:r>
       <w:r>
         <w:rPr>
-          <w:rFonts w:ascii="Times New Roman" w:eastAsia="Times New Roman" w:hAnsi="Times New Roman" w:cs="Times New Roman"/>
+          <w:rFonts w:ascii="Times New Roman" w:hAnsi="Times New Roman"/>
           <w:noProof/>
           <w:szCs w:val="26"/>
         </w:rPr>
@@ -4426,18 +4408,18 @@
       </w:pPr>
       <w:r>
         <w:rPr>
-          <w:rFonts w:ascii="Times New Roman" w:eastAsia="Times New Roman" w:hAnsi="Times New Roman" w:cs="Times New Roman"/>
+          <w:rFonts w:ascii="Times New Roman" w:hAnsi="Times New Roman"/>
           <w:szCs w:val="26"/>
         </w:rPr>
         <w:t xml:space="preserve">Địa chỉ trạm </w:t>
       </w:r>
       <w:r>
         <w:rPr>
-          <w:rFonts w:ascii="Times New Roman" w:eastAsia="Times New Roman" w:hAnsi="Times New Roman" w:cs="Times New Roman"/>
+          <w:rFonts w:ascii="Times New Roman" w:hAnsi="Times New Roman"/>
           <w:szCs w:val="26"/>
         </w:rPr>
         <w:tab/>
-        <w:t>:{{ADDRESS}}</w:t>
+        <w:t>:{{ADDRESS_OLD}} ({{ADDRESS_NEW}})</w:t>
       </w:r>
     </w:p>
     <w:p>
@@ -4459,14 +4441,14 @@
       </w:pPr>
       <w:r>
         <w:rPr>
-          <w:rFonts w:ascii="Times New Roman" w:eastAsia="Times New Roman" w:hAnsi="Times New Roman" w:cs="Times New Roman"/>
+          <w:rFonts w:ascii="Times New Roman" w:hAnsi="Times New Roman"/>
           <w:szCs w:val="26"/>
         </w:rPr>
         <w:t>Địa chỉ liên hệ</w:t>
       </w:r>
       <w:r>
         <w:rPr>
-          <w:rFonts w:ascii="Times New Roman" w:eastAsia="Times New Roman" w:hAnsi="Times New Roman" w:cs="Times New Roman"/>
+          <w:rFonts w:ascii="Times New Roman" w:hAnsi="Times New Roman"/>
           <w:szCs w:val="26"/>
         </w:rPr>
         <w:tab/>
@@ -4492,14 +4474,14 @@
       </w:pPr>
       <w:r>
         <w:rPr>
-          <w:rFonts w:ascii="Times New Roman" w:eastAsia="Times New Roman" w:hAnsi="Times New Roman" w:cs="Times New Roman"/>
+          <w:rFonts w:ascii="Times New Roman" w:hAnsi="Times New Roman"/>
           <w:szCs w:val="26"/>
         </w:rPr>
         <w:t xml:space="preserve">Điện thọai </w:t>
       </w:r>
       <w:r>
         <w:rPr>
-          <w:rFonts w:ascii="Times New Roman" w:eastAsia="Times New Roman" w:hAnsi="Times New Roman" w:cs="Times New Roman"/>
+          <w:rFonts w:ascii="Times New Roman" w:hAnsi="Times New Roman"/>
           <w:szCs w:val="26"/>
         </w:rPr>
         <w:tab/>
@@ -4525,14 +4507,14 @@
       </w:pPr>
       <w:r>
         <w:rPr>
-          <w:rFonts w:ascii="Times New Roman" w:eastAsia="Times New Roman" w:hAnsi="Times New Roman" w:cs="Times New Roman"/>
+          <w:rFonts w:ascii="Times New Roman" w:hAnsi="Times New Roman"/>
           <w:szCs w:val="26"/>
         </w:rPr>
         <w:t>Chủ tài khoản</w:t>
       </w:r>
       <w:r>
         <w:rPr>
-          <w:rFonts w:ascii="Times New Roman" w:eastAsia="Times New Roman" w:hAnsi="Times New Roman" w:cs="Times New Roman"/>
+          <w:rFonts w:ascii="Times New Roman" w:hAnsi="Times New Roman"/>
           <w:szCs w:val="26"/>
         </w:rPr>
         <w:tab/>
@@ -4558,14 +4540,14 @@
       </w:pPr>
       <w:r>
         <w:rPr>
-          <w:rFonts w:ascii="Times New Roman" w:eastAsia="Times New Roman" w:hAnsi="Times New Roman" w:cs="Times New Roman"/>
+          <w:rFonts w:ascii="Times New Roman" w:hAnsi="Times New Roman"/>
           <w:szCs w:val="26"/>
         </w:rPr>
         <w:t>Số tài khoản</w:t>
       </w:r>
       <w:r>
         <w:rPr>
-          <w:rFonts w:ascii="Times New Roman" w:eastAsia="Times New Roman" w:hAnsi="Times New Roman" w:cs="Times New Roman"/>
+          <w:rFonts w:ascii="Times New Roman" w:hAnsi="Times New Roman"/>
           <w:szCs w:val="26"/>
         </w:rPr>
         <w:tab/>
@@ -4592,14 +4574,14 @@
       </w:pPr>
       <w:r>
         <w:rPr>
-          <w:rFonts w:ascii="Times New Roman" w:eastAsia="Times New Roman" w:hAnsi="Times New Roman" w:cs="Times New Roman"/>
+          <w:rFonts w:ascii="Times New Roman" w:hAnsi="Times New Roman"/>
           <w:szCs w:val="26"/>
         </w:rPr>
         <w:t>Ngân hàng</w:t>
       </w:r>
       <w:r>
         <w:rPr>
-          <w:rFonts w:ascii="Times New Roman" w:eastAsia="Times New Roman" w:hAnsi="Times New Roman" w:cs="Times New Roman"/>
+          <w:rFonts w:ascii="Times New Roman" w:hAnsi="Times New Roman"/>
           <w:szCs w:val="26"/>
         </w:rPr>
         <w:tab/>
@@ -4621,7 +4603,7 @@
       </w:pPr>
       <w:r>
         <w:rPr>
-          <w:rFonts w:ascii="Times New Roman" w:eastAsia="Times New Roman" w:hAnsi="Times New Roman" w:cs="Times New Roman"/>
+          <w:rFonts w:ascii="Times New Roman" w:hAnsi="Times New Roman"/>
           <w:b/>
           <w:szCs w:val="26"/>
         </w:rPr>
@@ -4629,7 +4611,7 @@
       </w:r>
       <w:r>
         <w:rPr>
-          <w:rFonts w:ascii="Times New Roman" w:eastAsia="Times New Roman" w:hAnsi="Times New Roman" w:cs="Times New Roman"/>
+          <w:rFonts w:ascii="Times New Roman" w:hAnsi="Times New Roman"/>
           <w:b/>
           <w:bCs/>
           <w:szCs w:val="26"/>
@@ -4639,14 +4621,14 @@
       <w:r>
         <w:rPr>
           <w:rStyle w:val="Strong"/>
-          <w:rFonts w:ascii="Times New Roman" w:eastAsia="Times New Roman" w:hAnsi="Times New Roman" w:cs="Times New Roman"/>
+          <w:rFonts w:ascii="Times New Roman" w:hAnsi="Times New Roman"/>
           <w:szCs w:val="26"/>
         </w:rPr>
         <w:t>MOBIFONE ĐỒNG NAI – Chi nhánh Tổng Công ty Viễn Thông MobiFone</w:t>
       </w:r>
       <w:r>
         <w:rPr>
-          <w:rFonts w:ascii="Times New Roman" w:eastAsia="Times New Roman" w:hAnsi="Times New Roman" w:cs="Times New Roman"/>
+          <w:rFonts w:ascii="Times New Roman" w:hAnsi="Times New Roman"/>
           <w:b/>
           <w:i/>
           <w:szCs w:val="26"/>
@@ -4655,7 +4637,7 @@
       </w:r>
       <w:r>
         <w:rPr>
-          <w:rFonts w:ascii="Times New Roman" w:eastAsia="Times New Roman" w:hAnsi="Times New Roman" w:cs="Times New Roman"/>
+          <w:rFonts w:ascii="Times New Roman" w:hAnsi="Times New Roman"/>
           <w:b/>
           <w:szCs w:val="26"/>
         </w:rPr>
@@ -4683,7 +4665,7 @@
       </w:pPr>
       <w:r>
         <w:rPr>
-          <w:rFonts w:ascii="Times New Roman" w:eastAsia="Times New Roman" w:hAnsi="Times New Roman" w:cs="Times New Roman"/>
+          <w:rFonts w:ascii="Times New Roman" w:hAnsi="Times New Roman"/>
           <w:noProof/>
           <w:szCs w:val="26"/>
         </w:rPr>
@@ -4691,7 +4673,7 @@
       </w:r>
       <w:r>
         <w:rPr>
-          <w:rFonts w:ascii="Times New Roman" w:eastAsia="Times New Roman" w:hAnsi="Times New Roman" w:cs="Times New Roman"/>
+          <w:rFonts w:ascii="Times New Roman" w:hAnsi="Times New Roman"/>
           <w:noProof/>
           <w:szCs w:val="26"/>
         </w:rPr>
@@ -4700,7 +4682,7 @@
       </w:r>
       <w:r>
         <w:rPr>
-          <w:rFonts w:ascii="Times New Roman" w:eastAsia="Times New Roman" w:hAnsi="Times New Roman" w:cs="Times New Roman"/>
+          <w:rFonts w:ascii="Times New Roman" w:hAnsi="Times New Roman"/>
           <w:b/>
           <w:bCs/>
           <w:szCs w:val="26"/>
@@ -4710,7 +4692,7 @@
       <w:r>
         <w:rPr>
           <w:rStyle w:val="Emphasis"/>
-          <w:rFonts w:ascii="Times New Roman" w:eastAsia="Times New Roman" w:hAnsi="Times New Roman" w:cs="Times New Roman"/>
+          <w:rFonts w:ascii="Times New Roman" w:hAnsi="Times New Roman" w:eastAsiaTheme="majorEastAsia"/>
           <w:b/>
           <w:bCs/>
           <w:i w:val="0"/>
@@ -4742,7 +4724,7 @@
       </w:pPr>
       <w:r>
         <w:rPr>
-          <w:rFonts w:ascii="Times New Roman" w:eastAsia="Times New Roman" w:hAnsi="Times New Roman" w:cs="Times New Roman"/>
+          <w:rFonts w:ascii="Times New Roman" w:hAnsi="Times New Roman"/>
           <w:noProof/>
           <w:szCs w:val="26"/>
         </w:rPr>
@@ -4750,7 +4732,7 @@
       </w:r>
       <w:r>
         <w:rPr>
-          <w:rFonts w:ascii="Times New Roman" w:eastAsia="Times New Roman" w:hAnsi="Times New Roman" w:cs="Times New Roman"/>
+          <w:rFonts w:ascii="Times New Roman" w:hAnsi="Times New Roman"/>
           <w:noProof/>
           <w:szCs w:val="26"/>
         </w:rPr>
@@ -4780,7 +4762,7 @@
       </w:pPr>
       <w:r>
         <w:rPr>
-          <w:rFonts w:ascii="Times New Roman" w:eastAsia="Times New Roman" w:hAnsi="Times New Roman" w:cs="Times New Roman"/>
+          <w:rFonts w:ascii="Times New Roman" w:hAnsi="Times New Roman"/>
           <w:noProof/>
           <w:szCs w:val="26"/>
           <w:lang w:val="fr-FR"/>
@@ -4789,7 +4771,7 @@
       </w:r>
       <w:r>
         <w:rPr>
-          <w:rFonts w:ascii="Times New Roman" w:eastAsia="Times New Roman" w:hAnsi="Times New Roman" w:cs="Times New Roman"/>
+          <w:rFonts w:ascii="Times New Roman" w:hAnsi="Times New Roman"/>
           <w:noProof/>
           <w:szCs w:val="26"/>
           <w:lang w:val="fr-FR"/>
@@ -4799,7 +4781,7 @@
       </w:r>
       <w:r>
         <w:rPr>
-          <w:rFonts w:ascii="Times New Roman" w:eastAsia="Times New Roman" w:hAnsi="Times New Roman" w:cs="Times New Roman"/>
+          <w:rFonts w:ascii="Times New Roman" w:hAnsi="Times New Roman"/>
           <w:noProof/>
           <w:szCs w:val="26"/>
           <w:lang w:val="vi-VN"/>
@@ -4808,16 +4790,16 @@
       </w:r>
       <w:r>
         <w:rPr>
-          <w:rFonts w:ascii="Times New Roman" w:eastAsia="Times New Roman" w:hAnsi="Times New Roman" w:cs="Times New Roman"/>
+          <w:rFonts w:ascii="Times New Roman" w:hAnsi="Times New Roman"/>
           <w:noProof/>
           <w:szCs w:val="26"/>
           <w:lang w:val="vi-VN"/>
         </w:rPr>
-        <w:t>Đồng Nai</w:t>
-      </w:r>
-      <w:r>
-        <w:rPr>
-          <w:rFonts w:ascii="Times New Roman" w:eastAsia="Times New Roman" w:hAnsi="Times New Roman" w:cs="Times New Roman"/>
+        <w:t>Tp Đồng Nai</w:t>
+      </w:r>
+      <w:r>
+        <w:rPr>
+          <w:rFonts w:ascii="Times New Roman" w:hAnsi="Times New Roman"/>
           <w:szCs w:val="26"/>
           <w:lang w:val="vi-VN"/>
         </w:rPr>
@@ -4846,7 +4828,7 @@
       </w:pPr>
       <w:r>
         <w:rPr>
-          <w:rFonts w:ascii="Times New Roman" w:eastAsia="Times New Roman" w:hAnsi="Times New Roman" w:cs="Times New Roman"/>
+          <w:rFonts w:ascii="Times New Roman" w:hAnsi="Times New Roman"/>
           <w:noProof/>
           <w:szCs w:val="26"/>
         </w:rPr>
@@ -4854,7 +4836,7 @@
       </w:r>
       <w:r>
         <w:rPr>
-          <w:rFonts w:ascii="Times New Roman" w:eastAsia="Times New Roman" w:hAnsi="Times New Roman" w:cs="Times New Roman"/>
+          <w:rFonts w:ascii="Times New Roman" w:hAnsi="Times New Roman"/>
           <w:noProof/>
           <w:szCs w:val="26"/>
         </w:rPr>
@@ -4863,7 +4845,7 @@
       </w:r>
       <w:r>
         <w:rPr>
-          <w:rFonts w:ascii="Times New Roman" w:eastAsia="Times New Roman" w:hAnsi="Times New Roman" w:cs="Times New Roman"/>
+          <w:rFonts w:ascii="Times New Roman" w:hAnsi="Times New Roman"/>
           <w:noProof/>
           <w:szCs w:val="26"/>
           <w:lang w:val="vi-VN"/>
@@ -4893,7 +4875,7 @@
       </w:pPr>
       <w:r>
         <w:rPr>
-          <w:rFonts w:ascii="Times New Roman" w:eastAsia="Times New Roman" w:hAnsi="Times New Roman" w:cs="Times New Roman"/>
+          <w:rFonts w:ascii="Times New Roman" w:hAnsi="Times New Roman"/>
           <w:noProof/>
           <w:szCs w:val="26"/>
         </w:rPr>
@@ -4901,7 +4883,7 @@
       </w:r>
       <w:r>
         <w:rPr>
-          <w:rFonts w:ascii="Times New Roman" w:eastAsia="Times New Roman" w:hAnsi="Times New Roman" w:cs="Times New Roman"/>
+          <w:rFonts w:ascii="Times New Roman" w:hAnsi="Times New Roman"/>
           <w:noProof/>
           <w:szCs w:val="26"/>
           <w:lang w:val="vi-VN"/>
@@ -4910,7 +4892,7 @@
       </w:r>
       <w:r>
         <w:rPr>
-          <w:rFonts w:ascii="Times New Roman" w:eastAsia="Times New Roman" w:hAnsi="Times New Roman" w:cs="Times New Roman"/>
+          <w:rFonts w:ascii="Times New Roman" w:hAnsi="Times New Roman"/>
           <w:noProof/>
           <w:szCs w:val="26"/>
         </w:rPr>
@@ -4918,7 +4900,7 @@
       </w:r>
       <w:r>
         <w:rPr>
-          <w:rFonts w:ascii="Times New Roman" w:eastAsia="Times New Roman" w:hAnsi="Times New Roman" w:cs="Times New Roman"/>
+          <w:rFonts w:ascii="Times New Roman" w:hAnsi="Times New Roman"/>
           <w:noProof/>
           <w:szCs w:val="26"/>
           <w:lang w:val="fr-FR"/>
@@ -4948,7 +4930,7 @@
       </w:pPr>
       <w:r>
         <w:rPr>
-          <w:rFonts w:ascii="Times New Roman" w:eastAsia="Times New Roman" w:hAnsi="Times New Roman" w:cs="Times New Roman"/>
+          <w:rFonts w:ascii="Times New Roman" w:hAnsi="Times New Roman"/>
           <w:noProof/>
           <w:szCs w:val="26"/>
         </w:rPr>
@@ -4956,7 +4938,7 @@
       </w:r>
       <w:r>
         <w:rPr>
-          <w:rFonts w:ascii="Times New Roman" w:eastAsia="Times New Roman" w:hAnsi="Times New Roman" w:cs="Times New Roman"/>
+          <w:rFonts w:ascii="Times New Roman" w:hAnsi="Times New Roman"/>
           <w:noProof/>
           <w:szCs w:val="26"/>
         </w:rPr>
@@ -4965,7 +4947,7 @@
       </w:r>
       <w:r>
         <w:rPr>
-          <w:rFonts w:ascii="Times New Roman" w:eastAsia="Times New Roman" w:hAnsi="Times New Roman" w:cs="Times New Roman"/>
+          <w:rFonts w:ascii="Times New Roman" w:hAnsi="Times New Roman"/>
           <w:noProof/>
           <w:szCs w:val="26"/>
           <w:lang w:val="vi-VN"/>
@@ -4988,7 +4970,7 @@
       </w:pPr>
       <w:r>
         <w:rPr>
-          <w:rFonts w:ascii="Times New Roman" w:eastAsia="Times New Roman" w:hAnsi="Times New Roman" w:cs="Times New Roman"/>
+          <w:rFonts w:ascii="Times New Roman" w:hAnsi="Times New Roman"/>
           <w:i/>
           <w:szCs w:val="26"/>
           <w:lang w:val="fr-FR"/>
@@ -5010,7 +4992,7 @@
       </w:pPr>
       <w:r>
         <w:rPr>
-          <w:rFonts w:ascii="Times New Roman" w:eastAsia="Times New Roman" w:hAnsi="Times New Roman" w:cs="Times New Roman"/>
+          <w:rFonts w:ascii="Times New Roman" w:hAnsi="Times New Roman"/>
           <w:iCs/>
           <w:szCs w:val="26"/>
           <w:lang w:val="da-DK"/>
@@ -5019,7 +5001,7 @@
       </w:r>
       <w:r>
         <w:rPr>
-          <w:rFonts w:ascii="Times New Roman" w:eastAsia="Times New Roman" w:hAnsi="Times New Roman" w:cs="Times New Roman"/>
+          <w:rFonts w:ascii="Times New Roman" w:hAnsi="Times New Roman"/>
           <w:szCs w:val="26"/>
           <w:lang w:val="fr-FR"/>
         </w:rPr>
@@ -5027,7 +5009,7 @@
       </w:r>
       <w:r>
         <w:rPr>
-          <w:rFonts w:ascii="Times New Roman" w:eastAsia="Times New Roman" w:hAnsi="Times New Roman" w:cs="Times New Roman"/>
+          <w:rFonts w:ascii="Times New Roman" w:hAnsi="Times New Roman"/>
           <w:iCs/>
           <w:szCs w:val="26"/>
           <w:lang w:val="da-DK"/>
@@ -5036,7 +5018,7 @@
       </w:r>
       <w:r>
         <w:rPr>
-          <w:rFonts w:ascii="Times New Roman" w:eastAsia="Times New Roman" w:hAnsi="Times New Roman" w:cs="Times New Roman"/>
+          <w:rFonts w:ascii="Times New Roman" w:hAnsi="Times New Roman"/>
           <w:bCs/>
           <w:szCs w:val="26"/>
           <w:lang w:val="fr-FR"/>
@@ -5045,7 +5027,7 @@
       </w:r>
       <w:r>
         <w:rPr>
-          <w:rFonts w:ascii="Times New Roman" w:eastAsia="Times New Roman" w:hAnsi="Times New Roman" w:cs="Times New Roman"/>
+          <w:rFonts w:ascii="Times New Roman" w:hAnsi="Times New Roman"/>
           <w:iCs/>
           <w:szCs w:val="26"/>
           <w:lang w:val="da-DK"/>
@@ -5068,7 +5050,7 @@
       </w:pPr>
       <w:r>
         <w:rPr>
-          <w:rFonts w:ascii="Times New Roman" w:eastAsia="Times New Roman" w:hAnsi="Times New Roman" w:cs="Times New Roman"/>
+          <w:rFonts w:ascii="Times New Roman" w:hAnsi="Times New Roman"/>
           <w:b/>
           <w:bCs/>
           <w:szCs w:val="26"/>
@@ -5079,7 +5061,7 @@
       </w:r>
       <w:r>
         <w:rPr>
-          <w:rFonts w:ascii="Times New Roman" w:eastAsia="Times New Roman" w:hAnsi="Times New Roman" w:cs="Times New Roman"/>
+          <w:rFonts w:ascii="Times New Roman" w:hAnsi="Times New Roman"/>
           <w:b/>
           <w:szCs w:val="26"/>
           <w:lang w:val="fr-FR"/>
@@ -5107,7 +5089,7 @@
       </w:pPr>
       <w:r>
         <w:rPr>
-          <w:rFonts w:ascii="Times New Roman" w:eastAsia="Times New Roman" w:hAnsi="Times New Roman" w:cs="Times New Roman"/>
+          <w:rFonts w:ascii="Times New Roman" w:hAnsi="Times New Roman"/>
           <w:b/>
           <w:szCs w:val="26"/>
         </w:rPr>
@@ -5128,7 +5110,7 @@
       </w:pPr>
       <w:r>
         <w:rPr>
-          <w:rFonts w:ascii="Times New Roman" w:eastAsia="Times New Roman" w:hAnsi="Times New Roman" w:cs="Times New Roman"/>
+          <w:rFonts w:ascii="Times New Roman" w:hAnsi="Times New Roman"/>
           <w:szCs w:val="26"/>
           <w:lang w:val="da-DK"/>
         </w:rPr>
@@ -5149,7 +5131,7 @@
       </w:pPr>
       <w:r>
         <w:rPr>
-          <w:rFonts w:ascii="Times New Roman" w:eastAsia="Times New Roman" w:hAnsi="Times New Roman" w:cs="Times New Roman"/>
+          <w:rFonts w:ascii="Times New Roman" w:hAnsi="Times New Roman"/>
           <w:szCs w:val="26"/>
           <w:lang w:val="da-DK"/>
         </w:rPr>
@@ -5170,7 +5152,7 @@
       </w:pPr>
       <w:r>
         <w:rPr>
-          <w:rFonts w:ascii="Times New Roman" w:eastAsia="Times New Roman" w:hAnsi="Times New Roman" w:cs="Times New Roman"/>
+          <w:rFonts w:ascii="Times New Roman" w:hAnsi="Times New Roman"/>
           <w:szCs w:val="26"/>
           <w:lang w:val="da-DK"/>
         </w:rPr>
@@ -5201,11 +5183,11 @@
       </w:pPr>
       <w:r>
         <w:rPr>
-          <w:rFonts w:ascii="Times New Roman" w:eastAsia="Times New Roman" w:hAnsi="Times New Roman" w:cs="Times New Roman"/>
+          <w:rFonts w:ascii="Times New Roman" w:hAnsi="Times New Roman"/>
           <w:szCs w:val="26"/>
           <w:lang w:val="da-DK"/>
         </w:rPr>
-        <w:t>{{ADDRESS}}</w:t>
+        <w:t>{{ADDRESS_OLD}}</w:t>
       </w:r>
     </w:p>
     <w:p>
@@ -5229,7 +5211,7 @@
       </w:pPr>
       <w:r>
         <w:rPr>
-          <w:rFonts w:ascii="Times New Roman" w:eastAsia="Times New Roman" w:hAnsi="Times New Roman" w:cs="Times New Roman"/>
+          <w:rFonts w:ascii="Times New Roman" w:hAnsi="Times New Roman"/>
           <w:szCs w:val="26"/>
           <w:lang w:val="da-DK"/>
         </w:rPr>
@@ -5238,7 +5220,7 @@
       <w:r>
         <w:rPr>
           <w:rStyle w:val="Emphasis"/>
-          <w:rFonts w:ascii="Times New Roman" w:eastAsia="Times New Roman" w:hAnsi="Times New Roman" w:cs="Times New Roman"/>
+          <w:rFonts w:ascii="Times New Roman" w:hAnsi="Times New Roman"/>
           <w:i w:val="0"/>
           <w:iCs w:val="0"/>
           <w:szCs w:val="26"/>
@@ -5262,7 +5244,7 @@
       </w:pPr>
       <w:r>
         <w:rPr>
-          <w:rFonts w:ascii="Times New Roman" w:eastAsia="Times New Roman" w:hAnsi="Times New Roman" w:cs="Times New Roman"/>
+          <w:rFonts w:ascii="Times New Roman" w:hAnsi="Times New Roman"/>
           <w:szCs w:val="26"/>
         </w:rPr>
         <w:t>Giấy tờ chứng minh quyền sử dụng đất gồm: {{CERTIFICATE}}.</w:t>
@@ -5283,7 +5265,7 @@
       </w:pPr>
       <w:r>
         <w:rPr>
-          <w:rFonts w:ascii="Times New Roman" w:eastAsia="Times New Roman" w:hAnsi="Times New Roman" w:cs="Times New Roman"/>
+          <w:rFonts w:ascii="Times New Roman" w:hAnsi="Times New Roman"/>
           <w:bCs/>
           <w:szCs w:val="26"/>
           <w:lang w:val="da-DK"/>
@@ -5316,7 +5298,7 @@
       </w:pPr>
       <w:r>
         <w:rPr>
-          <w:rFonts w:ascii="Times New Roman" w:eastAsia="Times New Roman" w:hAnsi="Times New Roman" w:cs="Times New Roman"/>
+          <w:rFonts w:ascii="Times New Roman" w:hAnsi="Times New Roman"/>
           <w:szCs w:val="26"/>
         </w:rPr>
         <w:t>{{CSHT_LIST2}}</w:t>
@@ -5336,7 +5318,7 @@
       </w:pPr>
       <w:r>
         <w:rPr>
-          <w:rFonts w:ascii="Times New Roman" w:eastAsia="Times New Roman" w:hAnsi="Times New Roman" w:cs="Times New Roman"/>
+          <w:rFonts w:ascii="Times New Roman" w:hAnsi="Times New Roman"/>
           <w:szCs w:val="26"/>
           <w:lang w:val="da-DK"/>
         </w:rPr>
@@ -5362,7 +5344,7 @@
       </w:pPr>
       <w:r>
         <w:rPr>
-          <w:rFonts w:ascii="Times New Roman" w:eastAsia="Times New Roman" w:hAnsi="Times New Roman" w:cs="Times New Roman"/>
+          <w:rFonts w:ascii="Times New Roman" w:hAnsi="Times New Roman"/>
           <w:iCs/>
           <w:szCs w:val="26"/>
           <w:lang w:val="da-DK"/>
@@ -5371,7 +5353,7 @@
       </w:r>
       <w:r>
         <w:rPr>
-          <w:rFonts w:ascii="Times New Roman" w:eastAsia="Times New Roman" w:hAnsi="Times New Roman" w:cs="Times New Roman"/>
+          <w:rFonts w:ascii="Times New Roman" w:hAnsi="Times New Roman"/>
           <w:szCs w:val="26"/>
         </w:rPr>
         <w:t>{{PHONE}}</w:t>
@@ -5392,7 +5374,7 @@
       </w:pPr>
       <w:r>
         <w:rPr>
-          <w:rFonts w:ascii="Times New Roman" w:eastAsia="Times New Roman" w:hAnsi="Times New Roman" w:cs="Times New Roman"/>
+          <w:rFonts w:ascii="Times New Roman" w:hAnsi="Times New Roman"/>
           <w:iCs/>
           <w:szCs w:val="26"/>
           <w:lang w:val="da-DK"/>
@@ -5401,7 +5383,7 @@
       </w:r>
       <w:r>
         <w:rPr>
-          <w:rFonts w:ascii="Times New Roman" w:eastAsia="Times New Roman" w:hAnsi="Times New Roman" w:cs="Times New Roman"/>
+          <w:rFonts w:ascii="Times New Roman" w:hAnsi="Times New Roman"/>
           <w:szCs w:val="26"/>
           <w:lang w:val="da-DK"/>
         </w:rPr>
@@ -5430,7 +5412,7 @@
       </w:pPr>
       <w:r>
         <w:rPr>
-          <w:rFonts w:ascii="Times New Roman" w:eastAsia="Times New Roman" w:hAnsi="Times New Roman" w:cs="Times New Roman"/>
+          <w:rFonts w:ascii="Times New Roman" w:hAnsi="Times New Roman"/>
           <w:b/>
           <w:szCs w:val="26"/>
           <w:lang w:val="da-DK"/>
@@ -5455,7 +5437,7 @@
       </w:pPr>
       <w:r>
         <w:rPr>
-          <w:rFonts w:ascii="Times New Roman" w:eastAsia="Times New Roman" w:hAnsi="Times New Roman" w:cs="Times New Roman"/>
+          <w:rFonts w:ascii="Times New Roman" w:hAnsi="Times New Roman"/>
           <w:szCs w:val="26"/>
           <w:lang w:val="da-DK"/>
         </w:rPr>
@@ -5480,7 +5462,7 @@
       </w:pPr>
       <w:r>
         <w:rPr>
-          <w:rFonts w:ascii="Times New Roman" w:eastAsia="Times New Roman" w:hAnsi="Times New Roman" w:cs="Times New Roman"/>
+          <w:rFonts w:ascii="Times New Roman" w:hAnsi="Times New Roman"/>
           <w:szCs w:val="26"/>
           <w:lang w:val="da-DK"/>
         </w:rPr>
@@ -5509,7 +5491,7 @@
       </w:pPr>
       <w:r>
         <w:rPr>
-          <w:rFonts w:ascii="Times New Roman" w:eastAsia="Times New Roman" w:hAnsi="Times New Roman" w:cs="Times New Roman"/>
+          <w:rFonts w:ascii="Times New Roman" w:hAnsi="Times New Roman"/>
           <w:iCs/>
           <w:szCs w:val="26"/>
           <w:lang w:val="da-DK"/>
@@ -5538,7 +5520,7 @@
       </w:pPr>
       <w:r>
         <w:rPr>
-          <w:rFonts w:ascii="Times New Roman" w:eastAsia="Times New Roman" w:hAnsi="Times New Roman" w:cs="Times New Roman"/>
+          <w:rFonts w:ascii="Times New Roman" w:hAnsi="Times New Roman"/>
           <w:szCs w:val="26"/>
           <w:lang w:val="da-DK"/>
         </w:rPr>
@@ -5566,7 +5548,7 @@
       </w:pPr>
       <w:r>
         <w:rPr>
-          <w:rFonts w:ascii="Times New Roman" w:eastAsia="Times New Roman" w:hAnsi="Times New Roman" w:cs="Times New Roman"/>
+          <w:rFonts w:ascii="Times New Roman" w:hAnsi="Times New Roman"/>
           <w:szCs w:val="26"/>
           <w:lang w:val="da-DK"/>
         </w:rPr>
@@ -5594,7 +5576,7 @@
       </w:pPr>
       <w:r>
         <w:rPr>
-          <w:rFonts w:ascii="Times New Roman" w:eastAsia="Times New Roman" w:hAnsi="Times New Roman" w:cs="Times New Roman"/>
+          <w:rFonts w:ascii="Times New Roman" w:hAnsi="Times New Roman"/>
           <w:szCs w:val="26"/>
           <w:lang w:val="da-DK"/>
         </w:rPr>
@@ -5622,7 +5604,7 @@
       </w:pPr>
       <w:r>
         <w:rPr>
-          <w:rFonts w:ascii="Times New Roman" w:eastAsia="Times New Roman" w:hAnsi="Times New Roman" w:cs="Times New Roman"/>
+          <w:rFonts w:ascii="Times New Roman" w:hAnsi="Times New Roman"/>
           <w:szCs w:val="26"/>
           <w:lang w:val="da-DK"/>
         </w:rPr>
@@ -5650,7 +5632,7 @@
       </w:pPr>
       <w:r>
         <w:rPr>
-          <w:rFonts w:ascii="Times New Roman" w:eastAsia="Times New Roman" w:hAnsi="Times New Roman" w:cs="Times New Roman"/>
+          <w:rFonts w:ascii="Times New Roman" w:hAnsi="Times New Roman"/>
           <w:szCs w:val="26"/>
           <w:lang w:val="da-DK"/>
         </w:rPr>
@@ -5658,7 +5640,7 @@
       </w:r>
       <w:r>
         <w:rPr>
-          <w:rFonts w:ascii="Times New Roman" w:eastAsia="Times New Roman" w:hAnsi="Times New Roman" w:cs="Times New Roman"/>
+          <w:rFonts w:ascii="Times New Roman" w:hAnsi="Times New Roman"/>
           <w:szCs w:val="26"/>
           <w:lang w:val="da-DK"/>
         </w:rPr>
@@ -5683,7 +5665,7 @@
       </w:pPr>
       <w:r>
         <w:rPr>
-          <w:rFonts w:ascii="Times New Roman" w:eastAsia="Times New Roman" w:hAnsi="Times New Roman" w:cs="Times New Roman"/>
+          <w:rFonts w:ascii="Times New Roman" w:hAnsi="Times New Roman"/>
           <w:iCs/>
           <w:szCs w:val="26"/>
           <w:lang w:val="da-DK"/>
@@ -5708,7 +5690,7 @@
       </w:pPr>
       <w:r>
         <w:rPr>
-          <w:rFonts w:ascii="Times New Roman" w:eastAsia="Times New Roman" w:hAnsi="Times New Roman" w:cs="Times New Roman"/>
+          <w:rFonts w:ascii="Times New Roman" w:hAnsi="Times New Roman"/>
           <w:b/>
           <w:bCs/>
           <w:szCs w:val="26"/>
@@ -5718,7 +5700,7 @@
       </w:r>
       <w:r>
         <w:rPr>
-          <w:rFonts w:ascii="Times New Roman" w:eastAsia="Times New Roman" w:hAnsi="Times New Roman" w:cs="Times New Roman"/>
+          <w:rFonts w:ascii="Times New Roman" w:hAnsi="Times New Roman"/>
           <w:b/>
           <w:bCs/>
           <w:szCs w:val="26"/>
@@ -5728,7 +5710,7 @@
       </w:r>
       <w:r>
         <w:rPr>
-          <w:rFonts w:ascii="Times New Roman" w:eastAsia="Times New Roman" w:hAnsi="Times New Roman" w:cs="Times New Roman"/>
+          <w:rFonts w:ascii="Times New Roman" w:hAnsi="Times New Roman"/>
           <w:b/>
           <w:bCs/>
           <w:szCs w:val="26"/>
@@ -5738,7 +5720,7 @@
       </w:r>
       <w:r>
         <w:rPr>
-          <w:rFonts w:ascii="Times New Roman" w:eastAsia="Times New Roman" w:hAnsi="Times New Roman" w:cs="Times New Roman"/>
+          <w:rFonts w:ascii="Times New Roman" w:hAnsi="Times New Roman"/>
           <w:b/>
           <w:bCs/>
           <w:szCs w:val="26"/>
@@ -5748,7 +5730,7 @@
       </w:r>
       <w:r>
         <w:rPr>
-          <w:rFonts w:ascii="Times New Roman" w:eastAsia="Times New Roman" w:hAnsi="Times New Roman" w:cs="Times New Roman"/>
+          <w:rFonts w:ascii="Times New Roman" w:hAnsi="Times New Roman"/>
           <w:b/>
           <w:bCs/>
           <w:iCs/>
@@ -5759,7 +5741,7 @@
       </w:r>
       <w:r>
         <w:rPr>
-          <w:rFonts w:ascii="Times New Roman" w:eastAsia="Times New Roman" w:hAnsi="Times New Roman" w:cs="Times New Roman"/>
+          <w:rFonts w:ascii="Times New Roman" w:hAnsi="Times New Roman"/>
           <w:b/>
           <w:bCs/>
           <w:iCs/>
@@ -5770,7 +5752,7 @@
       </w:r>
       <w:r>
         <w:rPr>
-          <w:rFonts w:ascii="Times New Roman" w:eastAsia="Times New Roman" w:hAnsi="Times New Roman" w:cs="Times New Roman"/>
+          <w:rFonts w:ascii="Times New Roman" w:hAnsi="Times New Roman"/>
           <w:b/>
           <w:bCs/>
           <w:iCs/>
@@ -5795,7 +5777,6 @@
       </w:pPr>
       <w:r>
         <w:rPr>
-          <w:rFonts w:ascii="Times New Roman" w:eastAsia="Times New Roman" w:hAnsi="Times New Roman" w:cs="Times New Roman"/>
           <w:sz w:val="26"/>
           <w:szCs w:val="26"/>
         </w:rPr>
@@ -5803,7 +5784,6 @@
       </w:r>
       <w:r>
         <w:rPr>
-          <w:rFonts w:ascii="Times New Roman" w:eastAsia="Times New Roman" w:hAnsi="Times New Roman" w:cs="Times New Roman"/>
           <w:sz w:val="26"/>
           <w:szCs w:val="26"/>
         </w:rPr>
@@ -5826,7 +5806,7 @@
       </w:pPr>
       <w:r>
         <w:rPr>
-          <w:rFonts w:ascii="Times New Roman" w:eastAsia="Times New Roman" w:hAnsi="Times New Roman" w:cs="Times New Roman"/>
+          <w:rFonts w:ascii="Times New Roman" w:hAnsi="Times New Roman"/>
           <w:szCs w:val="26"/>
           <w:lang w:val="vi-VN"/>
         </w:rPr>
@@ -5849,7 +5829,7 @@
       </w:pPr>
       <w:r>
         <w:rPr>
-          <w:rFonts w:ascii="Times New Roman" w:eastAsia="Times New Roman" w:hAnsi="Times New Roman" w:cs="Times New Roman"/>
+          <w:rFonts w:ascii="Times New Roman" w:hAnsi="Times New Roman"/>
           <w:szCs w:val="26"/>
           <w:lang w:val="vi-VN"/>
         </w:rPr>
@@ -5874,7 +5854,7 @@
       </w:pPr>
       <w:r>
         <w:rPr>
-          <w:rFonts w:ascii="Times New Roman" w:eastAsia="Times New Roman" w:hAnsi="Times New Roman" w:cs="Times New Roman"/>
+          <w:rFonts w:ascii="Times New Roman" w:hAnsi="Times New Roman"/>
           <w:b/>
           <w:bCs/>
           <w:szCs w:val="26"/>
@@ -5884,7 +5864,7 @@
       </w:r>
       <w:r>
         <w:rPr>
-          <w:rFonts w:ascii="Times New Roman" w:eastAsia="Times New Roman" w:hAnsi="Times New Roman" w:cs="Times New Roman"/>
+          <w:rFonts w:ascii="Times New Roman" w:hAnsi="Times New Roman"/>
           <w:b/>
           <w:bCs/>
           <w:iCs/>
@@ -5917,7 +5897,7 @@
       </w:pPr>
       <w:r>
         <w:rPr>
-          <w:rFonts w:ascii="Times New Roman" w:eastAsia="Times New Roman" w:hAnsi="Times New Roman" w:cs="Times New Roman"/>
+          <w:rFonts w:ascii="Times New Roman" w:hAnsi="Times New Roman"/>
           <w:iCs/>
           <w:spacing w:val="-2"/>
           <w:szCs w:val="26"/>
@@ -5942,7 +5922,7 @@
       </w:pPr>
       <w:r>
         <w:rPr>
-          <w:rFonts w:ascii="Times New Roman" w:eastAsia="Times New Roman" w:hAnsi="Times New Roman" w:cs="Times New Roman"/>
+          <w:rFonts w:ascii="Times New Roman" w:hAnsi="Times New Roman"/>
           <w:szCs w:val="26"/>
         </w:rPr>
         <w:t>- Tổng cộng giá thuê hàng tháng: Giá thuê ổn định và không thay đổi trong suốt thời gian thuê là: {{NEW_PRICE}} đồng/tháng (Số tiền thuê bằng chữ: {{NEW_PRICE_TEXT}})</w:t>
@@ -5965,7 +5945,7 @@
       </w:pPr>
       <w:r>
         <w:rPr>
-          <w:rFonts w:ascii="Times New Roman" w:eastAsia="Times New Roman" w:hAnsi="Times New Roman" w:cs="Times New Roman"/>
+          <w:rFonts w:ascii="Times New Roman" w:hAnsi="Times New Roman"/>
           <w:bCs/>
           <w:iCs/>
           <w:spacing w:val="-2"/>
@@ -5992,7 +5972,7 @@
       </w:pPr>
       <w:r>
         <w:rPr>
-          <w:rFonts w:ascii="Times New Roman" w:eastAsia="Times New Roman" w:hAnsi="Times New Roman" w:cs="Times New Roman"/>
+          <w:rFonts w:ascii="Times New Roman" w:hAnsi="Times New Roman"/>
           <w:bCs/>
           <w:iCs/>
           <w:spacing w:val="-2"/>
@@ -6012,7 +5992,7 @@
       </w:pPr>
       <w:r>
         <w:rPr>
-          <w:rFonts w:ascii="Times New Roman" w:eastAsia="Times New Roman" w:hAnsi="Times New Roman" w:cs="Times New Roman"/>
+          <w:rFonts w:ascii="Times New Roman" w:hAnsi="Times New Roman"/>
           <w:szCs w:val="26"/>
         </w:rPr>
         <w:t>{{DEDUCTION_TEXT}}</w:t>
@@ -6035,7 +6015,7 @@
       </w:pPr>
       <w:r>
         <w:rPr>
-          <w:rFonts w:ascii="Times New Roman" w:eastAsia="Times New Roman" w:hAnsi="Times New Roman" w:cs="Times New Roman"/>
+          <w:rFonts w:ascii="Times New Roman" w:hAnsi="Times New Roman"/>
           <w:szCs w:val="26"/>
         </w:rPr>
         <w:t>- Thời điểm bắt đầu tính tiền thuê: Từ ngày {{START_DATE}}</w:t>
@@ -6058,7 +6038,7 @@
       </w:pPr>
       <w:r>
         <w:rPr>
-          <w:rFonts w:ascii="Times New Roman" w:eastAsia="Times New Roman" w:hAnsi="Times New Roman" w:cs="Times New Roman"/>
+          <w:rFonts w:ascii="Times New Roman" w:hAnsi="Times New Roman"/>
           <w:b/>
           <w:szCs w:val="26"/>
           <w:lang w:val="vi-VN"/>
@@ -6083,7 +6063,7 @@
       </w:pPr>
       <w:r>
         <w:rPr>
-          <w:rFonts w:ascii="Times New Roman" w:eastAsia="Times New Roman" w:hAnsi="Times New Roman" w:cs="Times New Roman"/>
+          <w:rFonts w:ascii="Times New Roman" w:hAnsi="Times New Roman"/>
           <w:b/>
           <w:szCs w:val="26"/>
         </w:rPr>
@@ -6107,7 +6087,7 @@
       </w:pPr>
       <w:r>
         <w:rPr>
-          <w:rFonts w:ascii="Times New Roman" w:eastAsia="Times New Roman" w:hAnsi="Times New Roman" w:cs="Times New Roman"/>
+          <w:rFonts w:ascii="Times New Roman" w:hAnsi="Times New Roman"/>
           <w:b/>
           <w:szCs w:val="26"/>
         </w:rPr>
@@ -6131,7 +6111,7 @@
       </w:pPr>
       <w:r>
         <w:rPr>
-          <w:rFonts w:ascii="Times New Roman" w:eastAsia="Times New Roman" w:hAnsi="Times New Roman" w:cs="Times New Roman"/>
+          <w:rFonts w:ascii="Times New Roman" w:hAnsi="Times New Roman"/>
           <w:b/>
           <w:szCs w:val="26"/>
         </w:rPr>
@@ -6157,7 +6137,7 @@
       </w:pPr>
       <w:r>
         <w:rPr>
-          <w:rFonts w:ascii="Times New Roman" w:eastAsia="Times New Roman" w:hAnsi="Times New Roman" w:cs="Times New Roman"/>
+          <w:rFonts w:ascii="Times New Roman" w:hAnsi="Times New Roman"/>
           <w:sz w:val="26"/>
         </w:rPr>
         <w:t>Bên A cam kết tài khoản nhận thanh toán là ổn định và không thay đổi trong suốt thời gian thuê, đồng thời chịu trách nhiệm nếu có bất kỳ khiếu nại nào liên quan đến việc nhận tiền thanh toán của hợp đồng này vào tài khoản nêu trên</w:t>
@@ -6180,7 +6160,7 @@
       </w:pPr>
       <w:r>
         <w:rPr>
-          <w:rFonts w:ascii="Times New Roman" w:eastAsia="Times New Roman" w:hAnsi="Times New Roman" w:cs="Times New Roman"/>
+          <w:rFonts w:ascii="Times New Roman" w:hAnsi="Times New Roman"/>
           <w:sz w:val="26"/>
         </w:rPr>
         <w:t>Trường hợp thay đổi thông tin tài khoản nhận thanh toán, Bên A phải báo trước bằng văn bản cho bên B chậm nhất là 30 ngày trước khi đến hạn của chu kỳ thanh toán kế tiếp và hai bên sẽ tiến hành ký phụ lục điều chỉnh thông tin tài khoản nhận tiền thanh toán.</w:t>
@@ -6204,7 +6184,7 @@
       </w:pPr>
       <w:r>
         <w:rPr>
-          <w:rFonts w:ascii="Times New Roman" w:eastAsia="Times New Roman" w:hAnsi="Times New Roman" w:cs="Times New Roman"/>
+          <w:rFonts w:ascii="Times New Roman" w:hAnsi="Times New Roman"/>
           <w:i/>
           <w:szCs w:val="26"/>
           <w:lang w:val="vi-VN"/>
@@ -6213,7 +6193,7 @@
       </w:r>
       <w:r>
         <w:rPr>
-          <w:rFonts w:ascii="Times New Roman" w:eastAsia="Times New Roman" w:hAnsi="Times New Roman" w:cs="Times New Roman"/>
+          <w:rFonts w:ascii="Times New Roman" w:hAnsi="Times New Roman"/>
           <w:i/>
           <w:spacing w:val="-1"/>
           <w:szCs w:val="26"/>
@@ -6223,7 +6203,7 @@
       </w:r>
       <w:r>
         <w:rPr>
-          <w:rFonts w:ascii="Times New Roman" w:eastAsia="Times New Roman" w:hAnsi="Times New Roman" w:cs="Times New Roman"/>
+          <w:rFonts w:ascii="Times New Roman" w:hAnsi="Times New Roman"/>
           <w:i/>
           <w:szCs w:val="26"/>
           <w:lang w:val="vi-VN"/>
@@ -6232,7 +6212,7 @@
       </w:r>
       <w:r>
         <w:rPr>
-          <w:rFonts w:ascii="Times New Roman" w:eastAsia="Times New Roman" w:hAnsi="Times New Roman" w:cs="Times New Roman"/>
+          <w:rFonts w:ascii="Times New Roman" w:hAnsi="Times New Roman"/>
           <w:i/>
           <w:spacing w:val="-1"/>
           <w:szCs w:val="26"/>
@@ -6242,7 +6222,7 @@
       </w:r>
       <w:r>
         <w:rPr>
-          <w:rFonts w:ascii="Times New Roman" w:eastAsia="Times New Roman" w:hAnsi="Times New Roman" w:cs="Times New Roman"/>
+          <w:rFonts w:ascii="Times New Roman" w:hAnsi="Times New Roman"/>
           <w:i/>
           <w:szCs w:val="26"/>
           <w:lang w:val="vi-VN"/>
@@ -6251,7 +6231,7 @@
       </w:r>
       <w:r>
         <w:rPr>
-          <w:rFonts w:ascii="Times New Roman" w:eastAsia="Times New Roman" w:hAnsi="Times New Roman" w:cs="Times New Roman"/>
+          <w:rFonts w:ascii="Times New Roman" w:hAnsi="Times New Roman"/>
           <w:i/>
           <w:spacing w:val="-1"/>
           <w:szCs w:val="26"/>
@@ -6261,7 +6241,7 @@
       </w:r>
       <w:r>
         <w:rPr>
-          <w:rFonts w:ascii="Times New Roman" w:eastAsia="Times New Roman" w:hAnsi="Times New Roman" w:cs="Times New Roman"/>
+          <w:rFonts w:ascii="Times New Roman" w:hAnsi="Times New Roman"/>
           <w:i/>
           <w:szCs w:val="26"/>
           <w:lang w:val="vi-VN"/>
@@ -6270,7 +6250,7 @@
       </w:r>
       <w:r>
         <w:rPr>
-          <w:rFonts w:ascii="Times New Roman" w:eastAsia="Times New Roman" w:hAnsi="Times New Roman" w:cs="Times New Roman"/>
+          <w:rFonts w:ascii="Times New Roman" w:hAnsi="Times New Roman"/>
           <w:i/>
           <w:spacing w:val="-1"/>
           <w:szCs w:val="26"/>
@@ -6280,7 +6260,7 @@
       </w:r>
       <w:r>
         <w:rPr>
-          <w:rFonts w:ascii="Times New Roman" w:eastAsia="Times New Roman" w:hAnsi="Times New Roman" w:cs="Times New Roman"/>
+          <w:rFonts w:ascii="Times New Roman" w:hAnsi="Times New Roman"/>
           <w:szCs w:val="26"/>
           <w:lang w:val="vi-VN"/>
         </w:rPr>
@@ -6288,7 +6268,7 @@
       </w:r>
       <w:r>
         <w:rPr>
-          <w:rFonts w:ascii="Times New Roman" w:eastAsia="Times New Roman" w:hAnsi="Times New Roman" w:cs="Times New Roman"/>
+          <w:rFonts w:ascii="Times New Roman" w:hAnsi="Times New Roman"/>
           <w:i/>
           <w:szCs w:val="26"/>
           <w:lang w:val="vi-VN"/>
@@ -6297,7 +6277,7 @@
       </w:r>
       <w:r>
         <w:rPr>
-          <w:rFonts w:ascii="Times New Roman" w:eastAsia="Times New Roman" w:hAnsi="Times New Roman" w:cs="Times New Roman"/>
+          <w:rFonts w:ascii="Times New Roman" w:hAnsi="Times New Roman"/>
           <w:i/>
           <w:spacing w:val="-1"/>
           <w:szCs w:val="26"/>
@@ -6307,7 +6287,7 @@
       </w:r>
       <w:r>
         <w:rPr>
-          <w:rFonts w:ascii="Times New Roman" w:eastAsia="Times New Roman" w:hAnsi="Times New Roman" w:cs="Times New Roman"/>
+          <w:rFonts w:ascii="Times New Roman" w:hAnsi="Times New Roman"/>
           <w:i/>
           <w:szCs w:val="26"/>
           <w:lang w:val="vi-VN"/>
@@ -6316,7 +6296,7 @@
       </w:r>
       <w:r>
         <w:rPr>
-          <w:rFonts w:ascii="Times New Roman" w:eastAsia="Times New Roman" w:hAnsi="Times New Roman" w:cs="Times New Roman"/>
+          <w:rFonts w:ascii="Times New Roman" w:hAnsi="Times New Roman"/>
           <w:i/>
           <w:spacing w:val="-3"/>
           <w:szCs w:val="26"/>
@@ -6326,7 +6306,7 @@
       </w:r>
       <w:r>
         <w:rPr>
-          <w:rFonts w:ascii="Times New Roman" w:eastAsia="Times New Roman" w:hAnsi="Times New Roman" w:cs="Times New Roman"/>
+          <w:rFonts w:ascii="Times New Roman" w:hAnsi="Times New Roman"/>
           <w:i/>
           <w:szCs w:val="26"/>
           <w:lang w:val="vi-VN"/>
@@ -6361,7 +6341,7 @@
             </w:pPr>
             <w:r>
               <w:rPr>
-                <w:rFonts w:ascii="Times New Roman" w:eastAsia="Times New Roman" w:hAnsi="Times New Roman" w:cs="Times New Roman"/>
+                <w:rFonts w:ascii="Times New Roman" w:hAnsi="Times New Roman"/>
                 <w:szCs w:val="26"/>
               </w:rPr>
               <w:t>{{PAY_ROW}}</w:t>
@@ -6387,7 +6367,7 @@
       </w:pPr>
       <w:r>
         <w:rPr>
-          <w:rFonts w:ascii="Times New Roman" w:eastAsia="Times New Roman" w:hAnsi="Times New Roman" w:cs="Times New Roman"/>
+          <w:rFonts w:ascii="Times New Roman" w:hAnsi="Times New Roman"/>
           <w:bCs/>
           <w:iCs/>
           <w:spacing w:val="-2"/>
@@ -6411,7 +6391,7 @@
       </w:pPr>
       <w:r>
         <w:rPr>
-          <w:rFonts w:ascii="Times New Roman" w:eastAsia="Times New Roman" w:hAnsi="Times New Roman" w:cs="Times New Roman"/>
+          <w:rFonts w:ascii="Times New Roman" w:hAnsi="Times New Roman"/>
           <w:szCs w:val="26"/>
           <w:lang w:val="da-DK"/>
         </w:rPr>
@@ -6438,7 +6418,7 @@
       </w:pPr>
       <w:r>
         <w:rPr>
-          <w:rFonts w:ascii="Times New Roman" w:eastAsia="Times New Roman" w:hAnsi="Times New Roman" w:cs="Times New Roman"/>
+          <w:rFonts w:ascii="Times New Roman" w:hAnsi="Times New Roman"/>
           <w:szCs w:val="26"/>
           <w:lang w:val="vi-VN"/>
         </w:rPr>
@@ -6446,7 +6426,7 @@
       </w:r>
       <w:r>
         <w:rPr>
-          <w:rFonts w:ascii="Times New Roman" w:eastAsia="Times New Roman" w:hAnsi="Times New Roman" w:cs="Times New Roman"/>
+          <w:rFonts w:ascii="Times New Roman" w:hAnsi="Times New Roman"/>
           <w:szCs w:val="26"/>
           <w:lang w:val="vi-VN"/>
         </w:rPr>
@@ -6455,7 +6435,7 @@
       </w:r>
       <w:r>
         <w:rPr>
-          <w:rFonts w:ascii="Times New Roman" w:eastAsia="Times New Roman" w:hAnsi="Times New Roman" w:cs="Times New Roman"/>
+          <w:rFonts w:ascii="Times New Roman" w:hAnsi="Times New Roman"/>
           <w:noProof/>
           <w:szCs w:val="26"/>
           <w:lang w:val="fr-FR"/>
@@ -6464,12 +6444,12 @@
       </w:r>
       <w:r>
         <w:rPr>
-          <w:rFonts w:ascii="Times New Roman" w:eastAsia="Times New Roman" w:hAnsi="Times New Roman" w:cs="Times New Roman"/>
+          <w:rFonts w:ascii="Times New Roman" w:hAnsi="Times New Roman"/>
           <w:noProof/>
           <w:szCs w:val="26"/>
           <w:lang w:val="fr-FR"/>
         </w:rPr>
-        <w:t>Đồng Nai</w:t>
+        <w:t>Tp Đồng Nai</w:t>
       </w:r>
     </w:p>
     <w:p>
@@ -6491,7 +6471,7 @@
       </w:pPr>
       <w:r>
         <w:rPr>
-          <w:rFonts w:ascii="Times New Roman" w:eastAsia="Times New Roman" w:hAnsi="Times New Roman" w:cs="Times New Roman"/>
+          <w:rFonts w:ascii="Times New Roman" w:hAnsi="Times New Roman"/>
           <w:szCs w:val="26"/>
           <w:lang w:val="vi-VN"/>
         </w:rPr>
@@ -6499,7 +6479,7 @@
       </w:r>
       <w:r>
         <w:rPr>
-          <w:rFonts w:ascii="Times New Roman" w:eastAsia="Times New Roman" w:hAnsi="Times New Roman" w:cs="Times New Roman"/>
+          <w:rFonts w:ascii="Times New Roman" w:hAnsi="Times New Roman"/>
           <w:szCs w:val="26"/>
           <w:lang w:val="vi-VN"/>
         </w:rPr>
@@ -6509,7 +6489,7 @@
       <w:bookmarkStart w:name="_Hlk220074608" w:id="3"/>
       <w:r>
         <w:rPr>
-          <w:rFonts w:ascii="Times New Roman" w:eastAsia="Times New Roman" w:hAnsi="Times New Roman" w:cs="Times New Roman"/>
+          <w:rFonts w:ascii="Times New Roman" w:hAnsi="Times New Roman"/>
           <w:szCs w:val="26"/>
           <w:lang w:val="vi-VN"/>
         </w:rPr>
@@ -6534,7 +6514,7 @@
       </w:pPr>
       <w:r>
         <w:rPr>
-          <w:rFonts w:ascii="Times New Roman" w:eastAsia="Times New Roman" w:hAnsi="Times New Roman" w:cs="Times New Roman"/>
+          <w:rFonts w:ascii="Times New Roman" w:hAnsi="Times New Roman"/>
           <w:bCs/>
           <w:iCs/>
           <w:spacing w:val="-2"/>
@@ -6562,7 +6542,7 @@
       </w:pPr>
       <w:r>
         <w:rPr>
-          <w:rFonts w:ascii="Times New Roman" w:eastAsia="Times New Roman" w:hAnsi="Times New Roman" w:cs="Times New Roman"/>
+          <w:rFonts w:ascii="Times New Roman" w:hAnsi="Times New Roman"/>
           <w:b/>
           <w:bCs/>
           <w:szCs w:val="26"/>
@@ -6596,7 +6576,7 @@
       </w:pPr>
       <w:r>
         <w:rPr>
-          <w:rFonts w:ascii="Times New Roman" w:eastAsia="Times New Roman" w:hAnsi="Times New Roman" w:cs="Times New Roman"/>
+          <w:rFonts w:ascii="Times New Roman" w:hAnsi="Times New Roman"/>
           <w:b/>
           <w:bCs/>
           <w:szCs w:val="26"/>
@@ -6628,7 +6608,7 @@
       </w:pPr>
       <w:r>
         <w:rPr>
-          <w:rFonts w:ascii="Times New Roman" w:eastAsia="Times New Roman" w:hAnsi="Times New Roman" w:cs="Times New Roman"/>
+          <w:rFonts w:ascii="Times New Roman" w:hAnsi="Times New Roman"/>
           <w:sz w:val="26"/>
           <w:szCs w:val="26"/>
           <w:lang w:val="da-DK"/>
@@ -6660,7 +6640,7 @@
       </w:pPr>
       <w:r>
         <w:rPr>
-          <w:rFonts w:ascii="Times New Roman" w:eastAsia="Times New Roman" w:hAnsi="Times New Roman" w:cs="Times New Roman"/>
+          <w:rFonts w:ascii="Times New Roman" w:hAnsi="Times New Roman"/>
           <w:sz w:val="26"/>
           <w:szCs w:val="26"/>
           <w:lang w:val="da-DK"/>
@@ -6692,7 +6672,7 @@
       </w:pPr>
       <w:r>
         <w:rPr>
-          <w:rFonts w:ascii="Times New Roman" w:eastAsia="Times New Roman" w:hAnsi="Times New Roman" w:cs="Times New Roman"/>
+          <w:rFonts w:ascii="Times New Roman" w:hAnsi="Times New Roman"/>
           <w:sz w:val="26"/>
           <w:szCs w:val="26"/>
           <w:lang w:val="da-DK"/>
@@ -6724,7 +6704,7 @@
       </w:pPr>
       <w:r>
         <w:rPr>
-          <w:rFonts w:ascii="Times New Roman" w:eastAsia="Times New Roman" w:hAnsi="Times New Roman" w:cs="Times New Roman"/>
+          <w:rFonts w:ascii="Times New Roman" w:hAnsi="Times New Roman"/>
           <w:sz w:val="26"/>
           <w:szCs w:val="26"/>
         </w:rPr>
@@ -6752,7 +6732,7 @@
       </w:pPr>
       <w:r>
         <w:rPr>
-          <w:rFonts w:ascii="Times New Roman" w:eastAsia="Times New Roman" w:hAnsi="Times New Roman" w:cs="Times New Roman"/>
+          <w:rFonts w:ascii="Times New Roman" w:hAnsi="Times New Roman"/>
           <w:sz w:val="26"/>
           <w:szCs w:val="26"/>
           <w:lang w:val="da-DK"/>
@@ -6783,7 +6763,7 @@
       <w:r>
         <w:rPr>
           <w:rStyle w:val="Strong"/>
-          <w:rFonts w:ascii="Times New Roman" w:eastAsia="Times New Roman" w:hAnsi="Times New Roman" w:cs="Times New Roman"/>
+          <w:rFonts w:ascii="Times New Roman" w:hAnsi="Times New Roman"/>
           <w:sz w:val="26"/>
           <w:szCs w:val="26"/>
           <w:lang w:val="vi-VN"/>
@@ -6808,7 +6788,7 @@
       </w:pPr>
       <w:r>
         <w:rPr>
-          <w:rFonts w:ascii="Times New Roman" w:eastAsia="Times New Roman" w:hAnsi="Times New Roman" w:cs="Times New Roman"/>
+          <w:rFonts w:ascii="Times New Roman" w:hAnsi="Times New Roman"/>
           <w:szCs w:val="26"/>
           <w:lang w:val="vi-VN"/>
         </w:rPr>
@@ -6836,7 +6816,7 @@
       </w:pPr>
       <w:r>
         <w:rPr>
-          <w:rFonts w:ascii="Times New Roman" w:eastAsia="Times New Roman" w:hAnsi="Times New Roman" w:cs="Times New Roman"/>
+          <w:rFonts w:ascii="Times New Roman" w:hAnsi="Times New Roman"/>
           <w:sz w:val="26"/>
           <w:szCs w:val="26"/>
           <w:lang w:val="vi-VN"/>
@@ -6845,7 +6825,7 @@
       </w:r>
       <w:r>
         <w:rPr>
-          <w:rFonts w:ascii="Times New Roman" w:eastAsia="Times New Roman" w:hAnsi="Times New Roman" w:cs="Times New Roman"/>
+          <w:rFonts w:ascii="Times New Roman" w:hAnsi="Times New Roman"/>
           <w:sz w:val="26"/>
           <w:szCs w:val="26"/>
           <w:lang w:val="vi-VN"/>
@@ -6878,7 +6858,7 @@
       </w:pPr>
       <w:r>
         <w:rPr>
-          <w:rFonts w:ascii="Times New Roman" w:eastAsia="Times New Roman" w:hAnsi="Times New Roman" w:cs="Times New Roman"/>
+          <w:rFonts w:ascii="Times New Roman" w:hAnsi="Times New Roman"/>
           <w:sz w:val="26"/>
           <w:szCs w:val="26"/>
           <w:lang w:val="vi-VN"/>
@@ -6910,7 +6890,7 @@
       </w:pPr>
       <w:r>
         <w:rPr>
-          <w:rFonts w:ascii="Times New Roman" w:eastAsia="Times New Roman" w:hAnsi="Times New Roman" w:cs="Times New Roman"/>
+          <w:rFonts w:ascii="Times New Roman" w:hAnsi="Times New Roman"/>
           <w:sz w:val="26"/>
           <w:szCs w:val="26"/>
           <w:lang w:val="vi-VN"/>
@@ -6942,7 +6922,7 @@
       </w:pPr>
       <w:r>
         <w:rPr>
-          <w:rFonts w:ascii="Times New Roman" w:eastAsia="Times New Roman" w:hAnsi="Times New Roman" w:cs="Times New Roman"/>
+          <w:rFonts w:ascii="Times New Roman" w:hAnsi="Times New Roman"/>
           <w:sz w:val="26"/>
           <w:szCs w:val="26"/>
           <w:lang w:val="vi-VN"/>
@@ -6974,7 +6954,7 @@
       </w:pPr>
       <w:r>
         <w:rPr>
-          <w:rFonts w:ascii="Times New Roman" w:eastAsia="Times New Roman" w:hAnsi="Times New Roman" w:cs="Times New Roman"/>
+          <w:rFonts w:ascii="Times New Roman" w:hAnsi="Times New Roman"/>
           <w:sz w:val="26"/>
           <w:szCs w:val="26"/>
           <w:lang w:val="vi-VN"/>
@@ -7006,7 +6986,7 @@
       </w:pPr>
       <w:r>
         <w:rPr>
-          <w:rFonts w:ascii="Times New Roman" w:eastAsia="Times New Roman" w:hAnsi="Times New Roman" w:cs="Times New Roman"/>
+          <w:rFonts w:ascii="Times New Roman" w:hAnsi="Times New Roman"/>
           <w:sz w:val="26"/>
           <w:szCs w:val="26"/>
           <w:lang w:val="vi-VN"/>
@@ -7038,7 +7018,7 @@
       </w:pPr>
       <w:r>
         <w:rPr>
-          <w:rFonts w:ascii="Times New Roman" w:eastAsia="Times New Roman" w:hAnsi="Times New Roman" w:cs="Times New Roman"/>
+          <w:rFonts w:ascii="Times New Roman" w:hAnsi="Times New Roman"/>
           <w:sz w:val="26"/>
           <w:szCs w:val="26"/>
           <w:lang w:val="vi-VN"/>
@@ -7070,7 +7050,7 @@
       </w:pPr>
       <w:r>
         <w:rPr>
-          <w:rFonts w:ascii="Times New Roman" w:eastAsia="Times New Roman" w:hAnsi="Times New Roman" w:cs="Times New Roman"/>
+          <w:rFonts w:ascii="Times New Roman" w:hAnsi="Times New Roman"/>
           <w:sz w:val="26"/>
           <w:szCs w:val="26"/>
           <w:lang w:val="vi-VN"/>
@@ -7079,7 +7059,7 @@
       </w:r>
       <w:r>
         <w:rPr>
-          <w:rFonts w:ascii="Times New Roman" w:eastAsia="Times New Roman" w:hAnsi="Times New Roman" w:cs="Times New Roman"/>
+          <w:rFonts w:ascii="Times New Roman" w:hAnsi="Times New Roman"/>
           <w:b/>
           <w:sz w:val="26"/>
           <w:szCs w:val="26"/>
@@ -7089,7 +7069,7 @@
       </w:r>
       <w:r>
         <w:rPr>
-          <w:rFonts w:ascii="Times New Roman" w:eastAsia="Times New Roman" w:hAnsi="Times New Roman" w:cs="Times New Roman"/>
+          <w:rFonts w:ascii="Times New Roman" w:hAnsi="Times New Roman"/>
           <w:sz w:val="26"/>
           <w:szCs w:val="26"/>
           <w:lang w:val="vi-VN"/>
@@ -7121,7 +7101,7 @@
       </w:pPr>
       <w:r>
         <w:rPr>
-          <w:rFonts w:ascii="Times New Roman" w:eastAsia="Times New Roman" w:hAnsi="Times New Roman" w:cs="Times New Roman"/>
+          <w:rFonts w:ascii="Times New Roman" w:hAnsi="Times New Roman"/>
           <w:sz w:val="26"/>
           <w:szCs w:val="26"/>
           <w:lang w:val="vi-VN"/>
@@ -7153,7 +7133,7 @@
       </w:pPr>
       <w:r>
         <w:rPr>
-          <w:rFonts w:ascii="Times New Roman" w:eastAsia="Times New Roman" w:hAnsi="Times New Roman" w:cs="Times New Roman"/>
+          <w:rFonts w:ascii="Times New Roman" w:hAnsi="Times New Roman"/>
           <w:sz w:val="26"/>
           <w:szCs w:val="26"/>
           <w:lang w:val="vi-VN"/>
@@ -7175,7 +7155,7 @@
       </w:pPr>
       <w:r>
         <w:rPr>
-          <w:rFonts w:ascii="Times New Roman" w:eastAsia="Times New Roman" w:hAnsi="Times New Roman" w:cs="Times New Roman"/>
+          <w:rFonts w:ascii="Times New Roman" w:hAnsi="Times New Roman"/>
           <w:sz w:val="26"/>
           <w:szCs w:val="26"/>
           <w:lang w:val="da-DK"/>
@@ -7184,7 +7164,7 @@
       </w:r>
       <w:r>
         <w:rPr>
-          <w:rFonts w:ascii="Times New Roman" w:eastAsia="Times New Roman" w:hAnsi="Times New Roman" w:cs="Times New Roman"/>
+          <w:rFonts w:ascii="Times New Roman" w:hAnsi="Times New Roman"/>
           <w:sz w:val="26"/>
           <w:szCs w:val="26"/>
           <w:lang w:val="da-DK"/>
@@ -7217,7 +7197,7 @@
       </w:pPr>
       <w:r>
         <w:rPr>
-          <w:rFonts w:ascii="Times New Roman" w:eastAsia="Times New Roman" w:hAnsi="Times New Roman" w:cs="Times New Roman"/>
+          <w:rFonts w:ascii="Times New Roman" w:hAnsi="Times New Roman"/>
           <w:sz w:val="26"/>
           <w:szCs w:val="26"/>
           <w:lang w:val="vi-VN"/>
@@ -7249,7 +7229,7 @@
       </w:pPr>
       <w:r>
         <w:rPr>
-          <w:rFonts w:ascii="Times New Roman" w:eastAsia="Times New Roman" w:hAnsi="Times New Roman" w:cs="Times New Roman"/>
+          <w:rFonts w:ascii="Times New Roman" w:hAnsi="Times New Roman"/>
           <w:sz w:val="26"/>
           <w:szCs w:val="26"/>
           <w:lang w:val="vi-VN"/>
@@ -7282,7 +7262,7 @@
       </w:pPr>
       <w:r>
         <w:rPr>
-          <w:rFonts w:ascii="Times New Roman" w:eastAsia="Times New Roman" w:hAnsi="Times New Roman" w:cs="Times New Roman"/>
+          <w:rFonts w:ascii="Times New Roman" w:hAnsi="Times New Roman"/>
           <w:spacing w:val="-2"/>
           <w:sz w:val="26"/>
           <w:szCs w:val="26"/>
@@ -7292,7 +7272,7 @@
       </w:r>
       <w:r>
         <w:rPr>
-          <w:rFonts w:ascii="Times New Roman" w:eastAsia="Times New Roman" w:hAnsi="Times New Roman" w:cs="Times New Roman"/>
+          <w:rFonts w:ascii="Times New Roman" w:hAnsi="Times New Roman"/>
           <w:sz w:val="26"/>
           <w:szCs w:val="26"/>
           <w:lang w:val="vi-VN"/>
@@ -7301,7 +7281,7 @@
       </w:r>
       <w:r>
         <w:rPr>
-          <w:rFonts w:ascii="Times New Roman" w:eastAsia="Times New Roman" w:hAnsi="Times New Roman" w:cs="Times New Roman"/>
+          <w:rFonts w:ascii="Times New Roman" w:hAnsi="Times New Roman"/>
           <w:spacing w:val="-2"/>
           <w:sz w:val="26"/>
           <w:szCs w:val="26"/>
@@ -7311,7 +7291,7 @@
       </w:r>
       <w:r>
         <w:rPr>
-          <w:rFonts w:ascii="Times New Roman" w:eastAsia="Times New Roman" w:hAnsi="Times New Roman" w:cs="Times New Roman"/>
+          <w:rFonts w:ascii="Times New Roman" w:hAnsi="Times New Roman"/>
           <w:i/>
           <w:spacing w:val="-2"/>
           <w:sz w:val="26"/>
@@ -7322,7 +7302,7 @@
       </w:r>
       <w:r>
         <w:rPr>
-          <w:rFonts w:ascii="Times New Roman" w:eastAsia="Times New Roman" w:hAnsi="Times New Roman" w:cs="Times New Roman"/>
+          <w:rFonts w:ascii="Times New Roman" w:hAnsi="Times New Roman"/>
           <w:spacing w:val="-2"/>
           <w:sz w:val="26"/>
           <w:szCs w:val="26"/>
@@ -7375,7 +7355,7 @@
             </w:pPr>
             <w:r>
               <w:rPr>
-                <w:rFonts w:ascii="Times New Roman" w:eastAsia="Times New Roman" w:hAnsi="Times New Roman" w:cs="Times New Roman"/>
+                <w:rFonts w:ascii="Times New Roman" w:hAnsi="Times New Roman"/>
                 <w:b/>
                 <w:szCs w:val="26"/>
                 <w:lang w:val="vi-VN"/>
@@ -7414,7 +7394,7 @@
             </w:pPr>
             <w:r>
               <w:rPr>
-                <w:rFonts w:ascii="Times New Roman" w:eastAsia="Times New Roman" w:hAnsi="Times New Roman" w:cs="Times New Roman"/>
+                <w:rFonts w:ascii="Times New Roman" w:hAnsi="Times New Roman"/>
                 <w:bCs/>
                 <w:szCs w:val="26"/>
               </w:rPr>
@@ -7446,7 +7426,7 @@
             </w:pPr>
             <w:r>
               <w:rPr>
-                <w:rFonts w:ascii="Times New Roman" w:eastAsia="Times New Roman" w:hAnsi="Times New Roman" w:cs="Times New Roman"/>
+                <w:rFonts w:ascii="Times New Roman" w:hAnsi="Times New Roman"/>
                 <w:bCs/>
                 <w:szCs w:val="26"/>
               </w:rPr>
@@ -7478,7 +7458,7 @@
             </w:pPr>
             <w:r>
               <w:rPr>
-                <w:rFonts w:ascii="Times New Roman" w:eastAsia="Times New Roman" w:hAnsi="Times New Roman" w:cs="Times New Roman"/>
+                <w:rFonts w:ascii="Times New Roman" w:hAnsi="Times New Roman"/>
                 <w:bCs/>
                 <w:szCs w:val="26"/>
               </w:rPr>
@@ -7509,7 +7489,7 @@
             </w:pPr>
             <w:r>
               <w:rPr>
-                <w:rFonts w:ascii="Times New Roman" w:eastAsia="Times New Roman" w:hAnsi="Times New Roman" w:cs="Times New Roman"/>
+                <w:rFonts w:ascii="Times New Roman" w:hAnsi="Times New Roman"/>
                 <w:szCs w:val="26"/>
               </w:rPr>
               <w:t>Ghi chú</w:t>
@@ -7577,7 +7557,7 @@
             </w:pPr>
             <w:r>
               <w:rPr>
-                <w:rFonts w:ascii="Times New Roman" w:eastAsia="Times New Roman" w:hAnsi="Times New Roman" w:cs="Times New Roman"/>
+                <w:rFonts w:ascii="Times New Roman" w:hAnsi="Times New Roman"/>
                 <w:bCs/>
                 <w:szCs w:val="26"/>
               </w:rPr>
@@ -7608,7 +7588,7 @@
             </w:pPr>
             <w:r>
               <w:rPr>
-                <w:rFonts w:ascii="Times New Roman" w:eastAsia="Times New Roman" w:hAnsi="Times New Roman" w:cs="Times New Roman"/>
+                <w:rFonts w:ascii="Times New Roman" w:hAnsi="Times New Roman"/>
                 <w:szCs w:val="26"/>
               </w:rPr>
               <w:t>12 tháng</w:t>
@@ -7639,7 +7619,7 @@
             </w:pPr>
             <w:r>
               <w:rPr>
-                <w:rFonts w:ascii="Times New Roman" w:eastAsia="Times New Roman" w:hAnsi="Times New Roman" w:cs="Times New Roman"/>
+                <w:rFonts w:ascii="Times New Roman" w:hAnsi="Times New Roman"/>
                 <w:szCs w:val="26"/>
               </w:rPr>
               <w:t>Ưu tiên bảo dưỡng trước mùa mưa bão</w:t>
@@ -7707,7 +7687,7 @@
             </w:pPr>
             <w:r>
               <w:rPr>
-                <w:rFonts w:ascii="Times New Roman" w:eastAsia="Times New Roman" w:hAnsi="Times New Roman" w:cs="Times New Roman"/>
+                <w:rFonts w:ascii="Times New Roman" w:hAnsi="Times New Roman"/>
                 <w:szCs w:val="26"/>
               </w:rPr>
               <w:t>Cột anten</w:t>
@@ -7737,7 +7717,7 @@
             </w:pPr>
             <w:r>
               <w:rPr>
-                <w:rFonts w:ascii="Times New Roman" w:eastAsia="Times New Roman" w:hAnsi="Times New Roman" w:cs="Times New Roman"/>
+                <w:rFonts w:ascii="Times New Roman" w:hAnsi="Times New Roman"/>
                 <w:szCs w:val="26"/>
               </w:rPr>
               <w:t>≤ 24 tháng</w:t>
@@ -7794,7 +7774,7 @@
       </w:pPr>
       <w:r>
         <w:rPr>
-          <w:rFonts w:ascii="Times New Roman" w:eastAsia="Times New Roman" w:hAnsi="Times New Roman" w:cs="Times New Roman"/>
+          <w:rFonts w:ascii="Times New Roman" w:hAnsi="Times New Roman"/>
           <w:b/>
           <w:bCs/>
           <w:szCs w:val="26"/>
@@ -7827,7 +7807,7 @@
       </w:pPr>
       <w:r>
         <w:rPr>
-          <w:rFonts w:ascii="Times New Roman" w:eastAsia="Times New Roman" w:hAnsi="Times New Roman" w:cs="Times New Roman"/>
+          <w:rFonts w:ascii="Times New Roman" w:hAnsi="Times New Roman"/>
           <w:sz w:val="26"/>
           <w:szCs w:val="26"/>
           <w:lang w:val="da-DK"/>
@@ -7859,7 +7839,7 @@
       </w:pPr>
       <w:r>
         <w:rPr>
-          <w:rFonts w:ascii="Times New Roman" w:eastAsia="Times New Roman" w:hAnsi="Times New Roman" w:cs="Times New Roman"/>
+          <w:rFonts w:ascii="Times New Roman" w:hAnsi="Times New Roman"/>
           <w:sz w:val="26"/>
           <w:szCs w:val="26"/>
           <w:lang w:val="vi-VN"/>
@@ -7868,7 +7848,7 @@
       </w:r>
       <w:r>
         <w:rPr>
-          <w:rFonts w:ascii="Times New Roman" w:eastAsia="Times New Roman" w:hAnsi="Times New Roman" w:cs="Times New Roman"/>
+          <w:rFonts w:ascii="Times New Roman" w:hAnsi="Times New Roman"/>
           <w:sz w:val="26"/>
           <w:szCs w:val="26"/>
           <w:lang w:val="da-DK"/>
@@ -7877,7 +7857,7 @@
       </w:r>
       <w:r>
         <w:rPr>
-          <w:rFonts w:ascii="Times New Roman" w:eastAsia="Times New Roman" w:hAnsi="Times New Roman" w:cs="Times New Roman"/>
+          <w:rFonts w:ascii="Times New Roman" w:hAnsi="Times New Roman"/>
           <w:sz w:val="26"/>
           <w:szCs w:val="26"/>
           <w:lang w:val="vi-VN"/>
@@ -7886,7 +7866,7 @@
       </w:r>
       <w:r>
         <w:rPr>
-          <w:rFonts w:ascii="Times New Roman" w:eastAsia="Times New Roman" w:hAnsi="Times New Roman" w:cs="Times New Roman"/>
+          <w:rFonts w:ascii="Times New Roman" w:hAnsi="Times New Roman"/>
           <w:sz w:val="26"/>
           <w:szCs w:val="26"/>
           <w:lang w:val="da-DK"/>
@@ -7895,7 +7875,7 @@
       </w:r>
       <w:r>
         <w:rPr>
-          <w:rFonts w:ascii="Times New Roman" w:eastAsia="Times New Roman" w:hAnsi="Times New Roman" w:cs="Times New Roman"/>
+          <w:rFonts w:ascii="Times New Roman" w:hAnsi="Times New Roman"/>
           <w:sz w:val="26"/>
           <w:szCs w:val="26"/>
           <w:lang w:val="vi-VN"/>
@@ -7927,7 +7907,7 @@
       </w:pPr>
       <w:r>
         <w:rPr>
-          <w:rFonts w:ascii="Times New Roman" w:eastAsia="Times New Roman" w:hAnsi="Times New Roman" w:cs="Times New Roman"/>
+          <w:rFonts w:ascii="Times New Roman" w:hAnsi="Times New Roman"/>
           <w:sz w:val="26"/>
           <w:szCs w:val="26"/>
           <w:lang w:val="vi-VN"/>
@@ -7959,7 +7939,7 @@
       </w:pPr>
       <w:r>
         <w:rPr>
-          <w:rFonts w:ascii="Times New Roman" w:eastAsia="Times New Roman" w:hAnsi="Times New Roman" w:cs="Times New Roman"/>
+          <w:rFonts w:ascii="Times New Roman" w:hAnsi="Times New Roman"/>
           <w:sz w:val="26"/>
           <w:szCs w:val="26"/>
           <w:lang w:val="vi-VN"/>
@@ -7991,7 +7971,7 @@
       </w:pPr>
       <w:r>
         <w:rPr>
-          <w:rFonts w:ascii="Times New Roman" w:eastAsia="Times New Roman" w:hAnsi="Times New Roman" w:cs="Times New Roman"/>
+          <w:rFonts w:ascii="Times New Roman" w:hAnsi="Times New Roman"/>
           <w:sz w:val="26"/>
           <w:szCs w:val="26"/>
           <w:lang w:val="vi-VN"/>
@@ -8023,7 +8003,7 @@
       </w:pPr>
       <w:r>
         <w:rPr>
-          <w:rFonts w:ascii="Times New Roman" w:eastAsia="Times New Roman" w:hAnsi="Times New Roman" w:cs="Times New Roman"/>
+          <w:rFonts w:ascii="Times New Roman" w:hAnsi="Times New Roman"/>
           <w:sz w:val="26"/>
           <w:szCs w:val="26"/>
           <w:lang w:val="vi-VN"/>
@@ -8032,7 +8012,7 @@
       </w:r>
       <w:r>
         <w:rPr>
-          <w:rFonts w:ascii="Times New Roman" w:eastAsia="Times New Roman" w:hAnsi="Times New Roman" w:cs="Times New Roman"/>
+          <w:rFonts w:ascii="Times New Roman" w:hAnsi="Times New Roman"/>
           <w:sz w:val="26"/>
           <w:szCs w:val="26"/>
           <w:lang w:val="da-DK"/>
@@ -8064,7 +8044,7 @@
       </w:pPr>
       <w:r>
         <w:rPr>
-          <w:rFonts w:ascii="Times New Roman" w:eastAsia="Times New Roman" w:hAnsi="Times New Roman" w:cs="Times New Roman"/>
+          <w:rFonts w:ascii="Times New Roman" w:hAnsi="Times New Roman"/>
           <w:sz w:val="26"/>
           <w:szCs w:val="26"/>
           <w:lang w:val="vi-VN"/>
@@ -8095,7 +8075,7 @@
       </w:pPr>
       <w:r>
         <w:rPr>
-          <w:rFonts w:ascii="Times New Roman" w:eastAsia="Times New Roman" w:hAnsi="Times New Roman" w:cs="Times New Roman"/>
+          <w:rFonts w:ascii="Times New Roman" w:hAnsi="Times New Roman"/>
           <w:sz w:val="26"/>
           <w:szCs w:val="26"/>
           <w:lang w:val="da-DK"/>
@@ -8127,7 +8107,7 @@
       </w:pPr>
       <w:r>
         <w:rPr>
-          <w:rFonts w:ascii="Times New Roman" w:eastAsia="Times New Roman" w:hAnsi="Times New Roman" w:cs="Times New Roman"/>
+          <w:rFonts w:ascii="Times New Roman" w:hAnsi="Times New Roman"/>
           <w:sz w:val="26"/>
           <w:szCs w:val="26"/>
           <w:lang w:val="vi-VN"/>
@@ -8160,7 +8140,7 @@
       </w:pPr>
       <w:r>
         <w:rPr>
-          <w:rFonts w:ascii="Times New Roman" w:eastAsia="Times New Roman" w:hAnsi="Times New Roman" w:cs="Times New Roman"/>
+          <w:rFonts w:ascii="Times New Roman" w:hAnsi="Times New Roman"/>
           <w:sz w:val="26"/>
           <w:szCs w:val="26"/>
           <w:lang w:val="vi-VN"/>
@@ -8192,7 +8172,7 @@
       </w:pPr>
       <w:r>
         <w:rPr>
-          <w:rFonts w:ascii="Times New Roman" w:eastAsia="Times New Roman" w:hAnsi="Times New Roman" w:cs="Times New Roman"/>
+          <w:rFonts w:ascii="Times New Roman" w:hAnsi="Times New Roman"/>
           <w:sz w:val="26"/>
           <w:szCs w:val="26"/>
           <w:lang w:val="vi-VN"/>
@@ -8201,7 +8181,7 @@
       </w:r>
       <w:r>
         <w:rPr>
-          <w:rFonts w:ascii="Times New Roman" w:eastAsia="Times New Roman" w:hAnsi="Times New Roman" w:cs="Times New Roman"/>
+          <w:rFonts w:ascii="Times New Roman" w:hAnsi="Times New Roman"/>
           <w:sz w:val="26"/>
           <w:szCs w:val="26"/>
           <w:lang w:val="da-DK"/>
@@ -8233,7 +8213,7 @@
       </w:pPr>
       <w:r>
         <w:rPr>
-          <w:rFonts w:ascii="Times New Roman" w:eastAsia="Times New Roman" w:hAnsi="Times New Roman" w:cs="Times New Roman"/>
+          <w:rFonts w:ascii="Times New Roman" w:hAnsi="Times New Roman"/>
           <w:sz w:val="26"/>
           <w:szCs w:val="26"/>
           <w:lang w:val="da-DK"/>
@@ -8265,7 +8245,7 @@
       </w:pPr>
       <w:r>
         <w:rPr>
-          <w:rFonts w:ascii="Times New Roman" w:eastAsia="Times New Roman" w:hAnsi="Times New Roman" w:cs="Times New Roman"/>
+          <w:rFonts w:ascii="Times New Roman" w:hAnsi="Times New Roman"/>
           <w:sz w:val="26"/>
           <w:szCs w:val="26"/>
           <w:lang w:val="da-DK"/>
@@ -8274,7 +8254,7 @@
       </w:r>
       <w:r>
         <w:rPr>
-          <w:rFonts w:ascii="Times New Roman" w:eastAsia="Times New Roman" w:hAnsi="Times New Roman" w:cs="Times New Roman"/>
+          <w:rFonts w:ascii="Times New Roman" w:hAnsi="Times New Roman"/>
           <w:sz w:val="26"/>
           <w:szCs w:val="26"/>
           <w:lang w:val="vi-VN"/>
@@ -8306,7 +8286,7 @@
       </w:pPr>
       <w:r>
         <w:rPr>
-          <w:rFonts w:ascii="Times New Roman" w:eastAsia="Times New Roman" w:hAnsi="Times New Roman" w:cs="Times New Roman"/>
+          <w:rFonts w:ascii="Times New Roman" w:hAnsi="Times New Roman"/>
           <w:sz w:val="26"/>
           <w:szCs w:val="26"/>
           <w:lang w:val="vi-VN"/>
@@ -8334,7 +8314,7 @@
       </w:pPr>
       <w:r>
         <w:rPr>
-          <w:rFonts w:ascii="Times New Roman" w:eastAsia="Times New Roman" w:hAnsi="Times New Roman" w:cs="Times New Roman"/>
+          <w:rFonts w:ascii="Times New Roman" w:hAnsi="Times New Roman"/>
           <w:sz w:val="26"/>
           <w:szCs w:val="26"/>
           <w:lang w:val="da-DK"/>
@@ -8343,7 +8323,7 @@
       </w:r>
       <w:r>
         <w:rPr>
-          <w:rFonts w:ascii="Times New Roman" w:eastAsia="Times New Roman" w:hAnsi="Times New Roman" w:cs="Times New Roman"/>
+          <w:rFonts w:ascii="Times New Roman" w:hAnsi="Times New Roman"/>
           <w:b/>
           <w:bCs/>
           <w:iCs/>
@@ -8355,7 +8335,7 @@
       </w:r>
       <w:r>
         <w:rPr>
-          <w:rFonts w:ascii="Times New Roman" w:eastAsia="Times New Roman" w:hAnsi="Times New Roman" w:cs="Times New Roman"/>
+          <w:rFonts w:ascii="Times New Roman" w:hAnsi="Times New Roman"/>
           <w:b/>
           <w:noProof/>
           <w:sz w:val="26"/>
@@ -8367,7 +8347,7 @@
       <w:bookmarkStart w:name="_Hlk17185995" w:id="4"/>
       <w:r>
         <w:rPr>
-          <w:rFonts w:ascii="Times New Roman" w:eastAsia="Times New Roman" w:hAnsi="Times New Roman" w:cs="Times New Roman"/>
+          <w:rFonts w:ascii="Times New Roman" w:hAnsi="Times New Roman"/>
           <w:b/>
           <w:noProof/>
           <w:sz w:val="26"/>
@@ -8396,7 +8376,7 @@
       </w:pPr>
       <w:r>
         <w:rPr>
-          <w:rFonts w:ascii="Times New Roman" w:eastAsia="Times New Roman" w:hAnsi="Times New Roman" w:cs="Times New Roman"/>
+          <w:rFonts w:ascii="Times New Roman" w:hAnsi="Times New Roman"/>
           <w:b/>
           <w:bCs/>
           <w:szCs w:val="26"/>
@@ -8426,7 +8406,7 @@
       </w:pPr>
       <w:r>
         <w:rPr>
-          <w:rFonts w:ascii="Times New Roman" w:eastAsia="Times New Roman" w:hAnsi="Times New Roman" w:cs="Times New Roman"/>
+          <w:rFonts w:ascii="Times New Roman" w:hAnsi="Times New Roman"/>
           <w:bCs/>
           <w:iCs/>
           <w:szCs w:val="26"/>
@@ -8436,7 +8416,7 @@
       </w:r>
       <w:r>
         <w:rPr>
-          <w:rFonts w:ascii="Times New Roman" w:eastAsia="Times New Roman" w:hAnsi="Times New Roman" w:cs="Times New Roman"/>
+          <w:rFonts w:ascii="Times New Roman" w:hAnsi="Times New Roman"/>
           <w:szCs w:val="26"/>
           <w:lang w:val="da-DK"/>
         </w:rPr>
@@ -8464,7 +8444,7 @@
       </w:pPr>
       <w:r>
         <w:rPr>
-          <w:rFonts w:ascii="Times New Roman" w:eastAsia="Times New Roman" w:hAnsi="Times New Roman" w:cs="Times New Roman"/>
+          <w:rFonts w:ascii="Times New Roman" w:hAnsi="Times New Roman"/>
           <w:bCs/>
           <w:iCs/>
           <w:szCs w:val="26"/>
@@ -8474,7 +8454,7 @@
       </w:r>
       <w:r>
         <w:rPr>
-          <w:rFonts w:ascii="Times New Roman" w:eastAsia="Times New Roman" w:hAnsi="Times New Roman" w:cs="Times New Roman"/>
+          <w:rFonts w:ascii="Times New Roman" w:hAnsi="Times New Roman"/>
           <w:szCs w:val="26"/>
           <w:lang w:val="da-DK"/>
         </w:rPr>
@@ -8502,7 +8482,7 @@
       </w:pPr>
       <w:r>
         <w:rPr>
-          <w:rFonts w:ascii="Times New Roman" w:eastAsia="Times New Roman" w:hAnsi="Times New Roman" w:cs="Times New Roman"/>
+          <w:rFonts w:ascii="Times New Roman" w:hAnsi="Times New Roman"/>
           <w:szCs w:val="26"/>
           <w:lang w:val="da-DK"/>
         </w:rPr>
@@ -8531,7 +8511,7 @@
       </w:pPr>
       <w:r>
         <w:rPr>
-          <w:rFonts w:ascii="Times New Roman" w:eastAsia="Times New Roman" w:hAnsi="Times New Roman" w:cs="Times New Roman"/>
+          <w:rFonts w:ascii="Times New Roman" w:hAnsi="Times New Roman"/>
           <w:b/>
           <w:bCs/>
           <w:szCs w:val="26"/>
@@ -8561,7 +8541,7 @@
       </w:pPr>
       <w:r>
         <w:rPr>
-          <w:rFonts w:ascii="Times New Roman" w:eastAsia="Times New Roman" w:hAnsi="Times New Roman" w:cs="Times New Roman"/>
+          <w:rFonts w:ascii="Times New Roman" w:hAnsi="Times New Roman"/>
           <w:szCs w:val="26"/>
           <w:lang w:val="da-DK"/>
         </w:rPr>
@@ -8589,7 +8569,7 @@
       </w:pPr>
       <w:r>
         <w:rPr>
-          <w:rFonts w:ascii="Times New Roman" w:eastAsia="Times New Roman" w:hAnsi="Times New Roman" w:cs="Times New Roman"/>
+          <w:rFonts w:ascii="Times New Roman" w:hAnsi="Times New Roman"/>
           <w:sz w:val="26"/>
           <w:szCs w:val="26"/>
           <w:lang w:val="da-DK"/>
@@ -8598,7 +8578,7 @@
       </w:r>
       <w:r>
         <w:rPr>
-          <w:rFonts w:ascii="Times New Roman" w:eastAsia="Times New Roman" w:hAnsi="Times New Roman" w:cs="Times New Roman"/>
+          <w:rFonts w:ascii="Times New Roman" w:hAnsi="Times New Roman"/>
           <w:sz w:val="26"/>
           <w:szCs w:val="26"/>
           <w:lang w:val="vi-VN"/>
@@ -8627,7 +8607,7 @@
       </w:pPr>
       <w:r>
         <w:rPr>
-          <w:rFonts w:ascii="Times New Roman" w:eastAsia="Times New Roman" w:hAnsi="Times New Roman" w:cs="Times New Roman"/>
+          <w:rFonts w:ascii="Times New Roman" w:hAnsi="Times New Roman"/>
           <w:sz w:val="26"/>
           <w:szCs w:val="26"/>
           <w:lang w:val="vi-VN"/>
@@ -8656,7 +8636,7 @@
       </w:pPr>
       <w:r>
         <w:rPr>
-          <w:rFonts w:ascii="Times New Roman" w:eastAsia="Times New Roman" w:hAnsi="Times New Roman" w:cs="Times New Roman"/>
+          <w:rFonts w:ascii="Times New Roman" w:hAnsi="Times New Roman"/>
           <w:sz w:val="26"/>
           <w:szCs w:val="26"/>
           <w:lang w:val="vi-VN"/>
@@ -8684,7 +8664,7 @@
       </w:pPr>
       <w:r>
         <w:rPr>
-          <w:rFonts w:ascii="Times New Roman" w:eastAsia="Times New Roman" w:hAnsi="Times New Roman" w:cs="Times New Roman"/>
+          <w:rFonts w:ascii="Times New Roman" w:hAnsi="Times New Roman"/>
           <w:szCs w:val="26"/>
           <w:lang w:val="da-DK"/>
         </w:rPr>
@@ -8713,7 +8693,7 @@
       </w:pPr>
       <w:r>
         <w:rPr>
-          <w:rFonts w:ascii="Times New Roman" w:eastAsia="Times New Roman" w:hAnsi="Times New Roman" w:cs="Times New Roman"/>
+          <w:rFonts w:ascii="Times New Roman" w:hAnsi="Times New Roman"/>
           <w:b/>
           <w:bCs/>
           <w:szCs w:val="26"/>
@@ -8743,7 +8723,7 @@
       </w:pPr>
       <w:r>
         <w:rPr>
-          <w:rFonts w:ascii="Times New Roman" w:eastAsia="Times New Roman" w:hAnsi="Times New Roman" w:cs="Times New Roman"/>
+          <w:rFonts w:ascii="Times New Roman" w:hAnsi="Times New Roman"/>
           <w:szCs w:val="26"/>
           <w:lang w:val="da-DK"/>
         </w:rPr>
@@ -8751,7 +8731,7 @@
       </w:r>
       <w:r>
         <w:rPr>
-          <w:rFonts w:ascii="Times New Roman" w:eastAsia="Times New Roman" w:hAnsi="Times New Roman" w:cs="Times New Roman"/>
+          <w:rFonts w:ascii="Times New Roman" w:hAnsi="Times New Roman"/>
           <w:i/>
           <w:noProof/>
           <w:szCs w:val="26"/>
@@ -8761,7 +8741,7 @@
       </w:r>
       <w:r>
         <w:rPr>
-          <w:rFonts w:ascii="Times New Roman" w:eastAsia="Times New Roman" w:hAnsi="Times New Roman" w:cs="Times New Roman"/>
+          <w:rFonts w:ascii="Times New Roman" w:hAnsi="Times New Roman"/>
           <w:noProof/>
           <w:szCs w:val="26"/>
           <w:lang w:val="da-DK"/>
@@ -8770,7 +8750,7 @@
       </w:r>
       <w:r>
         <w:rPr>
-          <w:rFonts w:ascii="Times New Roman" w:eastAsia="Times New Roman" w:hAnsi="Times New Roman" w:cs="Times New Roman"/>
+          <w:rFonts w:ascii="Times New Roman" w:hAnsi="Times New Roman"/>
           <w:szCs w:val="26"/>
           <w:lang w:val="da-DK"/>
         </w:rPr>
@@ -8778,7 +8758,7 @@
       </w:r>
       <w:r>
         <w:rPr>
-          <w:rFonts w:ascii="Times New Roman" w:eastAsia="Times New Roman" w:hAnsi="Times New Roman" w:cs="Times New Roman"/>
+          <w:rFonts w:ascii="Times New Roman" w:hAnsi="Times New Roman"/>
           <w:noProof/>
           <w:szCs w:val="26"/>
           <w:lang w:val="da-DK"/>
@@ -8787,7 +8767,7 @@
       </w:r>
       <w:r>
         <w:rPr>
-          <w:rFonts w:ascii="Times New Roman" w:eastAsia="Times New Roman" w:hAnsi="Times New Roman" w:cs="Times New Roman"/>
+          <w:rFonts w:ascii="Times New Roman" w:hAnsi="Times New Roman"/>
           <w:i/>
           <w:szCs w:val="26"/>
           <w:lang w:val="da-DK"/>
@@ -8796,7 +8776,7 @@
       </w:r>
       <w:r>
         <w:rPr>
-          <w:rFonts w:ascii="Times New Roman" w:eastAsia="Times New Roman" w:hAnsi="Times New Roman" w:cs="Times New Roman"/>
+          <w:rFonts w:ascii="Times New Roman" w:hAnsi="Times New Roman"/>
           <w:noProof/>
           <w:szCs w:val="26"/>
           <w:lang w:val="da-DK"/>
@@ -8805,7 +8785,7 @@
       </w:r>
       <w:r>
         <w:rPr>
-          <w:rFonts w:ascii="Times New Roman" w:eastAsia="Times New Roman" w:hAnsi="Times New Roman" w:cs="Times New Roman"/>
+          <w:rFonts w:ascii="Times New Roman" w:hAnsi="Times New Roman"/>
           <w:noProof/>
           <w:szCs w:val="26"/>
           <w:lang w:val="da-DK"/>
@@ -8835,7 +8815,7 @@
       </w:pPr>
       <w:r>
         <w:rPr>
-          <w:rFonts w:ascii="Times New Roman" w:eastAsia="Times New Roman" w:hAnsi="Times New Roman" w:cs="Times New Roman"/>
+          <w:rFonts w:ascii="Times New Roman" w:hAnsi="Times New Roman"/>
           <w:szCs w:val="26"/>
           <w:lang w:val="da-DK"/>
         </w:rPr>
@@ -8863,7 +8843,7 @@
       </w:pPr>
       <w:r>
         <w:rPr>
-          <w:rFonts w:ascii="Times New Roman" w:eastAsia="Times New Roman" w:hAnsi="Times New Roman" w:cs="Times New Roman"/>
+          <w:rFonts w:ascii="Times New Roman" w:hAnsi="Times New Roman"/>
           <w:szCs w:val="26"/>
           <w:lang w:val="da-DK"/>
         </w:rPr>
@@ -8891,7 +8871,7 @@
       </w:pPr>
       <w:r>
         <w:rPr>
-          <w:rFonts w:ascii="Times New Roman" w:eastAsia="Times New Roman" w:hAnsi="Times New Roman" w:cs="Times New Roman"/>
+          <w:rFonts w:ascii="Times New Roman" w:hAnsi="Times New Roman"/>
           <w:iCs/>
           <w:szCs w:val="26"/>
           <w:lang w:val="da-DK"/>
@@ -8917,7 +8897,7 @@
       </w:pPr>
       <w:r>
         <w:rPr>
-          <w:rFonts w:ascii="Times New Roman" w:eastAsia="Times New Roman" w:hAnsi="Times New Roman" w:cs="Times New Roman"/>
+          <w:rFonts w:ascii="Times New Roman" w:hAnsi="Times New Roman"/>
           <w:szCs w:val="26"/>
           <w:lang w:val="da-DK"/>
         </w:rPr>
@@ -8925,7 +8905,7 @@
       </w:r>
       <w:r>
         <w:rPr>
-          <w:rFonts w:ascii="Times New Roman" w:eastAsia="Times New Roman" w:hAnsi="Times New Roman" w:cs="Times New Roman"/>
+          <w:rFonts w:ascii="Times New Roman" w:hAnsi="Times New Roman"/>
           <w:szCs w:val="26"/>
         </w:rPr>
         <w:t>{{PHONE}}</w:t>
@@ -8951,7 +8931,7 @@
       </w:pPr>
       <w:r>
         <w:rPr>
-          <w:rFonts w:ascii="Times New Roman" w:eastAsia="Times New Roman" w:hAnsi="Times New Roman" w:cs="Times New Roman"/>
+          <w:rFonts w:ascii="Times New Roman" w:hAnsi="Times New Roman"/>
           <w:szCs w:val="26"/>
           <w:lang w:val="da-DK"/>
         </w:rPr>
@@ -8959,14 +8939,14 @@
       </w:r>
       <w:r>
         <w:rPr>
-          <w:rFonts w:ascii="Times New Roman" w:eastAsia="Times New Roman" w:hAnsi="Times New Roman" w:cs="Times New Roman"/>
+          <w:rFonts w:ascii="Times New Roman" w:hAnsi="Times New Roman"/>
           <w:szCs w:val="26"/>
         </w:rPr>
         <w:t>078 416 6868</w:t>
       </w:r>
       <w:r>
         <w:rPr>
-          <w:rFonts w:ascii="Times New Roman" w:eastAsia="Times New Roman" w:hAnsi="Times New Roman" w:cs="Times New Roman"/>
+          <w:rFonts w:ascii="Times New Roman" w:hAnsi="Times New Roman"/>
           <w:szCs w:val="26"/>
           <w:lang w:val="vi-VN"/>
         </w:rPr>
@@ -8974,7 +8954,7 @@
       </w:r>
       <w:r>
         <w:rPr>
-          <w:rFonts w:ascii="Times New Roman" w:eastAsia="Times New Roman" w:hAnsi="Times New Roman" w:cs="Times New Roman"/>
+          <w:rFonts w:ascii="Times New Roman" w:hAnsi="Times New Roman"/>
           <w:szCs w:val="26"/>
           <w:lang w:val="da-DK"/>
         </w:rPr>
@@ -8994,7 +8974,7 @@
       </w:pPr>
       <w:r>
         <w:rPr>
-          <w:rFonts w:ascii="Times New Roman" w:eastAsia="Times New Roman" w:hAnsi="Times New Roman" w:cs="Times New Roman"/>
+          <w:rFonts w:ascii="Times New Roman" w:hAnsi="Times New Roman"/>
           <w:szCs w:val="26"/>
           <w:lang w:val="da-DK"/>
         </w:rPr>
@@ -9023,7 +9003,7 @@
       </w:pPr>
       <w:r>
         <w:rPr>
-          <w:rFonts w:ascii="Times New Roman" w:eastAsia="Times New Roman" w:hAnsi="Times New Roman" w:cs="Times New Roman"/>
+          <w:rFonts w:ascii="Times New Roman" w:hAnsi="Times New Roman"/>
           <w:b/>
           <w:szCs w:val="26"/>
           <w:lang w:val="da-DK"/>
@@ -9052,7 +9032,7 @@
       </w:pPr>
       <w:r>
         <w:rPr>
-          <w:rFonts w:ascii="Times New Roman" w:eastAsia="Times New Roman" w:hAnsi="Times New Roman" w:cs="Times New Roman"/>
+          <w:rFonts w:ascii="Times New Roman" w:hAnsi="Times New Roman"/>
           <w:szCs w:val="26"/>
           <w:lang w:val="vi-VN"/>
         </w:rPr>
@@ -9080,7 +9060,7 @@
       </w:pPr>
       <w:r>
         <w:rPr>
-          <w:rFonts w:ascii="Times New Roman" w:eastAsia="Times New Roman" w:hAnsi="Times New Roman" w:cs="Times New Roman"/>
+          <w:rFonts w:ascii="Times New Roman" w:hAnsi="Times New Roman"/>
           <w:szCs w:val="26"/>
           <w:lang w:val="vi-VN"/>
         </w:rPr>
@@ -9103,7 +9083,7 @@
       </w:pPr>
       <w:r>
         <w:rPr>
-          <w:rFonts w:ascii="Times New Roman" w:eastAsia="Times New Roman" w:hAnsi="Times New Roman" w:cs="Times New Roman"/>
+          <w:rFonts w:ascii="Times New Roman" w:hAnsi="Times New Roman"/>
           <w:b/>
           <w:bCs/>
           <w:szCs w:val="26"/>
@@ -9113,7 +9093,7 @@
       </w:r>
       <w:r>
         <w:rPr>
-          <w:rFonts w:ascii="Times New Roman" w:eastAsia="Times New Roman" w:hAnsi="Times New Roman" w:cs="Times New Roman"/>
+          <w:rFonts w:ascii="Times New Roman" w:hAnsi="Times New Roman"/>
           <w:b/>
           <w:noProof/>
           <w:szCs w:val="26"/>
@@ -9143,7 +9123,7 @@
       </w:pPr>
       <w:r>
         <w:rPr>
-          <w:rFonts w:ascii="Times New Roman" w:eastAsia="Times New Roman" w:hAnsi="Times New Roman" w:cs="Times New Roman"/>
+          <w:rFonts w:ascii="Times New Roman" w:hAnsi="Times New Roman"/>
           <w:szCs w:val="26"/>
           <w:lang w:val="vi-VN"/>
         </w:rPr>
@@ -9171,7 +9151,7 @@
       </w:pPr>
       <w:r>
         <w:rPr>
-          <w:rFonts w:ascii="Times New Roman" w:eastAsia="Times New Roman" w:hAnsi="Times New Roman" w:cs="Times New Roman"/>
+          <w:rFonts w:ascii="Times New Roman" w:hAnsi="Times New Roman"/>
           <w:szCs w:val="26"/>
           <w:lang w:val="vi-VN"/>
         </w:rPr>
@@ -9199,7 +9179,7 @@
       </w:pPr>
       <w:r>
         <w:rPr>
-          <w:rFonts w:ascii="Times New Roman" w:eastAsia="Times New Roman" w:hAnsi="Times New Roman" w:cs="Times New Roman"/>
+          <w:rFonts w:ascii="Times New Roman" w:hAnsi="Times New Roman"/>
           <w:szCs w:val="26"/>
           <w:lang w:val="vi-VN"/>
         </w:rPr>
@@ -9227,7 +9207,7 @@
       </w:pPr>
       <w:r>
         <w:rPr>
-          <w:rFonts w:ascii="Times New Roman" w:eastAsia="Times New Roman" w:hAnsi="Times New Roman" w:cs="Times New Roman"/>
+          <w:rFonts w:ascii="Times New Roman" w:hAnsi="Times New Roman"/>
           <w:szCs w:val="26"/>
           <w:lang w:val="vi-VN"/>
         </w:rPr>
@@ -9255,7 +9235,7 @@
       </w:pPr>
       <w:r>
         <w:rPr>
-          <w:rFonts w:ascii="Times New Roman" w:eastAsia="Times New Roman" w:hAnsi="Times New Roman" w:cs="Times New Roman"/>
+          <w:rFonts w:ascii="Times New Roman" w:hAnsi="Times New Roman"/>
           <w:szCs w:val="26"/>
           <w:lang w:val="vi-VN"/>
         </w:rPr>
@@ -9283,7 +9263,7 @@
       </w:pPr>
       <w:r>
         <w:rPr>
-          <w:rFonts w:ascii="Times New Roman" w:eastAsia="Times New Roman" w:hAnsi="Times New Roman" w:cs="Times New Roman"/>
+          <w:rFonts w:ascii="Times New Roman" w:hAnsi="Times New Roman"/>
           <w:szCs w:val="26"/>
           <w:lang w:val="vi-VN"/>
         </w:rPr>
@@ -9312,7 +9292,7 @@
       </w:pPr>
       <w:r>
         <w:rPr>
-          <w:rFonts w:ascii="Times New Roman" w:eastAsia="Times New Roman" w:hAnsi="Times New Roman" w:cs="Times New Roman"/>
+          <w:rFonts w:ascii="Times New Roman" w:hAnsi="Times New Roman"/>
           <w:szCs w:val="26"/>
           <w:lang w:val="vi-VN"/>
         </w:rPr>
@@ -9340,7 +9320,7 @@
       </w:pPr>
       <w:r>
         <w:rPr>
-          <w:rFonts w:ascii="Times New Roman" w:eastAsia="Times New Roman" w:hAnsi="Times New Roman" w:cs="Times New Roman"/>
+          <w:rFonts w:ascii="Times New Roman" w:hAnsi="Times New Roman"/>
           <w:szCs w:val="26"/>
           <w:lang w:val="vi-VN"/>
         </w:rPr>
@@ -9366,7 +9346,7 @@
       </w:pPr>
       <w:r>
         <w:rPr>
-          <w:rFonts w:ascii="Times New Roman" w:eastAsia="Times New Roman" w:hAnsi="Times New Roman" w:cs="Times New Roman"/>
+          <w:rFonts w:ascii="Times New Roman" w:hAnsi="Times New Roman"/>
           <w:b/>
           <w:bCs/>
           <w:szCs w:val="26"/>
@@ -9376,7 +9356,7 @@
       </w:r>
       <w:r>
         <w:rPr>
-          <w:rFonts w:ascii="Times New Roman" w:eastAsia="Times New Roman" w:hAnsi="Times New Roman" w:cs="Times New Roman"/>
+          <w:rFonts w:ascii="Times New Roman" w:hAnsi="Times New Roman"/>
           <w:b/>
           <w:bCs/>
           <w:szCs w:val="26"/>
@@ -9385,7 +9365,7 @@
       </w:r>
       <w:r>
         <w:rPr>
-          <w:rFonts w:ascii="Times New Roman" w:eastAsia="Times New Roman" w:hAnsi="Times New Roman" w:cs="Times New Roman"/>
+          <w:rFonts w:ascii="Times New Roman" w:hAnsi="Times New Roman"/>
           <w:b/>
           <w:bCs/>
           <w:szCs w:val="26"/>
@@ -9419,7 +9399,7 @@
       </w:pPr>
       <w:r>
         <w:rPr>
-          <w:rFonts w:ascii="Times New Roman" w:eastAsia="Times New Roman" w:hAnsi="Times New Roman" w:cs="Times New Roman"/>
+          <w:rFonts w:ascii="Times New Roman" w:hAnsi="Times New Roman"/>
           <w:sz w:val="26"/>
           <w:szCs w:val="26"/>
           <w:lang w:val="vi-VN"/>
@@ -9452,7 +9432,7 @@
       </w:pPr>
       <w:r>
         <w:rPr>
-          <w:rFonts w:ascii="Times New Roman" w:eastAsia="Times New Roman" w:hAnsi="Times New Roman" w:cs="Times New Roman"/>
+          <w:rFonts w:ascii="Times New Roman" w:hAnsi="Times New Roman"/>
           <w:sz w:val="26"/>
           <w:szCs w:val="26"/>
           <w:lang w:val="vi-VN"/>
@@ -9485,7 +9465,7 @@
       </w:pPr>
       <w:r>
         <w:rPr>
-          <w:rFonts w:ascii="Times New Roman" w:eastAsia="Times New Roman" w:hAnsi="Times New Roman" w:cs="Times New Roman"/>
+          <w:rFonts w:ascii="Times New Roman" w:hAnsi="Times New Roman"/>
           <w:sz w:val="26"/>
           <w:szCs w:val="26"/>
           <w:lang w:val="vi-VN"/>
@@ -9518,7 +9498,7 @@
       </w:pPr>
       <w:r>
         <w:rPr>
-          <w:rFonts w:ascii="Times New Roman" w:eastAsia="Times New Roman" w:hAnsi="Times New Roman" w:cs="Times New Roman"/>
+          <w:rFonts w:ascii="Times New Roman" w:hAnsi="Times New Roman"/>
           <w:sz w:val="26"/>
           <w:szCs w:val="26"/>
           <w:lang w:val="da-DK"/>
@@ -9551,7 +9531,7 @@
       </w:pPr>
       <w:r>
         <w:rPr>
-          <w:rFonts w:ascii="Times New Roman" w:eastAsia="Times New Roman" w:hAnsi="Times New Roman" w:cs="Times New Roman"/>
+          <w:rFonts w:ascii="Times New Roman" w:hAnsi="Times New Roman"/>
           <w:sz w:val="26"/>
           <w:szCs w:val="26"/>
           <w:lang w:val="vi-VN"/>
@@ -9580,7 +9560,7 @@
       </w:pPr>
       <w:r>
         <w:rPr>
-          <w:rFonts w:ascii="Times New Roman" w:eastAsia="Times New Roman" w:hAnsi="Times New Roman" w:cs="Times New Roman"/>
+          <w:rFonts w:ascii="Times New Roman" w:hAnsi="Times New Roman"/>
           <w:szCs w:val="26"/>
           <w:lang w:val="vi-VN"/>
         </w:rPr>
@@ -9608,7 +9588,7 @@
       </w:pPr>
       <w:r>
         <w:rPr>
-          <w:rFonts w:ascii="Times New Roman" w:eastAsia="Times New Roman" w:hAnsi="Times New Roman" w:cs="Times New Roman"/>
+          <w:rFonts w:ascii="Times New Roman" w:hAnsi="Times New Roman"/>
           <w:szCs w:val="26"/>
           <w:lang w:val="vi-VN"/>
         </w:rPr>
@@ -9640,7 +9620,7 @@
       </w:pPr>
       <w:r>
         <w:rPr>
-          <w:rFonts w:ascii="Times New Roman" w:eastAsia="Times New Roman" w:hAnsi="Times New Roman" w:cs="Times New Roman"/>
+          <w:rFonts w:ascii="Times New Roman" w:hAnsi="Times New Roman"/>
           <w:sz w:val="26"/>
           <w:szCs w:val="26"/>
           <w:lang w:val="vi-VN"/>
@@ -9673,7 +9653,7 @@
       </w:pPr>
       <w:r>
         <w:rPr>
-          <w:rFonts w:ascii="Times New Roman" w:eastAsia="Times New Roman" w:hAnsi="Times New Roman" w:cs="Times New Roman"/>
+          <w:rFonts w:ascii="Times New Roman" w:hAnsi="Times New Roman"/>
           <w:sz w:val="26"/>
           <w:szCs w:val="26"/>
           <w:lang w:val="vi-VN"/>
@@ -9682,7 +9662,7 @@
       </w:r>
       <w:r>
         <w:rPr>
-          <w:rFonts w:ascii="Times New Roman" w:eastAsia="Times New Roman" w:hAnsi="Times New Roman" w:cs="Times New Roman"/>
+          <w:rFonts w:ascii="Times New Roman" w:hAnsi="Times New Roman"/>
           <w:sz w:val="26"/>
           <w:szCs w:val="26"/>
           <w:lang w:val="da-DK"/>
@@ -9734,7 +9714,6 @@
             </w:pPr>
             <w:r>
               <w:rPr>
-                <w:rFonts w:ascii="Times New Roman" w:eastAsia="Times New Roman" w:hAnsi="Times New Roman" w:cs="Times New Roman"/>
                 <w:rStyle w:val="Strong"/>
                 <w:sz w:val="26"/>
                 <w:szCs w:val="26"/>
@@ -9767,7 +9746,6 @@
             </w:pPr>
             <w:r>
               <w:rPr>
-                <w:rFonts w:ascii="Times New Roman" w:eastAsia="Times New Roman" w:hAnsi="Times New Roman" w:cs="Times New Roman"/>
                 <w:rStyle w:val="Strong"/>
                 <w:sz w:val="26"/>
                 <w:szCs w:val="26"/>
@@ -9828,7 +9806,6 @@
             </w:pPr>
             <w:r>
               <w:rPr>
-                <w:rFonts w:ascii="Times New Roman" w:eastAsia="Times New Roman" w:hAnsi="Times New Roman" w:cs="Times New Roman"/>
                 <w:rStyle w:val="Strong"/>
                 <w:sz w:val="26"/>
                 <w:szCs w:val="26"/>
@@ -9962,7 +9939,6 @@
             </w:pPr>
             <w:r>
               <w:rPr>
-                <w:rFonts w:ascii="Times New Roman" w:eastAsia="Times New Roman" w:hAnsi="Times New Roman" w:cs="Times New Roman"/>
                 <w:b/>
                 <w:sz w:val="26"/>
                 <w:szCs w:val="26"/>
@@ -10042,7 +10018,6 @@
             </w:pPr>
             <w:r>
               <w:rPr>
-                <w:rFonts w:ascii="Times New Roman" w:eastAsia="Times New Roman" w:hAnsi="Times New Roman" w:cs="Times New Roman"/>
                 <w:rStyle w:val="Strong"/>
                 <w:sz w:val="26"/>
                 <w:szCs w:val="26"/>
@@ -10064,7 +10039,6 @@
             </w:pPr>
             <w:r>
               <w:rPr>
-                <w:rFonts w:ascii="Times New Roman" w:eastAsia="Times New Roman" w:hAnsi="Times New Roman" w:cs="Times New Roman"/>
                 <w:sz w:val="26"/>
                 <w:szCs w:val="26"/>
               </w:rPr>
@@ -10078,7 +10052,7 @@
               <w:spacing w:before="0" w:beforeAutospacing="0" w:after="0" w:afterAutospacing="0"/>
               <w:jc w:val="center"/>
               <w:rPr>
-                <w:rFonts w:eastAsiaTheme="Times New Roman"/>
+                <w:rFonts w:eastAsiaTheme="majorEastAsia"/>
                 <w:b/>
                 <w:bCs/>
                 <w:iCs/>
@@ -10089,7 +10063,6 @@
             </w:pPr>
             <w:r>
               <w:rPr>
-                <w:rFonts w:ascii="Times New Roman" w:eastAsia="Times New Roman" w:hAnsi="Times New Roman" w:cs="Times New Roman"/>
                 <w:sz w:val="26"/>
                 <w:szCs w:val="26"/>
               </w:rPr>
@@ -10098,7 +10071,7 @@
             <w:r>
               <w:rPr>
                 <w:rStyle w:val="Emphasis"/>
-                <w:rFonts w:ascii="Times New Roman" w:eastAsia="Times New Roman" w:hAnsi="Times New Roman" w:cs="Times New Roman"/>
+                <w:rFonts w:eastAsiaTheme="majorEastAsia"/>
                 <w:b/>
                 <w:bCs/>
                 <w:i w:val="0"/>
@@ -13729,11 +13702,12 @@
   <w:docDefaults>
     <w:rPrDefault>
       <w:rPr>
-        <w:rFonts w:ascii="Times New Roman" w:eastAsia="Times New Roman" w:hAnsi="Times New Roman" w:cs="Times New Roman"/>
+        <w:rFonts w:asciiTheme="minorHAnsi" w:hAnsiTheme="minorHAnsi" w:eastAsiaTheme="minorHAnsi" w:cstheme="minorBidi"/>
         <w:kern w:val="2"/>
-        <w:sz w:val="26"/>
-        <w:szCs w:val="26"/>
-        <w:lang w:val="vi-VN" w:eastAsia="vi-VN" w:bidi="ar-SA"/>
+        <w:sz w:val="22"/>
+        <w:szCs w:val="22"/>
+        <w:lang w:val="en-SG" w:eastAsia="en-US" w:bidi="ar-SA"/>
+        <w14:ligatures w14:val="standardContextual"/>
       </w:rPr>
     </w:rPrDefault>
     <w:pPrDefault>
@@ -14128,7 +14102,7 @@
       <w:spacing w:after="0" w:line="240" w:lineRule="auto"/>
     </w:pPr>
     <w:rPr>
-      <w:rFonts w:ascii="Times New Roman" w:eastAsia="Times New Roman" w:hAnsi="Times New Roman" w:cs="Times New Roman"/>
+      <w:rFonts w:ascii="VNI-Times" w:hAnsi="VNI-Times" w:eastAsia="Times New Roman" w:cs="Times New Roman"/>
       <w:kern w:val="0"/>
       <w:sz w:val="26"/>
       <w:szCs w:val="20"/>
@@ -14151,7 +14125,7 @@
       <w:outlineLvl w:val="0"/>
     </w:pPr>
     <w:rPr>
-      <w:rFonts w:ascii="Times New Roman" w:eastAsia="Times New Roman" w:hAnsi="Times New Roman" w:cs="Times New Roman"/>
+      <w:rFonts w:asciiTheme="majorHAnsi" w:hAnsiTheme="majorHAnsi" w:eastAsiaTheme="majorEastAsia" w:cstheme="majorBidi"/>
       <w:color w:val="0F4761" w:themeColor="accent1" w:themeShade="BF"/>
       <w:sz w:val="40"/>
       <w:szCs w:val="40"/>
@@ -14174,7 +14148,7 @@
       <w:outlineLvl w:val="1"/>
     </w:pPr>
     <w:rPr>
-      <w:rFonts w:ascii="Times New Roman" w:eastAsia="Times New Roman" w:hAnsi="Times New Roman" w:cs="Times New Roman"/>
+      <w:rFonts w:asciiTheme="majorHAnsi" w:hAnsiTheme="majorHAnsi" w:eastAsiaTheme="majorEastAsia" w:cstheme="majorBidi"/>
       <w:color w:val="0F4761" w:themeColor="accent1" w:themeShade="BF"/>
       <w:sz w:val="32"/>
       <w:szCs w:val="32"/>
@@ -14197,7 +14171,7 @@
       <w:outlineLvl w:val="2"/>
     </w:pPr>
     <w:rPr>
-      <w:rFonts w:ascii="Times New Roman" w:eastAsia="Times New Roman" w:hAnsi="Times New Roman" w:cs="Times New Roman"/>
+      <w:rFonts w:eastAsiaTheme="majorEastAsia" w:cstheme="majorBidi"/>
       <w:color w:val="0F4761" w:themeColor="accent1" w:themeShade="BF"/>
       <w:sz w:val="28"/>
       <w:szCs w:val="28"/>
@@ -14220,7 +14194,7 @@
       <w:outlineLvl w:val="3"/>
     </w:pPr>
     <w:rPr>
-      <w:rFonts w:ascii="Times New Roman" w:eastAsia="Times New Roman" w:hAnsi="Times New Roman" w:cs="Times New Roman"/>
+      <w:rFonts w:eastAsiaTheme="majorEastAsia" w:cstheme="majorBidi"/>
       <w:i/>
       <w:iCs/>
       <w:color w:val="0F4761" w:themeColor="accent1" w:themeShade="BF"/>
@@ -14243,7 +14217,7 @@
       <w:outlineLvl w:val="4"/>
     </w:pPr>
     <w:rPr>
-      <w:rFonts w:ascii="Times New Roman" w:eastAsia="Times New Roman" w:hAnsi="Times New Roman" w:cs="Times New Roman"/>
+      <w:rFonts w:eastAsiaTheme="majorEastAsia" w:cstheme="majorBidi"/>
       <w:color w:val="0F4761" w:themeColor="accent1" w:themeShade="BF"/>
     </w:rPr>
   </w:style>
@@ -14264,7 +14238,7 @@
       <w:outlineLvl w:val="5"/>
     </w:pPr>
     <w:rPr>
-      <w:rFonts w:ascii="Times New Roman" w:eastAsia="Times New Roman" w:hAnsi="Times New Roman" w:cs="Times New Roman"/>
+      <w:rFonts w:eastAsiaTheme="majorEastAsia" w:cstheme="majorBidi"/>
       <w:i/>
       <w:iCs/>
       <w:color w:val="595959" w:themeColor="text1" w:themeTint="A6"/>
@@ -14287,7 +14261,7 @@
       <w:outlineLvl w:val="6"/>
     </w:pPr>
     <w:rPr>
-      <w:rFonts w:ascii="Times New Roman" w:eastAsia="Times New Roman" w:hAnsi="Times New Roman" w:cs="Times New Roman"/>
+      <w:rFonts w:eastAsiaTheme="majorEastAsia" w:cstheme="majorBidi"/>
       <w:color w:val="595959" w:themeColor="text1" w:themeTint="A6"/>
     </w:rPr>
   </w:style>
@@ -14307,7 +14281,7 @@
       <w:outlineLvl w:val="7"/>
     </w:pPr>
     <w:rPr>
-      <w:rFonts w:ascii="Times New Roman" w:eastAsia="Times New Roman" w:hAnsi="Times New Roman" w:cs="Times New Roman"/>
+      <w:rFonts w:eastAsiaTheme="majorEastAsia" w:cstheme="majorBidi"/>
       <w:i/>
       <w:iCs/>
       <w:color w:val="272727" w:themeColor="text1" w:themeTint="D8"/>
@@ -14329,7 +14303,7 @@
       <w:outlineLvl w:val="8"/>
     </w:pPr>
     <w:rPr>
-      <w:rFonts w:ascii="Times New Roman" w:eastAsia="Times New Roman" w:hAnsi="Times New Roman" w:cs="Times New Roman"/>
+      <w:rFonts w:eastAsiaTheme="majorEastAsia" w:cstheme="majorBidi"/>
       <w:color w:val="272727" w:themeColor="text1" w:themeTint="D8"/>
     </w:rPr>
   </w:style>
@@ -14367,7 +14341,7 @@
     <w:uiPriority w:val="9"/>
     <w:rsid w:val="000C456D"/>
     <w:rPr>
-      <w:rFonts w:ascii="Times New Roman" w:eastAsia="Times New Roman" w:hAnsi="Times New Roman" w:cs="Times New Roman"/>
+      <w:rFonts w:asciiTheme="majorHAnsi" w:hAnsiTheme="majorHAnsi" w:eastAsiaTheme="majorEastAsia" w:cstheme="majorBidi"/>
       <w:color w:val="0F4761" w:themeColor="accent1" w:themeShade="BF"/>
       <w:sz w:val="40"/>
       <w:szCs w:val="40"/>
@@ -14381,7 +14355,7 @@
     <w:semiHidden/>
     <w:rsid w:val="000C456D"/>
     <w:rPr>
-      <w:rFonts w:ascii="Times New Roman" w:eastAsia="Times New Roman" w:hAnsi="Times New Roman" w:cs="Times New Roman"/>
+      <w:rFonts w:asciiTheme="majorHAnsi" w:hAnsiTheme="majorHAnsi" w:eastAsiaTheme="majorEastAsia" w:cstheme="majorBidi"/>
       <w:color w:val="0F4761" w:themeColor="accent1" w:themeShade="BF"/>
       <w:sz w:val="32"/>
       <w:szCs w:val="32"/>
@@ -14395,7 +14369,7 @@
     <w:semiHidden/>
     <w:rsid w:val="000C456D"/>
     <w:rPr>
-      <w:rFonts w:ascii="Times New Roman" w:eastAsia="Times New Roman" w:hAnsi="Times New Roman" w:cs="Times New Roman"/>
+      <w:rFonts w:eastAsiaTheme="majorEastAsia" w:cstheme="majorBidi"/>
       <w:color w:val="0F4761" w:themeColor="accent1" w:themeShade="BF"/>
       <w:sz w:val="28"/>
       <w:szCs w:val="28"/>
@@ -14409,7 +14383,7 @@
     <w:semiHidden/>
     <w:rsid w:val="000C456D"/>
     <w:rPr>
-      <w:rFonts w:ascii="Times New Roman" w:eastAsia="Times New Roman" w:hAnsi="Times New Roman" w:cs="Times New Roman"/>
+      <w:rFonts w:eastAsiaTheme="majorEastAsia" w:cstheme="majorBidi"/>
       <w:i/>
       <w:iCs/>
       <w:color w:val="0F4761" w:themeColor="accent1" w:themeShade="BF"/>
@@ -14423,7 +14397,7 @@
     <w:semiHidden/>
     <w:rsid w:val="000C456D"/>
     <w:rPr>
-      <w:rFonts w:ascii="Times New Roman" w:eastAsia="Times New Roman" w:hAnsi="Times New Roman" w:cs="Times New Roman"/>
+      <w:rFonts w:eastAsiaTheme="majorEastAsia" w:cstheme="majorBidi"/>
       <w:color w:val="0F4761" w:themeColor="accent1" w:themeShade="BF"/>
     </w:rPr>
   </w:style>
@@ -14435,7 +14409,7 @@
     <w:semiHidden/>
     <w:rsid w:val="000C456D"/>
     <w:rPr>
-      <w:rFonts w:ascii="Times New Roman" w:eastAsia="Times New Roman" w:hAnsi="Times New Roman" w:cs="Times New Roman"/>
+      <w:rFonts w:eastAsiaTheme="majorEastAsia" w:cstheme="majorBidi"/>
       <w:i/>
       <w:iCs/>
       <w:color w:val="595959" w:themeColor="text1" w:themeTint="A6"/>
@@ -14449,7 +14423,7 @@
     <w:semiHidden/>
     <w:rsid w:val="000C456D"/>
     <w:rPr>
-      <w:rFonts w:ascii="Times New Roman" w:eastAsia="Times New Roman" w:hAnsi="Times New Roman" w:cs="Times New Roman"/>
+      <w:rFonts w:eastAsiaTheme="majorEastAsia" w:cstheme="majorBidi"/>
       <w:color w:val="595959" w:themeColor="text1" w:themeTint="A6"/>
     </w:rPr>
   </w:style>
@@ -14461,7 +14435,7 @@
     <w:semiHidden/>
     <w:rsid w:val="000C456D"/>
     <w:rPr>
-      <w:rFonts w:ascii="Times New Roman" w:eastAsia="Times New Roman" w:hAnsi="Times New Roman" w:cs="Times New Roman"/>
+      <w:rFonts w:eastAsiaTheme="majorEastAsia" w:cstheme="majorBidi"/>
       <w:i/>
       <w:iCs/>
       <w:color w:val="272727" w:themeColor="text1" w:themeTint="D8"/>
@@ -14475,7 +14449,7 @@
     <w:semiHidden/>
     <w:rsid w:val="000C456D"/>
     <w:rPr>
-      <w:rFonts w:ascii="Times New Roman" w:eastAsia="Times New Roman" w:hAnsi="Times New Roman" w:cs="Times New Roman"/>
+      <w:rFonts w:eastAsiaTheme="majorEastAsia" w:cstheme="majorBidi"/>
       <w:color w:val="272727" w:themeColor="text1" w:themeTint="D8"/>
     </w:rPr>
   </w:style>
@@ -14492,7 +14466,7 @@
       <w:contextualSpacing/>
     </w:pPr>
     <w:rPr>
-      <w:rFonts w:ascii="Times New Roman" w:eastAsia="Times New Roman" w:hAnsi="Times New Roman" w:cs="Times New Roman"/>
+      <w:rFonts w:asciiTheme="majorHAnsi" w:hAnsiTheme="majorHAnsi" w:eastAsiaTheme="majorEastAsia" w:cstheme="majorBidi"/>
       <w:spacing w:val="-10"/>
       <w:kern w:val="28"/>
       <w:sz w:val="56"/>
@@ -14506,7 +14480,7 @@
     <w:uiPriority w:val="10"/>
     <w:rsid w:val="000C456D"/>
     <w:rPr>
-      <w:rFonts w:ascii="Times New Roman" w:eastAsia="Times New Roman" w:hAnsi="Times New Roman" w:cs="Times New Roman"/>
+      <w:rFonts w:asciiTheme="majorHAnsi" w:hAnsiTheme="majorHAnsi" w:eastAsiaTheme="majorEastAsia" w:cstheme="majorBidi"/>
       <w:spacing w:val="-10"/>
       <w:kern w:val="28"/>
       <w:sz w:val="56"/>
@@ -14527,7 +14501,7 @@
       </w:numPr>
     </w:pPr>
     <w:rPr>
-      <w:rFonts w:ascii="Times New Roman" w:eastAsia="Times New Roman" w:hAnsi="Times New Roman" w:cs="Times New Roman"/>
+      <w:rFonts w:eastAsiaTheme="majorEastAsia" w:cstheme="majorBidi"/>
       <w:color w:val="595959" w:themeColor="text1" w:themeTint="A6"/>
       <w:spacing w:val="15"/>
       <w:sz w:val="28"/>
@@ -14541,7 +14515,7 @@
     <w:uiPriority w:val="11"/>
     <w:rsid w:val="000C456D"/>
     <w:rPr>
-      <w:rFonts w:ascii="Times New Roman" w:eastAsia="Times New Roman" w:hAnsi="Times New Roman" w:cs="Times New Roman"/>
+      <w:rFonts w:eastAsiaTheme="majorEastAsia" w:cstheme="majorBidi"/>
       <w:color w:val="595959" w:themeColor="text1" w:themeTint="A6"/>
       <w:spacing w:val="15"/>
       <w:sz w:val="28"/>
@@ -14674,7 +14648,7 @@
       <w:spacing w:line="256" w:lineRule="exact"/>
     </w:pPr>
     <w:rPr>
-      <w:rFonts w:ascii="Times New Roman" w:eastAsia="Times New Roman" w:hAnsi="Times New Roman" w:cs="Times New Roman"/>
+      <w:rFonts w:ascii="Times New Roman" w:hAnsi="Times New Roman"/>
       <w:sz w:val="22"/>
       <w:szCs w:val="22"/>
       <w:lang w:val="vi"/>
@@ -14690,7 +14664,7 @@
       <w:spacing w:before="100" w:beforeAutospacing="1" w:after="100" w:afterAutospacing="1"/>
     </w:pPr>
     <w:rPr>
-      <w:rFonts w:ascii="Times New Roman" w:eastAsia="Times New Roman" w:hAnsi="Times New Roman" w:cs="Times New Roman"/>
+      <w:rFonts w:ascii="Times New Roman" w:hAnsi="Times New Roman" w:eastAsiaTheme="minorEastAsia"/>
       <w:sz w:val="24"/>
       <w:szCs w:val="24"/>
       <w:lang w:val="vi-VN" w:eastAsia="vi-VN"/>
@@ -14705,7 +14679,7 @@
       <w:spacing w:after="0" w:line="240" w:lineRule="auto"/>
     </w:pPr>
     <w:rPr>
-      <w:rFonts w:ascii="Times New Roman" w:eastAsia="Times New Roman" w:hAnsi="Times New Roman" w:cs="Times New Roman"/>
+      <w:rFonts w:ascii="Times New Roman" w:hAnsi="Times New Roman" w:eastAsia="Times New Roman" w:cs="Times New Roman"/>
       <w:kern w:val="0"/>
       <w:sz w:val="20"/>
       <w:szCs w:val="20"/>
@@ -14752,7 +14726,7 @@
     <w:semiHidden/>
     <w:rsid w:val="00B275DE"/>
     <w:rPr>
-      <w:rFonts w:ascii="Times New Roman" w:eastAsia="Times New Roman" w:hAnsi="Times New Roman" w:cs="Times New Roman"/>
+      <w:rFonts w:ascii="VNI-Times" w:hAnsi="VNI-Times" w:eastAsia="Times New Roman" w:cs="Times New Roman"/>
       <w:kern w:val="0"/>
       <w:sz w:val="26"/>
       <w:szCs w:val="20"/>
@@ -14785,7 +14759,7 @@
     <w:semiHidden/>
     <w:rsid w:val="00B275DE"/>
     <w:rPr>
-      <w:rFonts w:ascii="Times New Roman" w:eastAsia="Times New Roman" w:hAnsi="Times New Roman" w:cs="Times New Roman"/>
+      <w:rFonts w:ascii="VNI-Times" w:hAnsi="VNI-Times" w:eastAsia="Times New Roman" w:cs="Times New Roman"/>
       <w:kern w:val="0"/>
       <w:sz w:val="16"/>
       <w:szCs w:val="16"/>

</xml_diff>